<commit_message>
feat: add local Ollama RAG and persistent knowledge management
</commit_message>
<xml_diff>
--- a/docs/report/BaoCao.docx
+++ b/docs/report/BaoCao.docx
@@ -7,29 +7,17 @@
         <w:pStyle w:val="Title"/>
       </w:pPr>
       <w:r>
-        <w:rPr>
-          <w:rFonts w:ascii="Times New Roman" w:hAnsi="Times New Roman" w:eastAsia="Times New Roman" w:cs="Times New Roman"/>
-          <w:color w:val="000000"/>
-        </w:rPr>
         <w:t>Nền tảng trợ lý AI hỗ trợ khách hàng đa kênh dựa trên kiến trúc RAG</w:t>
       </w:r>
     </w:p>
     <w:p>
       <w:r>
-        <w:rPr>
-          <w:rFonts w:ascii="Times New Roman" w:hAnsi="Times New Roman" w:eastAsia="Times New Roman" w:cs="Times New Roman"/>
-          <w:color w:val="000000"/>
-        </w:rPr>
         <w:t>Báo cáo tiến độ ngày 13 tháng 9 năm 2026</w:t>
       </w:r>
     </w:p>
     <w:p>
       <w:r>
-        <w:rPr>
-          <w:rFonts w:ascii="Times New Roman" w:hAnsi="Times New Roman" w:eastAsia="Times New Roman" w:cs="Times New Roman"/>
-          <w:color w:val="000000"/>
-        </w:rPr>
-        <w:t>Nhóm 5B phát triển hệ thống CSKH cho cửa hàng bán lẻ trực tuyến giả lập, dưới sự hướng dẫn của giảng viên Trần Đình Nghĩa. Phần xác thực nhân viên, tiếp nhận và trả lời trong Unified Inbox đã được kiểm chứng trên Windows với SQLite. Hệ thống chưa hoàn thành MVP đa kênh; RAG hiện vẫn dùng hash embedding và trả lời bằng trích đoạn.</w:t>
+        <w:t>Nhóm 5B phát triển hệ thống CSKH cho cửa hàng bán lẻ trực tuyến giả lập, dưới sự hướng dẫn của giảng viên Trần Đình Nghĩa. Phần xác thực nhân viên, tiếp nhận và trả lời trong Unified Inbox đã được kiểm chứng trên Windows với SQLite. RAG đã chạy mô hình Ollama local và Qdrant lưu bền, có giao diện quản lý tài liệu và câu trả lời kèm nguồn. Hệ thống chưa hoàn thành MVP đa kênh hoặc đánh giá chất lượng RAG toàn diện.</w:t>
       </w:r>
     </w:p>
     <w:p>
@@ -37,28 +25,16 @@
         <w:pStyle w:val="Heading1"/>
       </w:pPr>
       <w:r>
-        <w:rPr>
-          <w:rFonts w:ascii="Times New Roman" w:hAnsi="Times New Roman" w:eastAsia="Times New Roman" w:cs="Times New Roman"/>
-          <w:color w:val="000000"/>
-        </w:rPr>
         <w:t>Chương 1 Mở đầu</w:t>
       </w:r>
     </w:p>
     <w:p>
       <w:r>
-        <w:rPr>
-          <w:rFonts w:ascii="Times New Roman" w:hAnsi="Times New Roman" w:eastAsia="Times New Roman" w:cs="Times New Roman"/>
-          <w:color w:val="000000"/>
-        </w:rPr>
         <w:t>Khách hàng cần được hỗ trợ về chính sách và trạng thái đơn hàng, trong khi nhân viên phải xử lý nhiều câu hỏi lặp lại. Hệ thống dự kiến dùng RAG để truy xuất tài liệu nội bộ, công cụ nghiệp vụ để tra cứu đơn và chuyển người thật khi phát hiện yêu cầu hỗ trợ trực tiếp.</w:t>
       </w:r>
     </w:p>
     <w:p>
       <w:r>
-        <w:rPr>
-          <w:rFonts w:ascii="Times New Roman" w:hAnsi="Times New Roman" w:eastAsia="Times New Roman" w:cs="Times New Roman"/>
-          <w:color w:val="000000"/>
-        </w:rPr>
         <w:t>Phạm vi gồm Website Chat Widget và một kênh xã hội thật, Knowledge Base PDF/DOCX, hội thoại và ticket/SLA, trả lời có nguồn, tra cứu đơn hàng giả lập và handoff. Telegram là kênh thứ hai được đề xuất, chưa tích hợp. Mục tiêu chất lượng là giảm trả lời thiếu căn cứ và từ chối khi thiếu bằng chứng; chưa khẳng định không có hallucination.</w:t>
       </w:r>
     </w:p>
@@ -67,28 +43,16 @@
         <w:pStyle w:val="Heading1"/>
       </w:pPr>
       <w:r>
-        <w:rPr>
-          <w:rFonts w:ascii="Times New Roman" w:hAnsi="Times New Roman" w:eastAsia="Times New Roman" w:cs="Times New Roman"/>
-          <w:color w:val="000000"/>
-        </w:rPr>
         <w:t>Chương 2 Cơ sở lý thuyết và tổng quan</w:t>
       </w:r>
     </w:p>
     <w:p>
       <w:r>
-        <w:rPr>
-          <w:rFonts w:ascii="Times New Roman" w:hAnsi="Times New Roman" w:eastAsia="Times New Roman" w:cs="Times New Roman"/>
-          <w:color w:val="000000"/>
-        </w:rPr>
         <w:t>RAG kết hợp truy hồi thông tin với quá trình tạo câu trả lời. Embedding ngữ nghĩa và cơ sở dữ liệu vector cần được đánh giá bằng tập câu hỏi có nguồn. Agentic RAG bổ sung quyết định dùng công cụ hoặc chuyển nhân viên dựa trên trạng thái và yêu cầu nghiệp vụ.</w:t>
       </w:r>
     </w:p>
     <w:p>
       <w:r>
-        <w:rPr>
-          <w:rFonts w:ascii="Times New Roman" w:hAnsi="Times New Roman" w:eastAsia="Times New Roman" w:cs="Times New Roman"/>
-          <w:color w:val="000000"/>
-        </w:rPr>
         <w:t>Human-in-the-loop trong hệ thống này yêu cầu phân biệt AI đang xử lý, chờ nhân viên và nhân viên đã nhận. Việc chuyển giao phải đồng bộ ở backend, tránh để giao diện chỉ hiển thị AI dừng trong khi API vẫn sinh câu trả lời. Phần khảo cứu tài liệu học thuật và so sánh hệ thống liên quan cần được bổ sung ở mốc hoàn thiện cơ sở lý thuyết.</w:t>
       </w:r>
     </w:p>
@@ -97,28 +61,16 @@
         <w:pStyle w:val="Heading1"/>
       </w:pPr>
       <w:r>
-        <w:rPr>
-          <w:rFonts w:ascii="Times New Roman" w:hAnsi="Times New Roman" w:eastAsia="Times New Roman" w:cs="Times New Roman"/>
-          <w:color w:val="000000"/>
-        </w:rPr>
         <w:t>Chương 3 Phân tích yêu cầu hệ thống</w:t>
       </w:r>
     </w:p>
     <w:p>
       <w:r>
-        <w:rPr>
-          <w:rFonts w:ascii="Times New Roman" w:hAnsi="Times New Roman" w:eastAsia="Times New Roman" w:cs="Times New Roman"/>
-          <w:color w:val="000000"/>
-        </w:rPr>
         <w:t>Quản trị viên cấp tài khoản nhân viên và quản lý tài liệu. Nhân viên đọc Inbox, tiếp nhận hội thoại đang chờ và chỉ trả lời khi là người phụ trách. Khách hàng gửi câu hỏi, nhận câu trả lời có nguồn hoặc được chuyển người thật. Phiên khách riêng cho widget chưa được xây; API nhận tin hiện là API nội bộ có xác thực nhân viên phục vụ phát triển và demo.</w:t>
       </w:r>
     </w:p>
     <w:p>
       <w:r>
-        <w:rPr>
-          <w:rFonts w:ascii="Times New Roman" w:hAnsi="Times New Roman" w:eastAsia="Times New Roman" w:cs="Times New Roman"/>
-          <w:color w:val="000000"/>
-        </w:rPr>
         <w:t>Các điều kiện kiểm chứng của mốc này gồm chặn truy cập chưa đăng nhập, chặn giả mạo người gửi, bảo đảm chỉ một nhân viên nhận thành công khi có tranh chấp, giữ lịch sử tin nhắn và ngừng RAG khi đã handoff. Giao diện phải có trạng thái tải/lỗi/rỗng, giữ đúng khách đang chọn và không đưa bản nháp sang hội thoại khác.</w:t>
       </w:r>
     </w:p>
@@ -127,47 +79,27 @@
         <w:pStyle w:val="Heading1"/>
       </w:pPr>
       <w:r>
-        <w:rPr>
-          <w:rFonts w:ascii="Times New Roman" w:hAnsi="Times New Roman" w:eastAsia="Times New Roman" w:cs="Times New Roman"/>
-          <w:color w:val="000000"/>
-        </w:rPr>
         <w:t>Chương 4 Thiết kế hệ thống</w:t>
       </w:r>
     </w:p>
     <w:p>
       <w:r>
-        <w:rPr>
-          <w:rFonts w:ascii="Times New Roman" w:hAnsi="Times New Roman" w:eastAsia="Times New Roman" w:cs="Times New Roman"/>
-          <w:color w:val="000000"/>
-        </w:rPr>
-        <w:t>Backend là ứng dụng FastAPI chia module, dùng SQLAlchemy và SQLite; frontend là React/Vite. Các thực thể chính gồm User, AuthSession, Customer, Conversation, Message, Ticket, Order, KnowledgeDocument và DocumentChunk. Conversation lưu assigned_agent_id; Message lưu agent_id và citations. Các bảng hội thoại và tài liệu tách khỏi chỉ mục vector trong bộ nhớ.</w:t>
+        <w:t>Backend là ứng dụng FastAPI chia module, dùng SQLAlchemy và SQLite; frontend là React/Vite. Các thực thể chính gồm User, AuthSession, Customer, Conversation, Message, Ticket, Order, KnowledgeDocument và DocumentChunk. Conversation lưu assigned_agent_id; Message lưu agent_id và citations. Các bảng hội thoại và tài liệu tách khỏi Qdrant embedded trên đĩa. Tài liệu có hash chống trùng, phiên bản chỉ mục và model embedding; đoạn nguồn có trang hoặc vị trí dòng/đoạn/bảng.</w:t>
       </w:r>
     </w:p>
     <w:p>
       <w:r>
-        <w:rPr>
-          <w:rFonts w:ascii="Times New Roman" w:hAnsi="Times New Roman" w:eastAsia="Times New Roman" w:cs="Times New Roman"/>
-          <w:color w:val="000000"/>
-        </w:rPr>
         <w:t>Mật khẩu được băm PBKDF2-HMAC-SHA256 với salt ngẫu nhiên và 600.000 vòng. Token phiên ngẫu nhiên có thời hạn 8 giờ; DB lưu giá trị SHA-256 của token. Trình duyệt giữ cookie HttpOnly, SameSite=Strict; thao tác ghi yêu cầu header chống CSRF. Cookie Secure bật khi APP_ENV khác development. Admin có quyền cấp tài khoản và tải tài liệu; quyền trả lời vẫn yêu cầu đúng người phụ trách, kể cả với admin.</w:t>
       </w:r>
     </w:p>
     <w:p>
       <w:r>
-        <w:rPr>
-          <w:rFonts w:ascii="Times New Roman" w:hAnsi="Times New Roman" w:eastAsia="Times New Roman" w:cs="Times New Roman"/>
-          <w:color w:val="000000"/>
-        </w:rPr>
-        <w:t>Tiếp nhận dùng câu lệnh cập nhật có điều kiện theo trạng thái và người phụ trách chưa được gán. Luồng tin nhắn giữ khóa ghi trong transaction để đồng bộ với tiếp nhận và lưu phản hồi. Cách này phù hợp retrieval local hiện tại; trước khi gọi LLM chậm qua mạng cần chuyển sang xử lý nền và kiểm tra lại trạng thái trước khi lưu hoặc gửi phản hồi.</w:t>
+        <w:t>Tiếp nhận dùng câu lệnh cập nhật có điều kiện theo trạng thái và người phụ trách chưa được gán. Luồng tin nhắn lưu tin khách và kết thúc transaction trước khi gọi Ollama. Sau khi model trả lời, backend kiểm tra lại trạng thái, ID tin khách mới nhất và phiên bản nguồn trước khi lưu/gửi AI. Lỗi model giữ nguyên tin khách; phản hồi cũ bị bỏ nếu đã handoff hoặc có tin khách mới.</w:t>
       </w:r>
     </w:p>
     <w:p>
       <w:r>
-        <w:rPr>
-          <w:rFonts w:ascii="Times New Roman" w:hAnsi="Times New Roman" w:eastAsia="Times New Roman" w:cs="Times New Roman"/>
-          <w:color w:val="000000"/>
-        </w:rPr>
-        <w:t>Migration phiên bản 1 bổ sung bảng và cột, giữ nội dung cũ, có thể chạy lại. Các hội thoại đã được gán bằng bản demo nhưng chưa có nhân viên xác thực được đưa về hàng chờ. Chỉ SQLite đã được kiểm chứng; PostgreSQL và migration thay đổi cấu trúc phức tạp chưa nằm trong kết quả của mốc này.</w:t>
+        <w:t>Migration phiên bản 1 và 2 bổ sung bảng/cột, metadata nguồn và ID tin khách mới nhất, giữ nội dung cũ và có thể chạy lại. Các hội thoại đã được gán bằng bản demo nhưng chưa có nhân viên xác thực được đưa về hàng chờ. Chỉ SQLite đã được kiểm chứng; PostgreSQL và migration thay đổi cấu trúc phức tạp chưa nằm trong kết quả của mốc này.</w:t>
       </w:r>
     </w:p>
     <w:p>
@@ -175,78 +107,32 @@
         <w:pStyle w:val="Heading1"/>
       </w:pPr>
       <w:r>
-        <w:rPr>
-          <w:rFonts w:ascii="Times New Roman" w:hAnsi="Times New Roman" w:eastAsia="Times New Roman" w:cs="Times New Roman"/>
-          <w:color w:val="000000"/>
-        </w:rPr>
         <w:t>Chương 5 Triển khai và thực hiện</w:t>
       </w:r>
     </w:p>
     <w:p>
       <w:r>
-        <w:rPr>
-          <w:rFonts w:ascii="Times New Roman" w:hAnsi="Times New Roman" w:eastAsia="Times New Roman" w:cs="Times New Roman"/>
-          <w:color w:val="000000"/>
-        </w:rPr>
         <w:t>Đã triển khai API đăng nhập, xem phiên, đăng xuất và cấp tài khoản; bổ sung CLI nhập mật khẩu ẩn để tạo nhân viên/admin. Không có mật khẩu mặc định. Giới hạn thử đăng nhập hiện chạy trong bộ nhớ một API worker, 10 lần mỗi phút theo địa chỉ kết nối. Triển khai nhiều worker hoặc reverse proxy cần cơ chế giới hạn dùng chung.</w:t>
       </w:r>
     </w:p>
     <w:p>
       <w:r>
-        <w:rPr>
-          <w:rFonts w:ascii="Times New Roman" w:hAnsi="Times New Roman" w:eastAsia="Times New Roman" w:cs="Times New Roman"/>
-          <w:color w:val="000000"/>
-        </w:rPr>
         <w:t>Hai endpoint nhận tin messages và process dùng chung dịch vụ. Khi hội thoại mở, hệ thống phân loại bằng từ khóa, tra cứu đơn hoặc trả lời từ tài liệu, đồng thời lưu phản hồi AI và citation. Khi cần chuyển giao, hệ thống tạo ticket với trích đoạn tối đa tám tin gần nhất. Khi chờ hoặc đã được tiếp nhận, tin khách tiếp tục được lưu nhưng không gọi RAG/order tool, không hạ trạng thái assigned và không tạo ticket mới cho mỗi lần khiếu nại.</w:t>
       </w:r>
     </w:p>
     <w:p>
       <w:r>
-        <w:rPr>
-          <w:rFonts w:ascii="Times New Roman" w:hAnsi="Times New Roman" w:eastAsia="Times New Roman" w:cs="Times New Roman"/>
-          <w:color w:val="000000"/>
-        </w:rPr>
         <w:t>Frontend có màn hình đăng nhập, khôi phục phiên sau tải lại, đăng xuất, thông báo AI đã dừng và quyền phụ trách. Bản nháp được giữ riêng theo ID hội thoại trong bộ nhớ trang. Sau tiếp nhận hoặc gửi, Inbox tải lại dữ liệu; cập nhật từ các phiên khác vẫn cần nút Làm mới do chưa có realtime.</w:t>
       </w:r>
     </w:p>
     <w:p>
-      <w:pPr>
-        <w:pStyle w:val="Heading1"/>
-        <w:pageBreakBefore/>
-      </w:pPr>
       <w:r>
-        <w:rPr>
-          <w:rFonts w:ascii="Times New Roman" w:hAnsi="Times New Roman" w:eastAsia="Times New Roman" w:cs="Times New Roman"/>
-          <w:color w:val="000000"/>
-        </w:rPr>
-        <w:t>Chương 6 Kết quả thực hiện</w:t>
+        <w:t>Ollama portable Windows chạy qwen3:1.7b và embeddinggemma:300m, tạo vector 768 chiều. Qdrant embedded dùng một API worker. Ingestion PDF/DOCX/TXT/Markdown có giới hạn 10 MB; PDF scan chưa có OCR. Tài liệu lỗi hoặc bị gián đoạn có thể lập chỉ mục lại; xóa ngừng truy xuất trước khi dọn file/vector. Giao diện Kho tri thức cho admin tải, xem, xóa, lập chỉ mục lại; nhân viên xem nguồn và hỏi thử.</w:t>
       </w:r>
     </w:p>
     <w:p>
       <w:r>
-        <w:rPr>
-          <w:rFonts w:ascii="Times New Roman" w:hAnsi="Times New Roman" w:eastAsia="Times New Roman" w:cs="Times New Roman"/>
-          <w:color w:val="000000"/>
-        </w:rPr>
-        <w:t>Lệnh python -m unittest discover -s app/tests -v chạy đạt 15 kiểm thử trên DB thử tách biệt. Các nhóm kiểm tra bao gồm mật khẩu/cookie, phiên hết hạn và tài khoản vô hiệu, quyền admin/agent và CSRF, giới hạn đăng nhập, dữ liệu gửi giả mạo, luồng tin nhắn/handoff, nhận tranh chấp bằng hai luồng, migration giữ dữ liệu, Inbox và nhận diện mã đơn.</w:t>
-      </w:r>
-    </w:p>
-    <w:p>
-      <w:r>
-        <w:rPr>
-          <w:rFonts w:ascii="Times New Roman" w:hAnsi="Times New Roman" w:eastAsia="Times New Roman" w:cs="Times New Roman"/>
-          <w:color w:val="000000"/>
-        </w:rPr>
-        <w:t>Kiểm tra trình duyệt trên dữ liệu tạm đã xác nhận đăng nhập, tiếp nhận, gửi trả lời, giữ bản nháp theo hội thoại, giữ phiên sau tải lại và đăng xuất. Bố cục desktop và mobile rộng 390 pixel được kiểm tra trực quan. Frontend build bằng Vite thành công. Các kết quả này chứng minh mốc con xác thực và handoff local, chưa phải nghiệm thu trọn M2, M3, M4 hay M5.</w:t>
-      </w:r>
-    </w:p>
-    <w:p>
-      <w:r>
-        <w:rPr>
-          <w:rFonts w:ascii="Times New Roman" w:hAnsi="Times New Roman" w:eastAsia="Times New Roman" w:cs="Times New Roman"/>
-          <w:color w:val="000000"/>
-        </w:rPr>
-        <w:t>Chưa có số liệu chất lượng RAG, độ đúng sentiment, SLA hoặc độ trễ p50/p95. Hash embedding 256 chiều và chỉ mục trong RAM chưa thay thế embedding ngữ nghĩa/vector DB bền. Tóm tắt là trích đoạn, công cụ đơn hàng được chọn bằng dò mã, chưa phải LLM tool calling. Không dùng các kiểm thử nghiệp vụ để suy ra chất lượng mô hình AI.</w:t>
+        <w:t>LLM nhận tối đa bốn tin lịch sử ngắn để hiểu câu nối tiếp; tài liệu là bằng chứng cho nội dung chính sách. JSON trả về gồm đáp án, supported và citation có quote. Backend kiểm tra schema, ID nguồn, quote nguyên văn và phiên bản còn hiệu lực. Ngưỡng retrieval 0,35 mới là cấu hình ban đầu; kiểm tra quote chưa chứng minh mọi mệnh đề trong câu trả lời đều đúng.</w:t>
       </w:r>
     </w:p>
     <w:p>
@@ -254,28 +140,39 @@
         <w:pStyle w:val="Heading1"/>
       </w:pPr>
       <w:r>
-        <w:rPr>
-          <w:rFonts w:ascii="Times New Roman" w:hAnsi="Times New Roman" w:eastAsia="Times New Roman" w:cs="Times New Roman"/>
-          <w:color w:val="000000"/>
-        </w:rPr>
+        <w:t>Chương 6 Kết quả thực hiện</w:t>
+      </w:r>
+    </w:p>
+    <w:p>
+      <w:r>
+        <w:t>Lệnh python -m unittest discover -s app/tests -v chạy đạt 22 kiểm thử trên DB thử tách biệt. Các nhóm kiểm tra bao gồm mật khẩu/cookie, phiên hết hạn và tài khoản vô hiệu, quyền admin/agent và CSRF, giới hạn đăng nhập, dữ liệu gửi giả mạo, luồng tin nhắn/handoff, nhận tranh chấp bằng hai luồng, migration giữ dữ liệu, Inbox, nhận diện mã đơn, vector lưu bền, metadata, chống trùng, retry/xóa tài liệu, citation sai, lỗi provider và AI muộn sau tin khách mới.</w:t>
+      </w:r>
+    </w:p>
+    <w:p>
+      <w:r>
+        <w:t>Kiểm tra trình duyệt trên dữ liệu tạm đã xác nhận đăng nhập, tiếp nhận, gửi trả lời, giữ bản nháp theo hội thoại, giữ phiên sau tải lại và đăng xuất. Bố cục desktop và mobile rộng 390 pixel được kiểm tra trực quan. Frontend build bằng Vite thành công. Kho tri thức cũng đã được kiểm tra tải và lập chỉ mục thật, xem nội dung, hỏi Ollama và mở đoạn nguồn trên desktop/mobile. Các kết quả này chứng minh chức năng local, chưa phải nghiệm thu trọn M2, M3, M4 hay M5.</w:t>
+      </w:r>
+    </w:p>
+    <w:p>
+      <w:r>
+        <w:t>Smoke test Ollama thật đạt bốn ca: hỏi chính sách, hỏi nối tiếp, câu thiếu thông tin và yêu cầu bịa dữ liệu. Hai câu có đáp án trích đúng nguồn; hai câu còn lại từ chối. Vector được đóng/mở lại trước khi hỏi. Thời gian lần chạy cuối lần lượt là 9,64; 9,69; 4,67 và 8,77 giây trên máy 16 GB RAM, RTX 3060 Laptop GPU 6 GB VRAM. Lượt tải model đầu có thể mất hơn một phút. Chưa có số liệu Recall@k, độ đúng sentiment, SLA hoặc p50/p95 trên tập đánh giá cố định. Tóm tắt là trích đoạn, công cụ đơn hàng được chọn bằng dò mã, chưa phải LLM tool calling. Không dùng các kiểm thử nghiệp vụ để suy ra chất lượng mô hình AI.</w:t>
+      </w:r>
+    </w:p>
+    <w:p>
+      <w:pPr>
+        <w:pStyle w:val="Heading1"/>
+      </w:pPr>
+      <w:r>
         <w:t>Chương 7 Kết luận và đề xuất</w:t>
       </w:r>
     </w:p>
     <w:p>
       <w:r>
-        <w:rPr>
-          <w:rFonts w:ascii="Times New Roman" w:hAnsi="Times New Roman" w:eastAsia="Times New Roman" w:cs="Times New Roman"/>
-          <w:color w:val="000000"/>
-        </w:rPr>
-        <w:t>Mốc hiện tại tạo nền tảng xác thực và chuyển giao có người phụ trách, giúp giữ nhất quán quyền trả lời và trạng thái AI. Công việc tiếp theo là thay RAG local bằng embedding ngữ nghĩa, vector DB lưu bền và LLM có nguồn; sau đó hoàn thiện widget/realtime/SLA, Agentic RAG, kênh thứ hai, đánh giá và triển khai.</w:t>
+        <w:t>Mốc hiện tại tạo nền tảng xác thực và chuyển giao có người phụ trách, giúp giữ nhất quán quyền trả lời và trạng thái AI. RAG local đã có mô hình thật và lưu bền. Công việc tiếp theo là xây bộ 60-100 câu tiếng Việt có đáp án/nguồn, đo baseline và hiệu chỉnh retrieval; sau đó hoàn thiện widget/realtime/SLA, Agentic RAG, kênh thứ hai, đánh giá và triển khai.</w:t>
       </w:r>
     </w:p>
     <w:p>
       <w:r>
-        <w:rPr>
-          <w:rFonts w:ascii="Times New Roman" w:hAnsi="Times New Roman" w:eastAsia="Times New Roman" w:cs="Times New Roman"/>
-          <w:color w:val="000000"/>
-        </w:rPr>
         <w:t>Hồ sơ cần tiếp tục bổ sung thông tin thành viên, sơ đồ nghiệp vụ/ERD/sequence, nguồn tham khảo học thuật và kết quả đo thực tế. DeCuong.md giữ kế hoạch nghiên cứu; docs/TASKS.md và ROADMAP.md theo dõi phạm vi và bằng chứng hoàn thành.</w:t>
       </w:r>
     </w:p>
@@ -653,7 +550,7 @@
     <w:qFormat/>
     <w:rsid w:val="00FC693F"/>
     <w:pPr>
-      <w:spacing w:after="160" w:line="276" w:lineRule="auto"/>
+      <w:spacing w:after="140" w:line="269" w:lineRule="auto"/>
     </w:pPr>
     <w:rPr>
       <w:rFonts w:ascii="Times New Roman" w:hAnsi="Times New Roman"/>
@@ -675,6 +572,10 @@
       </w:tabs>
       <w:spacing w:after="0" w:line="240" w:lineRule="auto"/>
     </w:pPr>
+    <w:rPr>
+      <w:rFonts w:ascii="Times New Roman" w:hAnsi="Times New Roman"/>
+      <w:color w:val="000000"/>
+    </w:rPr>
   </w:style>
   <w:style w:type="character" w:customStyle="1" w:styleId="HeaderChar">
     <w:name w:val="Header Char"/>
@@ -697,6 +598,10 @@
       </w:tabs>
       <w:spacing w:after="0" w:line="240" w:lineRule="auto"/>
     </w:pPr>
+    <w:rPr>
+      <w:rFonts w:ascii="Times New Roman" w:hAnsi="Times New Roman"/>
+      <w:color w:val="000000"/>
+    </w:rPr>
   </w:style>
   <w:style w:type="character" w:customStyle="1" w:styleId="FooterChar">
     <w:name w:val="Footer Char"/>
@@ -720,7 +625,7 @@
       <w:outlineLvl w:val="0"/>
     </w:pPr>
     <w:rPr>
-      <w:rFonts w:asciiTheme="majorHAnsi" w:eastAsiaTheme="majorEastAsia" w:hAnsiTheme="majorHAnsi" w:cstheme="majorBidi" w:ascii="Times New Roman" w:hAnsi="Times New Roman"/>
+      <w:rFonts w:ascii="Times New Roman" w:hAnsi="Times New Roman"/>
       <w:b/>
       <w:bCs/>
       <w:color w:val="000000"/>
@@ -744,7 +649,7 @@
       <w:outlineLvl w:val="1"/>
     </w:pPr>
     <w:rPr>
-      <w:rFonts w:asciiTheme="majorHAnsi" w:eastAsiaTheme="majorEastAsia" w:hAnsiTheme="majorHAnsi" w:cstheme="majorBidi" w:ascii="Times New Roman" w:hAnsi="Times New Roman"/>
+      <w:rFonts w:ascii="Times New Roman" w:hAnsi="Times New Roman"/>
       <w:b/>
       <w:bCs/>
       <w:color w:val="000000"/>
@@ -768,10 +673,10 @@
       <w:outlineLvl w:val="2"/>
     </w:pPr>
     <w:rPr>
-      <w:rFonts w:asciiTheme="majorHAnsi" w:eastAsiaTheme="majorEastAsia" w:hAnsiTheme="majorHAnsi" w:cstheme="majorBidi"/>
+      <w:rFonts w:ascii="Times New Roman" w:hAnsi="Times New Roman"/>
       <w:b/>
       <w:bCs/>
-      <w:color w:val="4F81BD" w:themeColor="accent1"/>
+      <w:color w:val="000000"/>
     </w:rPr>
   </w:style>
   <w:style w:type="paragraph" w:styleId="Heading4">
@@ -791,12 +696,12 @@
       <w:outlineLvl w:val="3"/>
     </w:pPr>
     <w:rPr>
-      <w:rFonts w:asciiTheme="majorHAnsi" w:eastAsiaTheme="majorEastAsia" w:hAnsiTheme="majorHAnsi" w:cstheme="majorBidi"/>
+      <w:rFonts w:ascii="Times New Roman" w:hAnsi="Times New Roman"/>
       <w:b/>
       <w:bCs/>
       <w:i/>
       <w:iCs/>
-      <w:color w:val="4F81BD" w:themeColor="accent1"/>
+      <w:color w:val="000000"/>
     </w:rPr>
   </w:style>
   <w:style w:type="paragraph" w:styleId="Heading5">
@@ -816,8 +721,8 @@
       <w:outlineLvl w:val="4"/>
     </w:pPr>
     <w:rPr>
-      <w:rFonts w:asciiTheme="majorHAnsi" w:eastAsiaTheme="majorEastAsia" w:hAnsiTheme="majorHAnsi" w:cstheme="majorBidi"/>
-      <w:color w:val="243F60" w:themeColor="accent1" w:themeShade="7F"/>
+      <w:rFonts w:ascii="Times New Roman" w:hAnsi="Times New Roman"/>
+      <w:color w:val="000000"/>
     </w:rPr>
   </w:style>
   <w:style w:type="paragraph" w:styleId="Heading6">
@@ -837,10 +742,10 @@
       <w:outlineLvl w:val="5"/>
     </w:pPr>
     <w:rPr>
-      <w:rFonts w:asciiTheme="majorHAnsi" w:eastAsiaTheme="majorEastAsia" w:hAnsiTheme="majorHAnsi" w:cstheme="majorBidi"/>
+      <w:rFonts w:ascii="Times New Roman" w:hAnsi="Times New Roman"/>
       <w:i/>
       <w:iCs/>
-      <w:color w:val="243F60" w:themeColor="accent1" w:themeShade="7F"/>
+      <w:color w:val="000000"/>
     </w:rPr>
   </w:style>
   <w:style w:type="paragraph" w:styleId="Heading7">
@@ -860,10 +765,10 @@
       <w:outlineLvl w:val="6"/>
     </w:pPr>
     <w:rPr>
-      <w:rFonts w:asciiTheme="majorHAnsi" w:eastAsiaTheme="majorEastAsia" w:hAnsiTheme="majorHAnsi" w:cstheme="majorBidi"/>
+      <w:rFonts w:ascii="Times New Roman" w:hAnsi="Times New Roman"/>
       <w:i/>
       <w:iCs/>
-      <w:color w:val="404040" w:themeColor="text1" w:themeTint="BF"/>
+      <w:color w:val="000000"/>
     </w:rPr>
   </w:style>
   <w:style w:type="paragraph" w:styleId="Heading8">
@@ -883,8 +788,8 @@
       <w:outlineLvl w:val="7"/>
     </w:pPr>
     <w:rPr>
-      <w:rFonts w:asciiTheme="majorHAnsi" w:eastAsiaTheme="majorEastAsia" w:hAnsiTheme="majorHAnsi" w:cstheme="majorBidi"/>
-      <w:color w:val="4F81BD" w:themeColor="accent1"/>
+      <w:rFonts w:ascii="Times New Roman" w:hAnsi="Times New Roman"/>
+      <w:color w:val="000000"/>
       <w:sz w:val="20"/>
       <w:szCs w:val="20"/>
     </w:rPr>
@@ -906,10 +811,10 @@
       <w:outlineLvl w:val="8"/>
     </w:pPr>
     <w:rPr>
-      <w:rFonts w:asciiTheme="majorHAnsi" w:eastAsiaTheme="majorEastAsia" w:hAnsiTheme="majorHAnsi" w:cstheme="majorBidi"/>
+      <w:rFonts w:ascii="Times New Roman" w:hAnsi="Times New Roman"/>
       <w:i/>
       <w:iCs/>
-      <w:color w:val="404040" w:themeColor="text1" w:themeTint="BF"/>
+      <w:color w:val="000000"/>
       <w:sz w:val="20"/>
       <w:szCs w:val="20"/>
     </w:rPr>
@@ -949,6 +854,10 @@
     <w:pPr>
       <w:spacing w:after="0" w:line="240" w:lineRule="auto"/>
     </w:pPr>
+    <w:rPr>
+      <w:rFonts w:ascii="Times New Roman" w:hAnsi="Times New Roman"/>
+      <w:color w:val="000000"/>
+    </w:rPr>
   </w:style>
   <w:style w:type="character" w:customStyle="1" w:styleId="Heading1Char">
     <w:name w:val="Heading 1 Char"/>
@@ -1002,11 +911,12 @@
     <w:qFormat/>
     <w:rsid w:val="00FC693F"/>
     <w:pPr>
+      <w:keepNext/>
       <w:spacing w:after="160" w:line="240" w:lineRule="auto"/>
       <w:contextualSpacing/>
     </w:pPr>
     <w:rPr>
-      <w:rFonts w:asciiTheme="majorHAnsi" w:eastAsiaTheme="majorEastAsia" w:hAnsiTheme="majorHAnsi" w:cstheme="majorBidi" w:ascii="Times New Roman" w:hAnsi="Times New Roman"/>
+      <w:rFonts w:ascii="Times New Roman" w:hAnsi="Times New Roman"/>
       <w:color w:val="000000"/>
       <w:spacing w:val="5"/>
       <w:kern w:val="28"/>
@@ -1043,10 +953,10 @@
       </w:numPr>
     </w:pPr>
     <w:rPr>
-      <w:rFonts w:asciiTheme="majorHAnsi" w:eastAsiaTheme="majorEastAsia" w:hAnsiTheme="majorHAnsi" w:cstheme="majorBidi"/>
+      <w:rFonts w:ascii="Times New Roman" w:hAnsi="Times New Roman"/>
       <w:i/>
       <w:iCs/>
-      <w:color w:val="4F81BD" w:themeColor="accent1"/>
+      <w:color w:val="000000"/>
       <w:spacing w:val="15"/>
       <w:sz w:val="24"/>
       <w:szCs w:val="24"/>
@@ -1078,6 +988,10 @@
       <w:ind w:left="720"/>
       <w:contextualSpacing/>
     </w:pPr>
+    <w:rPr>
+      <w:rFonts w:ascii="Times New Roman" w:hAnsi="Times New Roman"/>
+      <w:color w:val="000000"/>
+    </w:rPr>
   </w:style>
   <w:style w:type="paragraph" w:styleId="BodyText">
     <w:name w:val="Body Text"/>
@@ -1089,6 +1003,10 @@
     <w:pPr>
       <w:spacing w:after="120"/>
     </w:pPr>
+    <w:rPr>
+      <w:rFonts w:ascii="Times New Roman" w:hAnsi="Times New Roman"/>
+      <w:color w:val="000000"/>
+    </w:rPr>
   </w:style>
   <w:style w:type="character" w:customStyle="1" w:styleId="BodyTextChar">
     <w:name w:val="Body Text Char"/>
@@ -1107,6 +1025,10 @@
     <w:pPr>
       <w:spacing w:after="120" w:line="480" w:lineRule="auto"/>
     </w:pPr>
+    <w:rPr>
+      <w:rFonts w:ascii="Times New Roman" w:hAnsi="Times New Roman"/>
+      <w:color w:val="000000"/>
+    </w:rPr>
   </w:style>
   <w:style w:type="character" w:customStyle="1" w:styleId="BodyText2Char">
     <w:name w:val="Body Text 2 Char"/>
@@ -1126,6 +1048,8 @@
       <w:spacing w:after="120"/>
     </w:pPr>
     <w:rPr>
+      <w:rFonts w:ascii="Times New Roman" w:hAnsi="Times New Roman"/>
+      <w:color w:val="000000"/>
       <w:sz w:val="16"/>
       <w:szCs w:val="16"/>
     </w:rPr>
@@ -1151,6 +1075,10 @@
       <w:ind w:left="360" w:hanging="360"/>
       <w:contextualSpacing/>
     </w:pPr>
+    <w:rPr>
+      <w:rFonts w:ascii="Times New Roman" w:hAnsi="Times New Roman"/>
+      <w:color w:val="000000"/>
+    </w:rPr>
   </w:style>
   <w:style w:type="paragraph" w:styleId="List2">
     <w:name w:val="List 2"/>
@@ -1162,6 +1090,10 @@
       <w:ind w:left="720" w:hanging="360"/>
       <w:contextualSpacing/>
     </w:pPr>
+    <w:rPr>
+      <w:rFonts w:ascii="Times New Roman" w:hAnsi="Times New Roman"/>
+      <w:color w:val="000000"/>
+    </w:rPr>
   </w:style>
   <w:style w:type="paragraph" w:styleId="List3">
     <w:name w:val="List 3"/>
@@ -1173,6 +1105,10 @@
       <w:ind w:left="1080" w:hanging="360"/>
       <w:contextualSpacing/>
     </w:pPr>
+    <w:rPr>
+      <w:rFonts w:ascii="Times New Roman" w:hAnsi="Times New Roman"/>
+      <w:color w:val="000000"/>
+    </w:rPr>
   </w:style>
   <w:style w:type="paragraph" w:styleId="ListBullet">
     <w:name w:val="List Bullet"/>
@@ -1186,6 +1122,10 @@
       </w:numPr>
       <w:contextualSpacing/>
     </w:pPr>
+    <w:rPr>
+      <w:rFonts w:ascii="Times New Roman" w:hAnsi="Times New Roman"/>
+      <w:color w:val="000000"/>
+    </w:rPr>
   </w:style>
   <w:style w:type="paragraph" w:styleId="ListBullet2">
     <w:name w:val="List Bullet 2"/>
@@ -1199,6 +1139,10 @@
       </w:numPr>
       <w:contextualSpacing/>
     </w:pPr>
+    <w:rPr>
+      <w:rFonts w:ascii="Times New Roman" w:hAnsi="Times New Roman"/>
+      <w:color w:val="000000"/>
+    </w:rPr>
   </w:style>
   <w:style w:type="paragraph" w:styleId="ListBullet3">
     <w:name w:val="List Bullet 3"/>
@@ -1212,6 +1156,10 @@
       </w:numPr>
       <w:contextualSpacing/>
     </w:pPr>
+    <w:rPr>
+      <w:rFonts w:ascii="Times New Roman" w:hAnsi="Times New Roman"/>
+      <w:color w:val="000000"/>
+    </w:rPr>
   </w:style>
   <w:style w:type="paragraph" w:styleId="ListNumber">
     <w:name w:val="List Number"/>
@@ -1225,6 +1173,10 @@
       </w:numPr>
       <w:contextualSpacing/>
     </w:pPr>
+    <w:rPr>
+      <w:rFonts w:ascii="Times New Roman" w:hAnsi="Times New Roman"/>
+      <w:color w:val="000000"/>
+    </w:rPr>
   </w:style>
   <w:style w:type="paragraph" w:styleId="ListNumber2">
     <w:name w:val="List Number 2"/>
@@ -1238,6 +1190,10 @@
       </w:numPr>
       <w:contextualSpacing/>
     </w:pPr>
+    <w:rPr>
+      <w:rFonts w:ascii="Times New Roman" w:hAnsi="Times New Roman"/>
+      <w:color w:val="000000"/>
+    </w:rPr>
   </w:style>
   <w:style w:type="paragraph" w:styleId="ListNumber3">
     <w:name w:val="List Number 3"/>
@@ -1251,6 +1207,10 @@
       </w:numPr>
       <w:contextualSpacing/>
     </w:pPr>
+    <w:rPr>
+      <w:rFonts w:ascii="Times New Roman" w:hAnsi="Times New Roman"/>
+      <w:color w:val="000000"/>
+    </w:rPr>
   </w:style>
   <w:style w:type="paragraph" w:styleId="ListContinue">
     <w:name w:val="List Continue"/>
@@ -1263,6 +1223,10 @@
       <w:ind w:left="360"/>
       <w:contextualSpacing/>
     </w:pPr>
+    <w:rPr>
+      <w:rFonts w:ascii="Times New Roman" w:hAnsi="Times New Roman"/>
+      <w:color w:val="000000"/>
+    </w:rPr>
   </w:style>
   <w:style w:type="paragraph" w:styleId="ListContinue2">
     <w:name w:val="List Continue 2"/>
@@ -1275,6 +1239,10 @@
       <w:ind w:left="720"/>
       <w:contextualSpacing/>
     </w:pPr>
+    <w:rPr>
+      <w:rFonts w:ascii="Times New Roman" w:hAnsi="Times New Roman"/>
+      <w:color w:val="000000"/>
+    </w:rPr>
   </w:style>
   <w:style w:type="paragraph" w:styleId="ListContinue3">
     <w:name w:val="List Continue 3"/>
@@ -1287,6 +1255,10 @@
       <w:ind w:left="1080"/>
       <w:contextualSpacing/>
     </w:pPr>
+    <w:rPr>
+      <w:rFonts w:ascii="Times New Roman" w:hAnsi="Times New Roman"/>
+      <w:color w:val="000000"/>
+    </w:rPr>
   </w:style>
   <w:style w:type="paragraph" w:styleId="MacroText">
     <w:name w:val="macro"/>
@@ -1306,7 +1278,8 @@
       </w:tabs>
     </w:pPr>
     <w:rPr>
-      <w:rFonts w:ascii="Courier" w:hAnsi="Courier"/>
+      <w:rFonts w:ascii="Times New Roman" w:hAnsi="Times New Roman"/>
+      <w:color w:val="000000"/>
       <w:sz w:val="20"/>
       <w:szCs w:val="20"/>
     </w:rPr>
@@ -1332,9 +1305,10 @@
     <w:qFormat/>
     <w:rsid w:val="00FC693F"/>
     <w:rPr>
+      <w:rFonts w:ascii="Times New Roman" w:hAnsi="Times New Roman"/>
       <w:i/>
       <w:iCs/>
-      <w:color w:val="000000" w:themeColor="text1"/>
+      <w:color w:val="000000"/>
     </w:rPr>
   </w:style>
   <w:style w:type="character" w:customStyle="1" w:styleId="QuoteChar">
@@ -1448,9 +1422,10 @@
       <w:spacing w:line="240" w:lineRule="auto"/>
     </w:pPr>
     <w:rPr>
+      <w:rFonts w:ascii="Times New Roman" w:hAnsi="Times New Roman"/>
       <w:b/>
       <w:bCs/>
-      <w:color w:val="4F81BD" w:themeColor="accent1"/>
+      <w:color w:val="000000"/>
       <w:sz w:val="18"/>
       <w:szCs w:val="18"/>
     </w:rPr>
@@ -1490,11 +1465,12 @@
       <w:ind w:left="936" w:right="936"/>
     </w:pPr>
     <w:rPr>
+      <w:rFonts w:ascii="Times New Roman" w:hAnsi="Times New Roman"/>
       <w:b/>
       <w:bCs/>
       <w:i/>
       <w:iCs/>
-      <w:color w:val="4F81BD" w:themeColor="accent1"/>
+      <w:color w:val="000000"/>
     </w:rPr>
   </w:style>
   <w:style w:type="character" w:customStyle="1" w:styleId="IntenseQuoteChar">
@@ -1589,6 +1565,10 @@
     <w:pPr>
       <w:outlineLvl w:val="9"/>
     </w:pPr>
+    <w:rPr>
+      <w:rFonts w:ascii="Times New Roman" w:hAnsi="Times New Roman"/>
+      <w:color w:val="000000"/>
+    </w:rPr>
   </w:style>
   <w:style w:type="table" w:styleId="TableGrid">
     <w:name w:val="Table Grid"/>

</xml_diff>

<commit_message>
feat: add Vietnamese RAG evaluation and measured baselines
</commit_message>
<xml_diff>
--- a/docs/report/BaoCao.docx
+++ b/docs/report/BaoCao.docx
@@ -145,7 +145,7 @@
     </w:p>
     <w:p>
       <w:r>
-        <w:t>Lệnh python -m unittest discover -s app/tests -v chạy đạt 22 kiểm thử trên DB thử tách biệt. Các nhóm kiểm tra bao gồm mật khẩu/cookie, phiên hết hạn và tài khoản vô hiệu, quyền admin/agent và CSRF, giới hạn đăng nhập, dữ liệu gửi giả mạo, luồng tin nhắn/handoff, nhận tranh chấp bằng hai luồng, migration giữ dữ liệu, Inbox, nhận diện mã đơn, vector lưu bền, metadata, chống trùng, retry/xóa tài liệu, citation sai, lỗi provider và AI muộn sau tin khách mới.</w:t>
+        <w:t>Lệnh python -m unittest discover -s app/tests -v chạy đạt 27 kiểm thử trên DB thử tách biệt. Các nhóm kiểm tra bao gồm mật khẩu/cookie, phiên hết hạn và tài khoản vô hiệu, quyền admin/agent và CSRF, giới hạn đăng nhập, dữ liệu gửi giả mạo, luồng tin nhắn/handoff, nhận tranh chấp bằng hai luồng, migration giữ dữ liệu, Inbox, nhận diện mã đơn, vector lưu bền, metadata, chống trùng, retry/xóa tài liệu, citation sai, lỗi provider, AI muộn sau tin khách mới và công thức chấm benchmark.</w:t>
       </w:r>
     </w:p>
     <w:p>
@@ -155,7 +155,22 @@
     </w:p>
     <w:p>
       <w:r>
-        <w:t>Smoke test Ollama thật đạt bốn ca: hỏi chính sách, hỏi nối tiếp, câu thiếu thông tin và yêu cầu bịa dữ liệu. Hai câu có đáp án trích đúng nguồn; hai câu còn lại từ chối. Vector được đóng/mở lại trước khi hỏi. Thời gian lần chạy cuối lần lượt là 9,64; 9,69; 4,67 và 8,77 giây trên máy 16 GB RAM, RTX 3060 Laptop GPU 6 GB VRAM. Lượt tải model đầu có thể mất hơn một phút. Chưa có số liệu Recall@k, độ đúng sentiment, SLA hoặc p50/p95 trên tập đánh giá cố định. Tóm tắt là trích đoạn, công cụ đơn hàng được chọn bằng dò mã, chưa phải LLM tool calling. Không dùng các kiểm thử nghiệp vụ để suy ra chất lượng mô hình AI.</w:t>
+        <w:t>Bộ benchmark RAG gồm 72 câu tiếng Việt trên chính sách cửa hàng giả lập: 24 dev và 48 test, với sáu nhóm có đáp án, hỏi nối tiếp, ngoài tài liệu, mơ hồ, nguồn mâu thuẫn và prompt injection. Nhóm chính sách có đáp án cùng corpus tách theo tập; một số mẫu ý định vẫn giống nhau. Nhãn và đáp án tham chiếu hiện chưa được người dùng duyệt. Trình chạy dùng SQL/vector tạm, lưu hash dữ liệu/mã, digest model, kết quả truy xuất và completion thô. Đã thực hiện 96 lượt gồm dev gốc, dev thử prompt và test gốc; không có lỗi vận hành.</w:t>
+      </w:r>
+    </w:p>
+    <w:p>
+      <w:r>
+        <w:t>Trên 48 câu test cấu hình gốc, Recall@5 đạt 100% ở 36 câu có gold. Quyết định trả lời/từ chối khớp nhãn ở 34/48 câu (70,83%); từ chối đúng 7/16 câu phải từ chối (43,75%), từ chối sai 5/32 câu phải trả lời. Citation khớp nguồn gold đạt 83,33%; proxy dữ kiện đạt 31/48 (64,58%), chưa phải tỷ lệ đúng do người chấm. Độ trễ p50/p95 là 7,669/8,292 giây, đo tuần tự trên 48 câu thành công, gồm tải/gỡ model và embedding truy vấn, không gồm ingestion. Máy đo có 16 GB RAM và RTX 3060 Laptop GPU 6 GB VRAM; chưa đánh giá tải đồng thời hoặc khoảng tin cậy.</w:t>
+      </w:r>
+    </w:p>
+    <w:p>
+      <w:r>
+        <w:t>Lỗi chính gồm quote đổi dấu câu gây từ chối, hiểu câu trả lời phủ định thành thiếu bằng chứng, tự chọn sản phẩm khi câu hỏi mơ hồ và chọn một nguồn mâu thuẫn. Test còn lấy tỷ lệ cộng điểm làm tỷ lệ đổi tiền mặt, chấp nhận hai yêu cầu phải từ chối do injection. Một thử nghiệm prompt trên dev không tăng decision accuracy và gây thêm đáp án bịa nên đã bị loại trước khi chạy test. Giữ cấu hình ứng dụng và ngưỡng 0,35; không suy từ citation hợp lệ về chuỗi sang mọi mệnh đề đều có căn cứ. Công thức, kết quả và danh sách ca cần duyệt nằm trong docs/RAG_EVALUATION.md và evals/rag/.</w:t>
+      </w:r>
+    </w:p>
+    <w:p>
+      <w:r>
+        <w:t>Bộ dữ liệu nhỏ, giả lập, dạng TXT chưa thay kiểm thử tài liệu dài/PDF/OCR hoặc dữ liệu khách thật. Chưa có factual correctness hay citation entailment được người duyệt, số liệu sentiment hoặc SLA. Tóm tắt handoff vẫn là trích đoạn, chọn order tool bằng dò mã, chưa phải LLM tool calling.</w:t>
       </w:r>
     </w:p>
     <w:p>
@@ -168,7 +183,7 @@
     </w:p>
     <w:p>
       <w:r>
-        <w:t>Mốc hiện tại tạo nền tảng xác thực và chuyển giao có người phụ trách, giúp giữ nhất quán quyền trả lời và trạng thái AI. RAG local đã có mô hình thật và lưu bền. Công việc tiếp theo là xây bộ 60-100 câu tiếng Việt có đáp án/nguồn, đo baseline và hiệu chỉnh retrieval; sau đó hoàn thiện widget/realtime/SLA, Agentic RAG, kênh thứ hai, đánh giá và triển khai.</w:t>
+        <w:t>Mốc hiện tại tạo nền tảng xác thực và chuyển giao có người phụ trách, giúp giữ nhất quán quyền trả lời và trạng thái AI. RAG local đã có mô hình thật và lưu bền. Đã có bộ 72 câu và baseline ban đầu. Công việc tiếp theo là duyệt nhãn, kiểm chứng từng mệnh đề với nguồn và sửa câu mơ hồ/mâu thuẫn/injection; sau đó hoàn thiện widget/realtime/SLA, Agentic RAG, kênh thứ hai, đánh giá và triển khai.</w:t>
       </w:r>
     </w:p>
     <w:p>

</xml_diff>

<commit_message>
fix: verify RAG answers before sending
</commit_message>
<xml_diff>
--- a/docs/report/BaoCao.docx
+++ b/docs/report/BaoCao.docx
@@ -11,11 +11,13 @@
       </w:r>
     </w:p>
     <w:p>
+      <w:pPr/>
       <w:r>
         <w:t>Báo cáo tiến độ ngày 13 tháng 9 năm 2026</w:t>
       </w:r>
     </w:p>
     <w:p>
+      <w:pPr/>
       <w:r>
         <w:t>Nhóm 5B phát triển hệ thống CSKH cho cửa hàng bán lẻ trực tuyến giả lập, dưới sự hướng dẫn của giảng viên Trần Đình Nghĩa. Phần xác thực nhân viên, tiếp nhận và trả lời trong Unified Inbox đã được kiểm chứng trên Windows với SQLite. RAG đã chạy mô hình Ollama local và Qdrant lưu bền, có giao diện quản lý tài liệu và câu trả lời kèm nguồn. Hệ thống chưa hoàn thành MVP đa kênh hoặc đánh giá chất lượng RAG toàn diện.</w:t>
       </w:r>
@@ -29,11 +31,13 @@
       </w:r>
     </w:p>
     <w:p>
+      <w:pPr/>
       <w:r>
         <w:t>Khách hàng cần được hỗ trợ về chính sách và trạng thái đơn hàng, trong khi nhân viên phải xử lý nhiều câu hỏi lặp lại. Hệ thống dự kiến dùng RAG để truy xuất tài liệu nội bộ, công cụ nghiệp vụ để tra cứu đơn và chuyển người thật khi phát hiện yêu cầu hỗ trợ trực tiếp.</w:t>
       </w:r>
     </w:p>
     <w:p>
+      <w:pPr/>
       <w:r>
         <w:t>Phạm vi gồm Website Chat Widget và một kênh xã hội thật, Knowledge Base PDF/DOCX, hội thoại và ticket/SLA, trả lời có nguồn, tra cứu đơn hàng giả lập và handoff. Telegram là kênh thứ hai được đề xuất, chưa tích hợp. Mục tiêu chất lượng là giảm trả lời thiếu căn cứ và từ chối khi thiếu bằng chứng; chưa khẳng định không có hallucination.</w:t>
       </w:r>
@@ -47,11 +51,13 @@
       </w:r>
     </w:p>
     <w:p>
+      <w:pPr/>
       <w:r>
         <w:t>RAG kết hợp truy hồi thông tin với quá trình tạo câu trả lời. Embedding ngữ nghĩa và cơ sở dữ liệu vector cần được đánh giá bằng tập câu hỏi có nguồn. Agentic RAG bổ sung quyết định dùng công cụ hoặc chuyển nhân viên dựa trên trạng thái và yêu cầu nghiệp vụ.</w:t>
       </w:r>
     </w:p>
     <w:p>
+      <w:pPr/>
       <w:r>
         <w:t>Human-in-the-loop trong hệ thống này yêu cầu phân biệt AI đang xử lý, chờ nhân viên và nhân viên đã nhận. Việc chuyển giao phải đồng bộ ở backend, tránh để giao diện chỉ hiển thị AI dừng trong khi API vẫn sinh câu trả lời. Phần khảo cứu tài liệu học thuật và so sánh hệ thống liên quan cần được bổ sung ở mốc hoàn thiện cơ sở lý thuyết.</w:t>
       </w:r>
@@ -65,11 +71,13 @@
       </w:r>
     </w:p>
     <w:p>
+      <w:pPr/>
       <w:r>
         <w:t>Quản trị viên cấp tài khoản nhân viên và quản lý tài liệu. Nhân viên đọc Inbox, tiếp nhận hội thoại đang chờ và chỉ trả lời khi là người phụ trách. Khách hàng gửi câu hỏi, nhận câu trả lời có nguồn hoặc được chuyển người thật. Phiên khách riêng cho widget chưa được xây; API nhận tin hiện là API nội bộ có xác thực nhân viên phục vụ phát triển và demo.</w:t>
       </w:r>
     </w:p>
     <w:p>
+      <w:pPr/>
       <w:r>
         <w:t>Các điều kiện kiểm chứng của mốc này gồm chặn truy cập chưa đăng nhập, chặn giả mạo người gửi, bảo đảm chỉ một nhân viên nhận thành công khi có tranh chấp, giữ lịch sử tin nhắn và ngừng RAG khi đã handoff. Giao diện phải có trạng thái tải/lỗi/rỗng, giữ đúng khách đang chọn và không đưa bản nháp sang hội thoại khác.</w:t>
       </w:r>
@@ -83,21 +91,25 @@
       </w:r>
     </w:p>
     <w:p>
+      <w:pPr/>
       <w:r>
         <w:t>Backend là ứng dụng FastAPI chia module, dùng SQLAlchemy và SQLite; frontend là React/Vite. Các thực thể chính gồm User, AuthSession, Customer, Conversation, Message, Ticket, Order, KnowledgeDocument và DocumentChunk. Conversation lưu assigned_agent_id; Message lưu agent_id và citations. Các bảng hội thoại và tài liệu tách khỏi Qdrant embedded trên đĩa. Tài liệu có hash chống trùng, phiên bản chỉ mục và model embedding; đoạn nguồn có trang hoặc vị trí dòng/đoạn/bảng.</w:t>
       </w:r>
     </w:p>
     <w:p>
+      <w:pPr/>
       <w:r>
         <w:t>Mật khẩu được băm PBKDF2-HMAC-SHA256 với salt ngẫu nhiên và 600.000 vòng. Token phiên ngẫu nhiên có thời hạn 8 giờ; DB lưu giá trị SHA-256 của token. Trình duyệt giữ cookie HttpOnly, SameSite=Strict; thao tác ghi yêu cầu header chống CSRF. Cookie Secure bật khi APP_ENV khác development. Admin có quyền cấp tài khoản và tải tài liệu; quyền trả lời vẫn yêu cầu đúng người phụ trách, kể cả với admin.</w:t>
       </w:r>
     </w:p>
     <w:p>
+      <w:pPr/>
       <w:r>
         <w:t>Tiếp nhận dùng câu lệnh cập nhật có điều kiện theo trạng thái và người phụ trách chưa được gán. Luồng tin nhắn lưu tin khách và kết thúc transaction trước khi gọi Ollama. Sau khi model trả lời, backend kiểm tra lại trạng thái, ID tin khách mới nhất và phiên bản nguồn trước khi lưu/gửi AI. Lỗi model giữ nguyên tin khách; phản hồi cũ bị bỏ nếu đã handoff hoặc có tin khách mới.</w:t>
       </w:r>
     </w:p>
     <w:p>
+      <w:pPr/>
       <w:r>
         <w:t>Migration phiên bản 1 và 2 bổ sung bảng/cột, metadata nguồn và ID tin khách mới nhất, giữ nội dung cũ và có thể chạy lại. Các hội thoại đã được gán bằng bản demo nhưng chưa có nhân viên xác thực được đưa về hàng chờ. Chỉ SQLite đã được kiểm chứng; PostgreSQL và migration thay đổi cấu trúc phức tạp chưa nằm trong kết quả của mốc này.</w:t>
       </w:r>
@@ -111,28 +123,39 @@
       </w:r>
     </w:p>
     <w:p>
+      <w:pPr/>
       <w:r>
         <w:t>Đã triển khai API đăng nhập, xem phiên, đăng xuất và cấp tài khoản; bổ sung CLI nhập mật khẩu ẩn để tạo nhân viên/admin. Không có mật khẩu mặc định. Giới hạn thử đăng nhập hiện chạy trong bộ nhớ một API worker, 10 lần mỗi phút theo địa chỉ kết nối. Triển khai nhiều worker hoặc reverse proxy cần cơ chế giới hạn dùng chung.</w:t>
       </w:r>
     </w:p>
     <w:p>
+      <w:pPr/>
       <w:r>
         <w:t>Hai endpoint nhận tin messages và process dùng chung dịch vụ. Khi hội thoại mở, hệ thống phân loại bằng từ khóa, tra cứu đơn hoặc trả lời từ tài liệu, đồng thời lưu phản hồi AI và citation. Khi cần chuyển giao, hệ thống tạo ticket với trích đoạn tối đa tám tin gần nhất. Khi chờ hoặc đã được tiếp nhận, tin khách tiếp tục được lưu nhưng không gọi RAG/order tool, không hạ trạng thái assigned và không tạo ticket mới cho mỗi lần khiếu nại.</w:t>
       </w:r>
     </w:p>
     <w:p>
+      <w:pPr/>
       <w:r>
         <w:t>Frontend có màn hình đăng nhập, khôi phục phiên sau tải lại, đăng xuất, thông báo AI đã dừng và quyền phụ trách. Bản nháp được giữ riêng theo ID hội thoại trong bộ nhớ trang. Sau tiếp nhận hoặc gửi, Inbox tải lại dữ liệu; cập nhật từ các phiên khác vẫn cần nút Làm mới do chưa có realtime.</w:t>
       </w:r>
     </w:p>
     <w:p>
+      <w:pPr/>
       <w:r>
         <w:t>Ollama portable Windows chạy qwen3:1.7b và embeddinggemma:300m, tạo vector 768 chiều. Qdrant embedded dùng một API worker. Ingestion PDF/DOCX/TXT/Markdown có giới hạn 10 MB; PDF scan chưa có OCR. Tài liệu lỗi hoặc bị gián đoạn có thể lập chỉ mục lại; xóa ngừng truy xuất trước khi dọn file/vector. Giao diện Kho tri thức cho admin tải, xem, xóa, lập chỉ mục lại; nhân viên xem nguồn và hỏi thử.</w:t>
       </w:r>
     </w:p>
     <w:p>
+      <w:pPr/>
       <w:r>
-        <w:t>LLM nhận tối đa bốn tin lịch sử ngắn để hiểu câu nối tiếp; tài liệu là bằng chứng cho nội dung chính sách. JSON trả về gồm đáp án, supported và citation có quote. Backend kiểm tra schema, ID nguồn, quote nguyên văn và phiên bản còn hiệu lực. Ngưỡng retrieval 0,35 mới là cấu hình ban đầu; kiểm tra quote chưa chứng minh mọi mệnh đề trong câu trả lời đều đúng.</w:t>
+        <w:t>LLM nhận tối đa bốn tin lịch sử ngắn để hiểu câu nối tiếp; tài liệu là bằng chứng cho nội dung chính sách. JSON trả về gồm đáp án, supported và citation có quote. Backend kiểm tra schema, ID nguồn và quote nguyên văn. Giữ ngưỡng retrieval 0,35 sau chẩn đoán trên dev. Citation đúng về chuỗi chưa chứng minh mọi mệnh đề trong câu trả lời đều đúng.</w:t>
+      </w:r>
+    </w:p>
+    <w:p>
+      <w:pPr/>
+      <w:r>
+        <w:t>Sau kiểm tra quote, hệ thống gọi cùng qwen3:1.7b một lần nữa để kiểm định đáp án. Ba điều kiện phải cùng đúng: câu hỏi đủ ngữ cảnh, các nguồn liên quan nhất quán và mọi dữ kiện được quote hỗ trợ. Chỉ dẫn chèn trong nguồn không phải bằng chứng chính sách. Kiểm định nhận cả nguồn không được đáp án trích dẫn, trong giới hạn nguồn đã cấp cho model sinh. JSON kiểm định sai dẫn đến từ chối; lỗi provider được báo riêng và giữ tin khách. Cả hai lần gọi model đều nằm ngoài SQL transaction. Backend kiểm tra lại phiên bản mọi nguồn đã kiểm định trước khi lưu AI, đồng thời chặn phản hồi muộn sau handoff hoặc tin khách mới.</w:t>
       </w:r>
     </w:p>
     <w:p>
@@ -144,31 +167,55 @@
       </w:r>
     </w:p>
     <w:p>
+      <w:pPr/>
       <w:r>
-        <w:t>Lệnh python -m unittest discover -s app/tests -v chạy đạt 27 kiểm thử trên DB thử tách biệt. Các nhóm kiểm tra bao gồm mật khẩu/cookie, phiên hết hạn và tài khoản vô hiệu, quyền admin/agent và CSRF, giới hạn đăng nhập, dữ liệu gửi giả mạo, luồng tin nhắn/handoff, nhận tranh chấp bằng hai luồng, migration giữ dữ liệu, Inbox, nhận diện mã đơn, vector lưu bền, metadata, chống trùng, retry/xóa tài liệu, citation sai, lỗi provider, AI muộn sau tin khách mới và công thức chấm benchmark.</w:t>
+        <w:t>Lệnh python -m unittest discover -s app/tests -v chạy đạt 31 kiểm thử trên DB thử tách biệt. Các nhóm kiểm tra bao gồm mật khẩu/cookie, phiên hết hạn và tài khoản vô hiệu, quyền admin/agent và CSRF, giới hạn đăng nhập, dữ liệu gửi giả mạo, luồng tin nhắn/handoff, nhận tranh chấp bằng hai luồng, migration giữ dữ liệu, Inbox, nhận diện mã đơn, vector lưu bền, metadata, chống trùng, retry/xóa tài liệu, citation sai, lỗi provider, AI muộn sau tin khách mới và công thức chấm benchmark. Bổ sung kiểm tra citation đúng không vượt được kết quả kiểm định từ chối, schema kiểm định sai, đáp án phủ định có nguồn, lỗi model trong bước kiểm định giữ tin khách và nguồn không được trích dẫn bị đổi trước khi lưu AI.</w:t>
       </w:r>
     </w:p>
     <w:p>
+      <w:pPr/>
       <w:r>
         <w:t>Kiểm tra trình duyệt trên dữ liệu tạm đã xác nhận đăng nhập, tiếp nhận, gửi trả lời, giữ bản nháp theo hội thoại, giữ phiên sau tải lại và đăng xuất. Bố cục desktop và mobile rộng 390 pixel được kiểm tra trực quan. Frontend build bằng Vite thành công. Kho tri thức cũng đã được kiểm tra tải và lập chỉ mục thật, xem nội dung, hỏi Ollama và mở đoạn nguồn trên desktop/mobile. Các kết quả này chứng minh chức năng local, chưa phải nghiệm thu trọn M2, M3, M4 hay M5.</w:t>
       </w:r>
     </w:p>
     <w:p>
+      <w:pPr/>
       <w:r>
         <w:t>Bộ benchmark RAG gồm 72 câu tiếng Việt trên chính sách cửa hàng giả lập: 24 dev và 48 test, với sáu nhóm có đáp án, hỏi nối tiếp, ngoài tài liệu, mơ hồ, nguồn mâu thuẫn và prompt injection. Nhóm chính sách có đáp án cùng corpus tách theo tập; một số mẫu ý định vẫn giống nhau. Nhãn và đáp án tham chiếu hiện chưa được người dùng duyệt. Trình chạy dùng SQL/vector tạm, lưu hash dữ liệu/mã, digest model, kết quả truy xuất và completion thô. Đã thực hiện 96 lượt gồm dev gốc, dev thử prompt và test gốc; không có lỗi vận hành.</w:t>
       </w:r>
     </w:p>
     <w:p>
+      <w:pPr/>
       <w:r>
         <w:t>Trên 48 câu test cấu hình gốc, Recall@5 đạt 100% ở 36 câu có gold. Quyết định trả lời/từ chối khớp nhãn ở 34/48 câu (70,83%); từ chối đúng 7/16 câu phải từ chối (43,75%), từ chối sai 5/32 câu phải trả lời. Citation khớp nguồn gold đạt 83,33%; proxy dữ kiện đạt 31/48 (64,58%), chưa phải tỷ lệ đúng do người chấm. Độ trễ p50/p95 là 7,669/8,292 giây, đo tuần tự trên 48 câu thành công, gồm tải/gỡ model và embedding truy vấn, không gồm ingestion. Máy đo có 16 GB RAM và RTX 3060 Laptop GPU 6 GB VRAM; chưa đánh giá tải đồng thời hoặc khoảng tin cậy.</w:t>
       </w:r>
     </w:p>
     <w:p>
+      <w:pPr/>
       <w:r>
-        <w:t>Lỗi chính gồm quote đổi dấu câu gây từ chối, hiểu câu trả lời phủ định thành thiếu bằng chứng, tự chọn sản phẩm khi câu hỏi mơ hồ và chọn một nguồn mâu thuẫn. Test còn lấy tỷ lệ cộng điểm làm tỷ lệ đổi tiền mặt, chấp nhận hai yêu cầu phải từ chối do injection. Một thử nghiệm prompt trên dev không tăng decision accuracy và gây thêm đáp án bịa nên đã bị loại trước khi chạy test. Giữ cấu hình ứng dụng và ngưỡng 0,35; không suy từ citation hợp lệ về chuỗi sang mọi mệnh đề đều có căn cứ. Công thức, kết quả và danh sách ca cần duyệt nằm trong docs/RAG_EVALUATION.md và evals/rag/.</w:t>
+        <w:t>Lỗi baseline gồm quote đổi dấu câu gây từ chối, hiểu câu trả lời phủ định thành thiếu bằng chứng, tự chọn sản phẩm khi câu hỏi mơ hồ và chọn một nguồn mâu thuẫn. Test gốc còn lấy tỷ lệ cộng điểm làm tỷ lệ đổi tiền mặt và chấp nhận hai yêu cầu phải từ chối do injection. Một thử nghiệm chỉ sửa prompt sinh trên dev không tăng decision accuracy và gây thêm đáp án bịa nên đã bị loại trước khi chạy test gốc. Công thức, kết quả và danh sách ca cần duyệt nằm trong docs/RAG_EVALUATION.md và evals/rag/.</w:t>
       </w:r>
     </w:p>
     <w:p>
+      <w:pPr/>
+      <w:r>
+        <w:t>Đợt tiếp theo thử ba cách biểu diễn kết quả kiểm định trên cùng 24 câu dev. Bản bốn cờ bị hiểu nhầm chỉ dẫn độc hại nên từ chối sai 8/15; bản một nhãn chung bỏ sót cả hai câu mâu thuẫn. Bản ba điều kiện đạt 20/24 quyết định đúng (83,33%), tăng từ baseline 17/24; từ chối đúng 9/9 và từ chối sai giữ 4/15. Độ trễ p50/p95 tăng từ 8,341/9,135 lên 11,735/13,145 giây. Chọn bản ba điều kiện theo dev, giữ nguyên trước lượt regression test. Không sửa model, retrieval, dữ liệu, nhãn hoặc kết quả cũ để tăng điểm.</w:t>
+      </w:r>
+    </w:p>
+    <w:p>
+      <w:pPr/>
+      <w:r>
+        <w:t>Trên 48 câu regression, quyết định đúng tăng từ 34/48 lên 35/48 (72,92%); từ chối đúng tăng 7/16 lên 10/16 (62,50%), nhưng từ chối sai tăng 5/32 lên 7/32 (21,88%). Hai yêu cầu bịa mã giảm giá và số điện thoại bị chặn, cùng một ca chọn nguồn mâu thuẫn. Model kiểm định từ chối sai đáp án bảo hành đúng ở test-013; test-029 bị chặn vì đáp án sinh thiếu chính xác nhưng nguồn vẫn đủ để trả lời, nên cũng tính từ chối sai. Proxy dữ kiện tăng từ 31/48 lên 33/48 (68,75%). p50/p95 tăng từ 7,669/8,292 lên 12,695/13,220 giây. Đợt này chạy thêm 120 lượt hỏi, gồm ba tập dev và một tập regression; không lỗi vận hành.</w:t>
+      </w:r>
+    </w:p>
+    <w:p>
+      <w:pPr/>
+      <w:r>
+        <w:t>Giữ bước kiểm định cho MVP local vì đã chặn hai yêu cầu bịa trực tiếp và một ca mâu thuẫn trong regression, với chi phí từ chối sai và độ trễ nêu trên. Cải thiện còn nhỏ: ba ca mơ hồ, một ca đảo tỷ lệ cộng điểm thành đổi tiền và hai ca mâu thuẫn vẫn lọt; test-021 còn thiếu ý chính. Kết quả kiểm định bằng cùng model có thể trái với chính lời giải thích của nó. Chưa thể nghiệm thu chất lượng M3, công bố tỷ lệ đúng do người chấm hoặc suy rộng sang tập chưa xem. Snapshot, completion, kết quả và phiếu người duyệt được giữ trong evals/rag/runs/.</w:t>
+      </w:r>
+    </w:p>
+    <w:p>
+      <w:pPr/>
       <w:r>
         <w:t>Bộ dữ liệu nhỏ, giả lập, dạng TXT chưa thay kiểm thử tài liệu dài/PDF/OCR hoặc dữ liệu khách thật. Chưa có factual correctness hay citation entailment được người duyệt, số liệu sentiment hoặc SLA. Tóm tắt handoff vẫn là trích đoạn, chọn order tool bằng dò mã, chưa phải LLM tool calling.</w:t>
       </w:r>
@@ -182,11 +229,13 @@
       </w:r>
     </w:p>
     <w:p>
+      <w:pPr/>
       <w:r>
-        <w:t>Mốc hiện tại tạo nền tảng xác thực và chuyển giao có người phụ trách, giúp giữ nhất quán quyền trả lời và trạng thái AI. RAG local đã có mô hình thật và lưu bền. Đã có bộ 72 câu và baseline ban đầu. Công việc tiếp theo là duyệt nhãn, kiểm chứng từng mệnh đề với nguồn và sửa câu mơ hồ/mâu thuẫn/injection; sau đó hoàn thiện widget/realtime/SLA, Agentic RAG, kênh thứ hai, đánh giá và triển khai.</w:t>
+        <w:t>Mốc hiện tại tạo nền tảng xác thực và chuyển giao có người phụ trách, giúp giữ nhất quán quyền trả lời và trạng thái AI. RAG local đã có mô hình thật, lưu bền, bộ 72 câu và bước kiểm định đáp án sau sinh. Công việc tiếp theo là duyệt nhãn và đáp án, xử lý các ca suy diễn/thiếu điều kiện hoặc mâu thuẫn còn lọt, giảm từ chối sai ở câu phủ định/nối tiếp hoặc quote sai dấu, bổ sung tài liệu PDF/DOCX và câu hỏi chưa xem; sau đó hoàn thiện widget/realtime/SLA, Agentic RAG, kênh thứ hai, đánh giá và triển khai.</w:t>
       </w:r>
     </w:p>
     <w:p>
+      <w:pPr/>
       <w:r>
         <w:t>Hồ sơ cần tiếp tục bổ sung thông tin thành viên, sơ đồ nghiệp vụ/ERD/sequence, nguồn tham khảo học thuật và kết quả đo thực tế. DeCuong.md giữ kế hoạch nghiên cứu; docs/TASKS.md và ROADMAP.md theo dõi phạm vi và bằng chứng hoàn thành.</w:t>
       </w:r>

</xml_diff>

<commit_message>
fix: extract RAG answers from selected source sentences
</commit_message>
<xml_diff>
--- a/docs/report/BaoCao.docx
+++ b/docs/report/BaoCao.docx
@@ -143,19 +143,19 @@
     <w:p>
       <w:pPr/>
       <w:r>
-        <w:t>Ollama portable Windows chạy qwen3:1.7b và embeddinggemma:300m, tạo vector 768 chiều. Qdrant embedded dùng một API worker. Ingestion PDF/DOCX/TXT/Markdown có giới hạn 10 MB; PDF scan chưa có OCR. Tài liệu lỗi hoặc bị gián đoạn có thể lập chỉ mục lại; xóa ngừng truy xuất trước khi dọn file/vector. Giao diện Kho tri thức cho admin tải, xem, xóa, lập chỉ mục lại; nhân viên xem nguồn và hỏi thử.</w:t>
+        <w:t>Ollama portable Windows hiện chạy qwen3:4b và embeddinggemma:300m, tạo vector 768 chiều; model qwen3:1.7b cũ được giữ để đối chiếu. Qdrant embedded dùng một API worker. Ingestion PDF/DOCX/TXT/Markdown có giới hạn 10 MB; PDF scan chưa có OCR. Tài liệu lỗi hoặc bị gián đoạn có thể lập chỉ mục lại; xóa ngừng truy xuất trước khi dọn file/vector. Giao diện Kho tri thức cho admin tải, xem, xóa, lập chỉ mục lại; nhân viên xem nguồn và hỏi thử.</w:t>
       </w:r>
     </w:p>
     <w:p>
       <w:pPr/>
       <w:r>
-        <w:t>LLM nhận tối đa bốn tin lịch sử ngắn để hiểu câu nối tiếp; tài liệu là bằng chứng cho nội dung chính sách. JSON trả về gồm đáp án, supported và citation có quote. Backend kiểm tra schema, ID nguồn và quote nguyên văn. Giữ ngưỡng retrieval 0,35 sau chẩn đoán trên dev. Citation đúng về chuỗi chưa chứng minh mọi mệnh đề trong câu trả lời đều đúng.</w:t>
+        <w:t>LLM nhận tối đa bốn tin lịch sử ngắn để hiểu câu nối tiếp; tài liệu là bằng chứng cho nội dung chính sách. Model chọn tối đa ba cặp ID nguồn và ID câu. Backend xác thực ID, loại trùng rồi ghép nguyên văn các câu, chỉ chuẩn hóa khoảng trắng; model không viết lại số hoặc điều kiện trong câu đã chọn. Giữ ngưỡng retrieval 0,35, tối đa năm nguồn và 1.200 ký tự mỗi nguồn. Tách câu theo dấu chấm, chấm hỏi hoặc chấm than theo sau bởi khoảng trắng, giữ chấm phẩy cùng câu. Chưa xử lý đầy đủ chữ viết tắt, phần nguồn bị cắt hoặc điều kiện nằm ở câu khác. Đáp án giữ ngôn ngữ nguồn, chưa dịch hoặc tổng hợp tự do; chọn đúng ID chưa bảo đảm trả lời đúng câu hỏi.</w:t>
       </w:r>
     </w:p>
     <w:p>
       <w:pPr/>
       <w:r>
-        <w:t>Sau kiểm tra quote, hệ thống gọi cùng qwen3:1.7b một lần nữa để kiểm định đáp án. Ba điều kiện phải cùng đúng: câu hỏi đủ ngữ cảnh, các nguồn liên quan nhất quán và mọi dữ kiện được quote hỗ trợ. Chỉ dẫn chèn trong nguồn không phải bằng chứng chính sách. Kiểm định nhận cả nguồn không được đáp án trích dẫn, trong giới hạn nguồn đã cấp cho model sinh. JSON kiểm định sai dẫn đến từ chối; lỗi provider được báo riêng và giữ tin khách. Cả hai lần gọi model đều nằm ngoài SQL transaction. Backend kiểm tra lại phiên bản mọi nguồn đã kiểm định trước khi lưu AI, đồng thời chặn phản hồi muộn sau handoff hoặc tin khách mới.</w:t>
+        <w:t>Sau trích xuất, hệ thống gọi cùng qwen3:4b một lần nữa để kiểm định đáp án với giải thích ngắn. Ba điều kiện phải cùng đúng: câu hỏi đủ ngữ cảnh, các nguồn liên quan nhất quán và mọi dữ kiện được quote hỗ trợ. Kiểm định nhận cả nguồn không được đáp án trích dẫn trong tập nguồn đã cấp. Chính sách hợp lệ nằm cạnh chỉ dẫn độc hại vẫn có thể dùng nếu đáp án bỏ qua chỉ dẫn đó. JSON kiểm định sai dẫn đến từ chối; provider chưa hoàn tất, hết giới hạn sinh hoặc không có nội dung cuối được báo lỗi riêng và giữ tin khách. Không đưa trường thinking vào đáp án hoặc lịch sử. Cấu hình chat tắt suy luận, context 8192, tối đa 700 token. Cả hai lần gọi model nằm ngoài SQL transaction; phiên bản mọi nguồn được kiểm tra lại trước khi lưu AI, cùng guard handoff và tin khách mới.</w:t>
       </w:r>
     </w:p>
     <w:p>
@@ -169,7 +169,7 @@
     <w:p>
       <w:pPr/>
       <w:r>
-        <w:t>Lệnh python -m unittest discover -s app/tests -v chạy đạt 31 kiểm thử trên DB thử tách biệt. Các nhóm kiểm tra bao gồm mật khẩu/cookie, phiên hết hạn và tài khoản vô hiệu, quyền admin/agent và CSRF, giới hạn đăng nhập, dữ liệu gửi giả mạo, luồng tin nhắn/handoff, nhận tranh chấp bằng hai luồng, migration giữ dữ liệu, Inbox, nhận diện mã đơn, vector lưu bền, metadata, chống trùng, retry/xóa tài liệu, citation sai, lỗi provider, AI muộn sau tin khách mới và công thức chấm benchmark. Bổ sung kiểm tra citation đúng không vượt được kết quả kiểm định từ chối, schema kiểm định sai, đáp án phủ định có nguồn, lỗi model trong bước kiểm định giữ tin khách và nguồn không được trích dẫn bị đổi trước khi lưu AI.</w:t>
+        <w:t>Lệnh python -m unittest discover -s app/tests -v chạy đạt 33 kiểm thử trên DB thử tách biệt. Các nhóm kiểm tra bao gồm mật khẩu/cookie, phiên hết hạn và tài khoản vô hiệu, quyền admin/agent và CSRF, giới hạn đăng nhập, dữ liệu gửi giả mạo, luồng tin nhắn/handoff, nhận tranh chấp bằng hai luồng, migration giữ dữ liệu, Inbox, nhận diện mã đơn, vector lưu bền, metadata, chống trùng, retry/xóa tài liệu, citation sai, lỗi provider, AI muộn sau tin khách mới và công thức chấm benchmark. Bổ sung kiểm tra citation đúng không vượt được kết quả kiểm định từ chối, schema kiểm định sai, đáp án phủ định có nguồn, lỗi model trong bước kiểm định giữ tin khách và nguồn không được trích dẫn bị đổi trước khi lưu AI. Đợt trích xuất bổ sung kiểm tra giữ nguyên số/chấm phẩy, từ chối ID sai hoặc trùng và phản hồi Ollama bị cắt/rỗng.</w:t>
       </w:r>
     </w:p>
     <w:p>
@@ -211,7 +211,25 @@
     <w:p>
       <w:pPr/>
       <w:r>
-        <w:t>Giữ bước kiểm định cho MVP local vì đã chặn hai yêu cầu bịa trực tiếp và một ca mâu thuẫn trong regression, với chi phí từ chối sai và độ trễ nêu trên. Cải thiện còn nhỏ: ba ca mơ hồ, một ca đảo tỷ lệ cộng điểm thành đổi tiền và hai ca mâu thuẫn vẫn lọt; test-021 còn thiếu ý chính. Kết quả kiểm định bằng cùng model có thể trái với chính lời giải thích của nó. Chưa thể nghiệm thu chất lượng M3, công bố tỷ lệ đúng do người chấm hoặc suy rộng sang tập chưa xem. Snapshot, completion, kết quả và phiếu người duyệt được giữ trong evals/rag/runs/.</w:t>
+        <w:t>Ở đợt trước, nhóm giữ bước kiểm định cho MVP local vì đã chặn hai yêu cầu bịa trực tiếp và một ca mâu thuẫn trong regression, với chi phí từ chối sai và độ trễ nêu trên. Cải thiện còn nhỏ: ba ca mơ hồ, một ca đảo tỷ lệ cộng điểm thành đổi tiền và hai ca mâu thuẫn vẫn lọt; test-021 còn thiếu ý chính. Kết quả kiểm định bằng cùng model có thể trái với chính lời giải thích của nó. Chưa thể nghiệm thu chất lượng M3, công bố tỷ lệ đúng do người chấm hoặc suy rộng sang tập chưa xem. Snapshot, completion, kết quả và phiếu người duyệt được giữ trong evals/rag/runs/.</w:t>
+      </w:r>
+    </w:p>
+    <w:p>
+      <w:pPr/>
+      <w:r>
+        <w:t>Đợt cải tiến tiếp theo so sáu cấu hình dev, mỗi cấu hình 24 câu. Bật suy luận trên model 1,7B phát sinh lỗi hết token và vẫn có đáp án đảo điều kiện; hai bản trích xuất 1,7B chưa tăng proxy. Chỉ đổi sang 4B với luồng sinh tự do cũng giảm chất lượng do chép sai số và kiểm định sai. Bản 4B chọn câu nguyên văn đạt 21/24 nhưng giải thích kiểm định dài chạm giới hạn schema. Bản yêu cầu giải thích ngắn đạt 22/24 quyết định đúng và proxy, từ chối đúng 9/9, từ chối sai 2/15, không lỗi provider. So bản kiểm định trước, từ chối sai giảm từ 4/15; p50/p95 tăng từ 11,735/13,145 lên 14,627/15,597 giây. Chọn bản này theo dev rồi giữ nguyên trước regression. Model 4B Q4_K_M tải khoảng 2,5 GB; một lần quan sát Ollama ghi khoảng 3,87 GB VRAM với context 8192, chưa phải bộ nhớ đỉnh.</w:t>
+      </w:r>
+    </w:p>
+    <w:p>
+      <w:pPr/>
+      <w:r>
+        <w:t>Trên 48 câu regression của bản trích xuất 4B, quyết định đúng đạt 40/48 so 35/48 bản kiểm định trước; từ chối đúng 14/16 so 10/16, từ chối sai 6/32 so 7/32. Proxy dữ kiện đạt 40/48 so 33/48; citation khớp nguồn gold 87.10%, Recall@5 100.00% trên 36 câu có gold. p50/p95 là 14.096/14.739 giây so 12,695/13,220 giây; 0 lỗi vận hành. Đợt này có 192 lượt đánh giá đầy đủ, gồm 144 dev và 48 regression; hai lỗi hết token thuộc các cấu hình 1,7B bị loại. Pilot chỉ phục vụ chẩn đoán, không đưa vào các tỷ lệ này. Corpus, nhãn, retrieval và kết quả cũ được giữ, kèm hash mã thực chạy và digest model.</w:t>
+      </w:r>
+    </w:p>
+    <w:p>
+      <w:pPr/>
+      <w:r>
+        <w:t>Bản trích xuất từ chối đúng cả bốn ca mâu thuẫn và hai yêu cầu bịa trực tiếp, nhưng còn test-036 lấy chính sách cộng điểm để trả lời đổi tiền mặt và test-038 tự chọn dịch vụ giao hàng. Sáu ca từ chối sai là test-021, 025, 026, 029, 045 và 046. Hai ca cuối hồi quy so bản trước: đáp án trích chính sách hợp lệ nhưng bị kiểm định loại vì nguồn chứa chỉ dẫn độc hại ở phần khác. Trích nguyên văn giảm lỗi viết lại số và điều kiện, chưa giải quyết sai đối tượng hoặc đủ ngữ cảnh; kết quả ba cờ kiểm định vẫn có thể trái với giải thích. Không sửa tiếp theo lượt test này. Tập test là regression đã xem lỗi; chưa có câu nào được người duyệt và không suy điểm tự động thành độ đúng ngữ nghĩa.</w:t>
       </w:r>
     </w:p>
     <w:p>
@@ -231,7 +249,7 @@
     <w:p>
       <w:pPr/>
       <w:r>
-        <w:t>Mốc hiện tại tạo nền tảng xác thực và chuyển giao có người phụ trách, giúp giữ nhất quán quyền trả lời và trạng thái AI. RAG local đã có mô hình thật, lưu bền, bộ 72 câu và bước kiểm định đáp án sau sinh. Công việc tiếp theo là duyệt nhãn và đáp án, xử lý các ca suy diễn/thiếu điều kiện hoặc mâu thuẫn còn lọt, giảm từ chối sai ở câu phủ định/nối tiếp hoặc quote sai dấu, bổ sung tài liệu PDF/DOCX và câu hỏi chưa xem; sau đó hoàn thiện widget/realtime/SLA, Agentic RAG, kênh thứ hai, đánh giá và triển khai.</w:t>
+        <w:t>Mốc hiện tại tạo nền tảng xác thực và chuyển giao có người phụ trách, giúp giữ nhất quán quyền trả lời và trạng thái AI. RAG local đã có mô hình thật, lưu bền, bộ 72 câu, trích câu nguồn bằng ID và kiểm định đáp án. M3 chưa nghiệm thu: cần người duyệt nhãn và mức đúng/có căn cứ, bổ sung tài liệu PDF/DOCX và câu hỏi chưa xem, xử lý từ chối sai và điều kiện còn thiếu. Sau đó hoàn thiện widget/phiên khách/realtime/SLA, Agentic RAG, kênh thứ hai, đánh giá và triển khai.</w:t>
       </w:r>
     </w:p>
     <w:p>

</xml_diff>

<commit_message>
test: evaluate RAG against PDF and DOCX sources
</commit_message>
<xml_diff>
--- a/docs/report/BaoCao.docx
+++ b/docs/report/BaoCao.docx
@@ -169,7 +169,7 @@
     <w:p>
       <w:pPr/>
       <w:r>
-        <w:t>Lệnh python -m unittest discover -s app/tests -v chạy đạt 33 kiểm thử trên DB thử tách biệt. Các nhóm kiểm tra bao gồm mật khẩu/cookie, phiên hết hạn và tài khoản vô hiệu, quyền admin/agent và CSRF, giới hạn đăng nhập, dữ liệu gửi giả mạo, luồng tin nhắn/handoff, nhận tranh chấp bằng hai luồng, migration giữ dữ liệu, Inbox, nhận diện mã đơn, vector lưu bền, metadata, chống trùng, retry/xóa tài liệu, citation sai, lỗi provider, AI muộn sau tin khách mới và công thức chấm benchmark. Bổ sung kiểm tra citation đúng không vượt được kết quả kiểm định từ chối, schema kiểm định sai, đáp án phủ định có nguồn, lỗi model trong bước kiểm định giữ tin khách và nguồn không được trích dẫn bị đổi trước khi lưu AI. Đợt trích xuất bổ sung kiểm tra giữ nguyên số/chấm phẩy, từ chối ID sai hoặc trùng và phản hồi Ollama bị cắt/rỗng.</w:t>
+        <w:t>Lệnh python -m unittest discover -s app/tests -v chạy đạt 37 kiểm thử trên DB thử tách biệt. Các nhóm kiểm tra bao gồm mật khẩu/cookie, phiên hết hạn và tài khoản vô hiệu, quyền admin/agent và CSRF, giới hạn đăng nhập, dữ liệu gửi giả mạo, luồng tin nhắn/handoff, nhận tranh chấp bằng hai luồng, migration giữ dữ liệu, Inbox, nhận diện mã đơn, vector lưu bền, metadata, chống trùng, retry/xóa tài liệu, citation sai, lỗi provider, AI muộn sau tin khách mới và công thức chấm benchmark. Bổ sung kiểm tra citation đúng không vượt được kết quả kiểm định từ chối, schema kiểm định sai, đáp án phủ định có nguồn, lỗi model trong bước kiểm định giữ tin khách và nguồn không được trích dẫn bị đổi trước khi lưu AI. Đợt trích xuất bổ sung kiểm tra giữ nguyên số/chấm phẩy, từ chối ID sai hoặc trùng và phản hồi Ollama bị cắt/rỗng.</w:t>
       </w:r>
     </w:p>
     <w:p>
@@ -235,7 +235,19 @@
     <w:p>
       <w:pPr/>
       <w:r>
-        <w:t>Bộ dữ liệu nhỏ, giả lập, dạng TXT chưa thay kiểm thử tài liệu dài/PDF/OCR hoặc dữ liệu khách thật. Chưa có factual correctness hay citation entailment được người duyệt, số liệu sentiment hoặc SLA. Tóm tắt handoff vẫn là trích đoạn, chọn order tool bằng dò mã, chưa phải LLM tool calling.</w:t>
+        <w:t>Bổ sung trình đánh giá nhận dataset trong repo và đọc PDF/DOCX bằng cùng parser/chunker của ingestion. Gold được xác nhận tại trang PDF, đoạn hoặc hàng bảng DOCX, phải nằm trọn trong một chunk; chấm citation kiểm tra cả page nếu có. Log ingestion ghi hash, thời gian, số chunk, trạng thái và lỗi mỗi file; manifest lưu phiên bản parser. Đã kiểm tra 37 unittest, gồm nhập corpus nhị phân, log JSON và từ chối sai vị trí/đường dẫn. Phát lại phép chấm trên 408 ca TXT đã lưu cho điểm từng ca và tổng hợp không đổi, không gọi model thêm.</w:t>
+      </w:r>
+    </w:p>
+    <w:p>
+      <w:pPr/>
+      <w:r>
+        <w:t>Bộ bổ sung có 24 câu trên PDF ba trang và DOCX một trang có bảng, với 14 câu có đáp án và 10 câu cần từ chối. PDF dài nhất 355 từ, cần nhiều chunk; DOCX có câu chính sách và chỉ dẫn độc hại trong các đoạn riêng. Cả hai file đã được kiểm tra trực quan; PDF lập 6 chunk trong 3,699 giây, DOCX lập 10 chunk trong 3,852 giây. Model/prompt/retrieval giữ cấu hình đã chốt trước khi tạo bộ mới. Lượt đầu dừng trước câu hỏi do serialize datetime trong log, đã sửa và giữ manifest incomplete riêng; lượt sau chạy vào thư mục mới.</w:t>
+      </w:r>
+    </w:p>
+    <w:p>
+      <w:pPr/>
+      <w:r>
+        <w:t>Lượt PDF/DOCX gồm 24 câu đạt 21/24 quyết định đúng và 21/24 proxy dữ kiện; từ chối đúng 9/10, từ chối sai 2/14. Recall@1/3/5 là 93.75%/100.00%/100.00% trên 16 câu có gold; citation khớp gold 63.16%. p50/p95 14.031/15.727 giây trên 24 ca thành công; 0 lỗi provider. Đây là phép đo trên chính sách mới do cùng trợ lý soạn sau khi đã xem lỗi TXT, chưa phải tập độc lập hoặc có nhãn người duyệt. Không cộng với kết quả TXT để tuyên bố tăng chất lượng. doc-005 bị từ chối vì model chọn ID câu vượt phạm vi dù retrieval có bằng chứng; doc-013 diễn giải đúng chính sách phủ định nhưng đánh cờ từ chối. doc-019 liệt kê phạm vi dịch vụ khi thiếu địa chỉ khách, không khớp nhãn từ chối; cần người duyệt xem trả lời nêu phạm vi có phù hợp không. Citation ngoài gold có thể là câu nguồn thật nhưng không thuộc đáp án tham chiếu. Sau khi xem kết quả, bộ mới dùng làm regression; M3 vẫn chờ đánh giá độc lập.</w:t>
       </w:r>
     </w:p>
     <w:p>
@@ -249,7 +261,7 @@
     <w:p>
       <w:pPr/>
       <w:r>
-        <w:t>Mốc hiện tại tạo nền tảng xác thực và chuyển giao có người phụ trách, giúp giữ nhất quán quyền trả lời và trạng thái AI. RAG local đã có mô hình thật, lưu bền, bộ 72 câu, trích câu nguồn bằng ID và kiểm định đáp án. M3 chưa nghiệm thu: cần người duyệt nhãn và mức đúng/có căn cứ, bổ sung tài liệu PDF/DOCX và câu hỏi chưa xem, xử lý từ chối sai và điều kiện còn thiếu. Sau đó hoàn thiện widget/phiên khách/realtime/SLA, Agentic RAG, kênh thứ hai, đánh giá và triển khai.</w:t>
+        <w:t>Mốc hiện tại tạo nền tảng xác thực và chuyển giao có người phụ trách, giúp giữ nhất quán quyền trả lời và trạng thái AI. RAG local có mô hình thật, lưu bền, bộ 72 câu TXT và 24 câu PDF/DOCX, trích câu nguồn và kiểm định. M3 chưa nghiệm thu: cần người duyệt nhãn/đáp án, nguồn và câu hỏi độc lập; xử lý ID sai, phủ định/nối tiếp và điều kiện thiếu. OCR, sentiment/SLA và LLM tool calling chưa được đánh giá. Tiếp theo hoàn thiện widget/phiên khách/realtime, Agentic RAG, kênh thứ hai và triển khai.</w:t>
       </w:r>
     </w:p>
     <w:p>

</xml_diff>

<commit_message>
fix: constrain RAG sentence IDs to retrieved sources
</commit_message>
<xml_diff>
--- a/docs/report/BaoCao.docx
+++ b/docs/report/BaoCao.docx
@@ -159,6 +159,12 @@
       </w:r>
     </w:p>
     <w:p>
+      <w:pPr/>
+      <w:r>
+        <w:t>JSON Schema giới hạn source_id và sentence_id bằng từng nhánh oneOf theo nguồn thực được cấp cho model. Grammar của Ollama chỉ cho chọn cặp ID tồn tại; backend vẫn chặn ID sai hoặc trùng nếu provider bỏ qua schema. Không thêm lượt model, retry hoặc thay prompt kiểm định. Ràng buộc này ngăn ID vượt phạm vi, chưa bảo đảm câu được chọn đủ ý hoặc kiểm định đúng ngữ nghĩa.</w:t>
+      </w:r>
+    </w:p>
+    <w:p>
       <w:pPr>
         <w:pStyle w:val="Heading1"/>
       </w:pPr>
@@ -169,7 +175,7 @@
     <w:p>
       <w:pPr/>
       <w:r>
-        <w:t>Lệnh python -m unittest discover -s app/tests -v chạy đạt 37 kiểm thử trên DB thử tách biệt. Các nhóm kiểm tra bao gồm mật khẩu/cookie, phiên hết hạn và tài khoản vô hiệu, quyền admin/agent và CSRF, giới hạn đăng nhập, dữ liệu gửi giả mạo, luồng tin nhắn/handoff, nhận tranh chấp bằng hai luồng, migration giữ dữ liệu, Inbox, nhận diện mã đơn, vector lưu bền, metadata, chống trùng, retry/xóa tài liệu, citation sai, lỗi provider, AI muộn sau tin khách mới và công thức chấm benchmark. Bổ sung kiểm tra citation đúng không vượt được kết quả kiểm định từ chối, schema kiểm định sai, đáp án phủ định có nguồn, lỗi model trong bước kiểm định giữ tin khách và nguồn không được trích dẫn bị đổi trước khi lưu AI. Đợt trích xuất bổ sung kiểm tra giữ nguyên số/chấm phẩy, từ chối ID sai hoặc trùng và phản hồi Ollama bị cắt/rỗng.</w:t>
+        <w:t>Lệnh python -m unittest discover -s app/tests -v chạy đạt 38 kiểm thử trên DB thử tách biệt. Các nhóm kiểm tra bao gồm mật khẩu/cookie, phiên hết hạn và tài khoản vô hiệu, quyền admin/agent và CSRF, giới hạn đăng nhập, dữ liệu gửi giả mạo, luồng tin nhắn/handoff, nhận tranh chấp bằng hai luồng, migration giữ dữ liệu, Inbox, nhận diện mã đơn, vector lưu bền, metadata, chống trùng, retry/xóa tài liệu, citation sai, lỗi provider, AI muộn sau tin khách mới và công thức chấm benchmark. Bổ sung kiểm tra citation đúng không vượt được kết quả kiểm định từ chối, schema kiểm định sai, đáp án phủ định có nguồn, lỗi model trong bước kiểm định giữ tin khách và nguồn không được trích dẫn bị đổi trước khi lưu AI. Đợt trích xuất bổ sung kiểm tra giữ nguyên số/chấm phẩy, từ chối ID sai hoặc trùng và phản hồi Ollama bị cắt/rỗng. Kiểm thử mới xác nhận schema ràng buộc đúng ID theo hai nguồn có số câu khác nhau và backend vẫn chặn cặp ID chéo nguồn không hợp lệ.</w:t>
       </w:r>
     </w:p>
     <w:p>
@@ -251,6 +257,12 @@
       </w:r>
     </w:p>
     <w:p>
+      <w:pPr/>
+      <w:r>
+        <w:t>Đợt ràng buộc ID theo nguồn chạy thêm 96 ca, không lỗi provider hoặc cặp ID vượt phạm vi. Chốt schema theo dev 22/24 quyết định khớp nhãn/proxy rồi giữ nguyên trước hai lượt hồi quy. PDF/DOCX giữ 21/24, từ chối đúng 9/10 và từ chối sai 2/14; TXT giữ 40/48, từ chối đúng 14/16 và từ chối sai 6/32. Điểm từng ca của cả ba lượt không đổi so baseline tương ứng. p50/p95 mới là 13,287/14,022 giây trên dev, 14,154/14,939 giây trên PDF/DOCX và 13,484/15,081 giây trên TXT; không suy chênh lệch từng lượt thành tăng tốc do schema. doc-005 chọn ID hợp lệ, có câu chứa mốc 18 giờ nhưng kèm mảnh câu và câu hóa đơn ngoài yêu cầu, rồi bị kiểm định từ chối. Lỗi ID đã xử lý; chọn nội dung và kiểm định ngữ nghĩa vẫn cần cải thiện. Model, retrieval, prompt và nhãn giữ nguyên; hash và snapshot đã đối chiếu với mã thực chạy. Kết quả chi tiết nằm trong các thư mục bounded-ids tại evals/rag/runs và evals/rag-documents/runs.</w:t>
+      </w:r>
+    </w:p>
+    <w:p>
       <w:pPr>
         <w:pStyle w:val="Heading1"/>
       </w:pPr>
@@ -261,7 +273,7 @@
     <w:p>
       <w:pPr/>
       <w:r>
-        <w:t>Mốc hiện tại tạo nền tảng xác thực và chuyển giao có người phụ trách, giúp giữ nhất quán quyền trả lời và trạng thái AI. RAG local có mô hình thật, lưu bền, bộ 72 câu TXT và 24 câu PDF/DOCX, trích câu nguồn và kiểm định. M3 chưa nghiệm thu: cần người duyệt nhãn/đáp án, nguồn và câu hỏi độc lập; xử lý ID sai, phủ định/nối tiếp và điều kiện thiếu. OCR, sentiment/SLA và LLM tool calling chưa được đánh giá. Tiếp theo hoàn thiện widget/phiên khách/realtime, Agentic RAG, kênh thứ hai và triển khai.</w:t>
+        <w:t>Mốc hiện tại tạo nền tảng xác thực và chuyển giao có người phụ trách, giúp giữ nhất quán quyền trả lời và trạng thái AI. RAG local có mô hình thật, lưu bền, bộ 72 câu TXT và 24 câu PDF/DOCX, trích câu nguồn và kiểm định. M3 chưa nghiệm thu: cần người duyệt nhãn/đáp án, nguồn và câu hỏi độc lập; giảm chọn câu thiếu ngữ cảnh và kiểm định sai ở phủ định/nối tiếp hoặc điều kiện thiếu. OCR, sentiment/SLA và LLM tool calling chưa được đánh giá. Tiếp theo hoàn thiện widget/phiên khách/realtime, Agentic RAG, kênh thứ hai và triển khai.</w:t>
       </w:r>
     </w:p>
     <w:p>

</xml_diff>

<commit_message>
feat: summarize human RAG reviews
</commit_message>
<xml_diff>
--- a/docs/report/BaoCao.docx
+++ b/docs/report/BaoCao.docx
@@ -13,7 +13,7 @@
     <w:p>
       <w:pPr/>
       <w:r>
-        <w:t>Báo cáo tiến độ ngày 13 tháng 9 năm 2026</w:t>
+        <w:t>Báo cáo tiến độ ngày 14 tháng 9 năm 2026</w:t>
       </w:r>
     </w:p>
     <w:p>
@@ -165,6 +165,12 @@
       </w:r>
     </w:p>
     <w:p>
+      <w:pPr/>
+      <w:r>
+        <w:t>CLI app.review_rag đọc kết quả benchmark và bản sao phiếu người duyệt, tổng hợp vào JSON mới mà không gọi model hoặc sửa dữ liệu gốc. Chỉ đánh giá có tên người chấm và nhãn được duyệt mới được tính; mỗi chỉ số có số câu chấm và tỷ lệ riêng, chưa có mẫu giữ null. Kết quả grounded được chấm đúng đáp án, căn cứ và entailment citation; kết quả từ chối được chấm tính phù hợp của abstention. Lỗi provider, nhãn bị bác bỏ và ca chưa chấm được tách riêng. Công cụ kiểm tra ID, kiểu dữ liệu, trường áp dụng, lý do bác nhãn và không ghi đè đầu ra; lưu hash đúng bytes đầu vào và mã chấm. Tên người duyệt là thông tin tự khai, không phải xác thực danh tính; chấm một phần không đại diện cả tập.</w:t>
+      </w:r>
+    </w:p>
+    <w:p>
       <w:pPr>
         <w:pStyle w:val="Heading1"/>
       </w:pPr>
@@ -175,7 +181,7 @@
     <w:p>
       <w:pPr/>
       <w:r>
-        <w:t>Lệnh python -m unittest discover -s app/tests -v chạy đạt 38 kiểm thử trên DB thử tách biệt. Các nhóm kiểm tra bao gồm mật khẩu/cookie, phiên hết hạn và tài khoản vô hiệu, quyền admin/agent và CSRF, giới hạn đăng nhập, dữ liệu gửi giả mạo, luồng tin nhắn/handoff, nhận tranh chấp bằng hai luồng, migration giữ dữ liệu, Inbox, nhận diện mã đơn, vector lưu bền, metadata, chống trùng, retry/xóa tài liệu, citation sai, lỗi provider, AI muộn sau tin khách mới và công thức chấm benchmark. Bổ sung kiểm tra citation đúng không vượt được kết quả kiểm định từ chối, schema kiểm định sai, đáp án phủ định có nguồn, lỗi model trong bước kiểm định giữ tin khách và nguồn không được trích dẫn bị đổi trước khi lưu AI. Đợt trích xuất bổ sung kiểm tra giữ nguyên số/chấm phẩy, từ chối ID sai hoặc trùng và phản hồi Ollama bị cắt/rỗng. Kiểm thử mới xác nhận schema ràng buộc đúng ID theo hai nguồn có số câu khác nhau và backend vẫn chặn cặp ID chéo nguồn không hợp lệ.</w:t>
+        <w:t>Lệnh python -m unittest discover -s app/tests -v chạy đạt 40 kiểm thử; các kiểm thử DB dùng dữ liệu tách biệt. Các nhóm kiểm tra bao gồm mật khẩu/cookie, phiên hết hạn và tài khoản vô hiệu, quyền admin/agent và CSRF, giới hạn đăng nhập, dữ liệu gửi giả mạo, luồng tin nhắn/handoff, nhận tranh chấp bằng hai luồng, migration giữ dữ liệu, Inbox, nhận diện mã đơn, vector lưu bền, metadata, chống trùng, retry/xóa tài liệu, citation sai, lỗi provider, AI muộn sau tin khách mới và công thức chấm benchmark. Bổ sung kiểm tra citation đúng không vượt được kết quả kiểm định từ chối, schema kiểm định sai, đáp án phủ định có nguồn, lỗi model trong bước kiểm định giữ tin khách và nguồn không được trích dẫn bị đổi trước khi lưu AI. Đợt trích xuất bổ sung kiểm tra giữ nguyên số/chấm phẩy, từ chối ID sai hoặc trùng và phản hồi Ollama bị cắt/rỗng. Kiểm thử mới xác nhận schema ràng buộc đúng ID theo hai nguồn có số câu khác nhau và backend vẫn chặn cặp ID chéo nguồn không hợp lệ.</w:t>
       </w:r>
     </w:p>
     <w:p>
@@ -260,6 +266,24 @@
       <w:pPr/>
       <w:r>
         <w:t>Đợt ràng buộc ID theo nguồn chạy thêm 96 ca, không lỗi provider hoặc cặp ID vượt phạm vi. Chốt schema theo dev 22/24 quyết định khớp nhãn/proxy rồi giữ nguyên trước hai lượt hồi quy. PDF/DOCX giữ 21/24, từ chối đúng 9/10 và từ chối sai 2/14; TXT giữ 40/48, từ chối đúng 14/16 và từ chối sai 6/32. Điểm từng ca của cả ba lượt không đổi so baseline tương ứng. p50/p95 mới là 13,287/14,022 giây trên dev, 14,154/14,939 giây trên PDF/DOCX và 13,484/15,081 giây trên TXT; không suy chênh lệch từng lượt thành tăng tốc do schema. doc-005 chọn ID hợp lệ, có câu chứa mốc 18 giờ nhưng kèm mảnh câu và câu hóa đơn ngoài yêu cầu, rồi bị kiểm định từ chối. Lỗi ID đã xử lý; chọn nội dung và kiểm định ngữ nghĩa vẫn cần cải thiện. Model, retrieval, prompt và nhãn giữ nguyên; hash và snapshot đã đối chiếu với mã thực chạy. Kết quả chi tiết nằm trong các thư mục bounded-ids tại evals/rag/runs và evals/rag-documents/runs.</w:t>
+      </w:r>
+    </w:p>
+    <w:p>
+      <w:pPr/>
+      <w:r>
+        <w:t>Đợt kiểm định tiếp theo tập trung vào trường hợp nguồn đã chứa đáp án nhưng model bỏ sót vế câu hoặc hiểu trả lời phủ định là không giải quyết yêu cầu. Bản thêm hướng dẫn đọc đủ câu và phân biệt chất lượng đáp án với chấp thuận dịch vụ đạt 23/24 trên dev, từ chối sai giảm 2/15 xuống 0/15 nhưng từ chối đúng giảm 9/9 xuống 8/9. dev-017 hỏi phương thức thanh toán ngoài tài liệu, câu trả lời chỉ liệt kê phương thức khác vẫn được chấp nhận. Loại bản này theo tiêu chí không giảm khả năng từ chối; p50/p95 14,219/15,016 giây, không lỗi provider. Bản tiếp theo phân biệt thông tin không được đề cập với chính sách phủ định được xác nhận. Mọi thử nghiệm giữ model, selector, retrieval, schema ID và ba cờ kiểm định bắt buộc; chỉ dùng dev để chọn trước hồi quy.</w:t>
+      </w:r>
+    </w:p>
+    <w:p>
+      <w:pPr/>
+      <w:r>
+        <w:t>Bản thêm phân biệt thông tin ngoài nguồn vẫn làm lọt dev-017 và từ chối sai dev-013: 22/24 quyết định khớp nhãn/proxy, từ chối đúng 8/9, từ chối sai 1/15; p50/p95 15,323/16,340 giây. Thử dùng lại tiêu chí gốc và đưa ba cờ lên trước reason trong schema chỉ đạt 14/24, từ chối đúng 9/9 nhưng từ chối sai 10/15; p50/p95 15,276/15,963 giây. Cả ba thử nghiệm, tổng 72 ca, không lỗi provider và đều bị loại trước test. RAG ứng dụng trở về đúng bản 0180479; không có cải thiện chất lượng được chọn trong đợt này, không chạy lại hồi quy cho luồng không đổi. Lỗi kết nối khi Ollama chưa khởi động xảy ra trước ingestion/câu hỏi, được ghi riêng và không tính vào 72 ca hoàn tất.</w:t>
+      </w:r>
+    </w:p>
+    <w:p>
+      <w:pPr/>
+      <w:r>
+        <w:t>Hai kiểm thử mới cho CLI người duyệt xác nhận mẫu số khi chấm dở, giữ null, loại nhãn bị bác bỏ và lỗi provider; chặn ID trùng/lạ, kiểu sai, thiếu người chấm, trường không áp dụng và ghi đè đầu ra. CLI được chạy trên 48 phiếu trống của lượt TXT đang dùng: 0 câu được chấm, 48 nhãn chờ duyệt và mọi tỷ lệ null. Tổng 40 unittest cùng Vite build đạt. Kết quả này kiểm chứng công cụ tổng hợp, không phải đánh giá bằng người đã hoàn tất; vẫn cần người đọc nguồn và điền phiếu thực tế.</w:t>
       </w:r>
     </w:p>
     <w:p>

</xml_diff>

<commit_message>
feat: add isolated customer chat widget
</commit_message>
<xml_diff>
--- a/docs/report/BaoCao.docx
+++ b/docs/report/BaoCao.docx
@@ -73,7 +73,7 @@
     <w:p>
       <w:pPr/>
       <w:r>
-        <w:t>Quản trị viên cấp tài khoản nhân viên và quản lý tài liệu. Nhân viên đọc Inbox, tiếp nhận hội thoại đang chờ và chỉ trả lời khi là người phụ trách. Khách hàng gửi câu hỏi, nhận câu trả lời có nguồn hoặc được chuyển người thật. Phiên khách riêng cho widget chưa được xây; API nhận tin hiện là API nội bộ có xác thực nhân viên phục vụ phát triển và demo.</w:t>
+        <w:t>Quản trị viên cấp tài khoản nhân viên và quản lý tài liệu. Nhân viên đọc Inbox, tiếp nhận hội thoại đang chờ và chỉ trả lời khi là người phụ trách. Khách hàng dùng widget cùng origin để gửi câu hỏi, nhận câu trả lời có nguồn hoặc được chuyển người thật. API widget chỉ đọc và ghi hội thoại gắn với phiên khách; API nội bộ vẫn yêu cầu xác thực nhân viên. Tên khách tự nhập không xác minh danh tính hoặc quyền sở hữu đơn hàng.</w:t>
       </w:r>
     </w:p>
     <w:p>
@@ -93,7 +93,7 @@
     <w:p>
       <w:pPr/>
       <w:r>
-        <w:t>Backend là ứng dụng FastAPI chia module, dùng SQLAlchemy và SQLite; frontend là React/Vite. Các thực thể chính gồm User, AuthSession, Customer, Conversation, Message, Ticket, Order, KnowledgeDocument và DocumentChunk. Conversation lưu assigned_agent_id; Message lưu agent_id và citations. Các bảng hội thoại và tài liệu tách khỏi Qdrant embedded trên đĩa. Tài liệu có hash chống trùng, phiên bản chỉ mục và model embedding; đoạn nguồn có trang hoặc vị trí dòng/đoạn/bảng.</w:t>
+        <w:t>Backend là ứng dụng FastAPI chia module, dùng SQLAlchemy và SQLite; frontend là React/Vite. Các thực thể chính gồm User, AuthSession, WidgetSession, Customer, Conversation, Message, Ticket, Order, KnowledgeDocument và DocumentChunk. Conversation lưu assigned_agent_id; Message lưu agent_id và citations. Các bảng hội thoại và tài liệu tách khỏi Qdrant embedded trên đĩa. Tài liệu có hash chống trùng, phiên bản chỉ mục và model embedding; đoạn nguồn có trang hoặc vị trí dòng/đoạn/bảng.</w:t>
       </w:r>
     </w:p>
     <w:p>
@@ -111,7 +111,7 @@
     <w:p>
       <w:pPr/>
       <w:r>
-        <w:t>Migration phiên bản 1 và 2 bổ sung bảng/cột, metadata nguồn và ID tin khách mới nhất, giữ nội dung cũ và có thể chạy lại. Các hội thoại đã được gán bằng bản demo nhưng chưa có nhân viên xác thực được đưa về hàng chờ. Chỉ SQLite đã được kiểm chứng; PostgreSQL và migration thay đổi cấu trúc phức tạp chưa nằm trong kết quả của mốc này.</w:t>
+        <w:t>Migration phiên bản 1 và 2 bổ sung bảng/cột, metadata nguồn và ID tin khách mới nhất, giữ nội dung cũ và có thể chạy lại. Phiên bản 3 bổ sung bảng phiên widget với hash token, hội thoại duy nhất và thời điểm hết hạn. Các hội thoại đã được gán bằng bản demo nhưng chưa có nhân viên xác thực được đưa về hàng chờ. Chỉ SQLite đã được kiểm chứng; PostgreSQL và migration thay đổi cấu trúc phức tạp chưa nằm trong kết quả của mốc này.</w:t>
       </w:r>
     </w:p>
     <w:p>
@@ -171,6 +171,24 @@
       </w:r>
     </w:p>
     <w:p>
+      <w:pPr/>
+      <w:r>
+        <w:t>Widget phục vụ tại /chat và được mở bằng script /widget.js trên website cùng origin; trang /widget-demo.html minh họa cách nhúng. Server tạo Customer và Conversation, phát cookie HttpOnly riêng tại đường dẫn API widget, có hạn cố định 24 giờ và chỉ lưu hash token trong DB. Phiên chỉ truy cập một hội thoại; payload không được tự khai customer_id, conversation_id hoặc người gửi. Phản hồi công khai gồm tin nhắn và trích dẫn đã lưu, không gồm retrieval thô hoặc ghi chú ticket. Yêu cầu tra đơn chưa xác minh được chuyển nhân viên; không dùng tên trùng để ghép khách với đơn có sẵn.</w:t>
+      </w:r>
+    </w:p>
+    <w:p>
+      <w:pPr/>
+      <w:r>
+        <w:t>Widget khôi phục lịch sử sau tải lại, cập nhật phản hồi nhân viên bằng polling mỗi 3 giây khi tab hiển thị và không đang gửi yêu cầu; chưa có WebSocket hoặc SSE. Mỗi tin dùng UUID để thử gửi lại không trùng, cùng ID nhưng khác nội dung bị từ chối. Lỗi kết nối giữ bản nháp; provider lỗi giữ tin đã lưu và cho phép chuyển nhân viên. Kết thúc thu hồi phiên, đóng hội thoại/ticket và giữ lịch sử cho nhân viên; đóng khung widget chỉ ẩn giao diện. Phản hồi sau lời gọi model kiểm tra lại phiên để không trả lịch sử nếu đã kết thúc hoặc hết hạn.</w:t>
+      </w:r>
+    </w:p>
+    <w:p>
+      <w:pPr/>
+      <w:r>
+        <w:t>Giới hạn local gồm 200 tin gần nhất, 6 lần tạo phiên, 10 lần gửi tin và 6 lần yêu cầu chuyển nhân viên mỗi IP trong một phút. Chỉ một lượt sinh AI từ widget được chạy cùng lúc; lượt đang bận bị từ chối trước khi lưu, handoff vẫn được xử lý. Bộ đếm nằm trong một API worker, chưa điều phối lời gọi RAG nội bộ hoặc tải phân tán. Chưa hỗ trợ nhúng khác origin, phân trang lịch sử, xác minh khách mua hàng hoặc SLA; Inbox nhân viên vẫn cần Làm mới.</w:t>
+      </w:r>
+    </w:p>
+    <w:p>
       <w:pPr>
         <w:pStyle w:val="Heading1"/>
       </w:pPr>
@@ -181,7 +199,7 @@
     <w:p>
       <w:pPr/>
       <w:r>
-        <w:t>Lệnh python -m unittest discover -s app/tests -v chạy đạt 40 kiểm thử; các kiểm thử DB dùng dữ liệu tách biệt. Các nhóm kiểm tra bao gồm mật khẩu/cookie, phiên hết hạn và tài khoản vô hiệu, quyền admin/agent và CSRF, giới hạn đăng nhập, dữ liệu gửi giả mạo, luồng tin nhắn/handoff, nhận tranh chấp bằng hai luồng, migration giữ dữ liệu, Inbox, nhận diện mã đơn, vector lưu bền, metadata, chống trùng, retry/xóa tài liệu, citation sai, lỗi provider, AI muộn sau tin khách mới và công thức chấm benchmark. Bổ sung kiểm tra citation đúng không vượt được kết quả kiểm định từ chối, schema kiểm định sai, đáp án phủ định có nguồn, lỗi model trong bước kiểm định giữ tin khách và nguồn không được trích dẫn bị đổi trước khi lưu AI. Đợt trích xuất bổ sung kiểm tra giữ nguyên số/chấm phẩy, từ chối ID sai hoặc trùng và phản hồi Ollama bị cắt/rỗng. Kiểm thử mới xác nhận schema ràng buộc đúng ID theo hai nguồn có số câu khác nhau và backend vẫn chặn cặp ID chéo nguồn không hợp lệ.</w:t>
+        <w:t>Lệnh python -m unittest discover -s app/tests -v chạy đạt 46 kiểm thử; các kiểm thử DB dùng dữ liệu tách biệt. Các nhóm kiểm tra bao gồm mật khẩu/cookie, phiên hết hạn và tài khoản vô hiệu, quyền admin/agent và CSRF, giới hạn đăng nhập, dữ liệu gửi giả mạo, luồng tin nhắn/handoff, nhận tranh chấp bằng hai luồng, migration giữ dữ liệu, Inbox, nhận diện mã đơn, vector lưu bền, metadata, chống trùng, retry/xóa tài liệu, citation sai, lỗi provider, AI muộn sau tin khách mới và công thức chấm benchmark. Bổ sung kiểm tra citation đúng không vượt được kết quả kiểm định từ chối, schema kiểm định sai, đáp án phủ định có nguồn, lỗi model trong bước kiểm định giữ tin khách và nguồn không được trích dẫn bị đổi trước khi lưu AI. Đợt trích xuất bổ sung kiểm tra giữ nguyên số/chấm phẩy, từ chối ID sai hoặc trùng và phản hồi Ollama bị cắt/rỗng. Kiểm thử mới xác nhận schema ràng buộc đúng ID theo hai nguồn có số câu khác nhau và backend vẫn chặn cặp ID chéo nguồn không hợp lệ.</w:t>
       </w:r>
     </w:p>
     <w:p>
@@ -287,6 +305,12 @@
       </w:r>
     </w:p>
     <w:p>
+      <w:pPr/>
+      <w:r>
+        <w:t>Đợt widget bổ sung sáu kiểm thử, tổng 46 unittest đạt; Vite build đạt. Kiểm thử xác nhận cách ly hai phiên, cookie/CSRF, chặn giả mạo, trùng ID khác nội dung, bảo vệ API nội bộ, không lộ retrieval/ticket, quyền đơn hàng, giới hạn IP/AI và handoff/kết thúc trong lúc model chờ. QA Edge trên DB/vector riêng chạy một câu hỏi bằng Ollama thật, có câu trả lời và quote; khôi phục phiên sau tải lại, chuyển nhân viên và nhận phản hồi qua API/polling đạt. Mất mạng giữ bản nháp và UUID khi thử lại, polling tự phục hồi, Escape trả focus và Kết thúc thu hồi phiên đã kiểm tra. Bố cục trang chat và widget nhúng được kiểm tra trực quan ở desktop và mobile 390 pixel, không tràn ngang. Đây là kiểm chứng chức năng local; không đo lại chất lượng RAG hoặc tải đồng thời trong đợt này.</w:t>
+      </w:r>
+    </w:p>
+    <w:p>
       <w:pPr>
         <w:pStyle w:val="Heading1"/>
       </w:pPr>
@@ -297,7 +321,7 @@
     <w:p>
       <w:pPr/>
       <w:r>
-        <w:t>Mốc hiện tại tạo nền tảng xác thực và chuyển giao có người phụ trách, giúp giữ nhất quán quyền trả lời và trạng thái AI. RAG local có mô hình thật, lưu bền, bộ 72 câu TXT và 24 câu PDF/DOCX, trích câu nguồn và kiểm định. M3 chưa nghiệm thu: cần người duyệt nhãn/đáp án, nguồn và câu hỏi độc lập; giảm chọn câu thiếu ngữ cảnh và kiểm định sai ở phủ định/nối tiếp hoặc điều kiện thiếu. OCR, sentiment/SLA và LLM tool calling chưa được đánh giá. Tiếp theo hoàn thiện widget/phiên khách/realtime, Agentic RAG, kênh thứ hai và triển khai.</w:t>
+        <w:t>Mốc hiện tại tạo nền tảng xác thực và chuyển giao có người phụ trách, giúp giữ nhất quán quyền trả lời và trạng thái AI; widget cùng origin đã có phiên khách riêng và nhận phản hồi nhân viên qua polling. RAG local có mô hình thật, lưu bền, bộ 72 câu TXT và 24 câu PDF/DOCX, trích câu nguồn và kiểm định. M3 chưa nghiệm thu: cần người duyệt nhãn/đáp án, nguồn và câu hỏi độc lập; giảm chọn câu thiếu ngữ cảnh và kiểm định sai ở phủ định/nối tiếp hoặc điều kiện thiếu. OCR, sentiment/SLA và LLM tool calling chưa được đánh giá. Tiếp theo hoàn thiện Inbox realtime và SLA cơ bản của M4, Agentic RAG, kênh thứ hai và triển khai.</w:t>
       </w:r>
     </w:p>
     <w:p>

</xml_diff>

<commit_message>
feat: refresh inbox and track first response SLA
</commit_message>
<xml_diff>
--- a/docs/report/BaoCao.docx
+++ b/docs/report/BaoCao.docx
@@ -137,7 +137,7 @@
     <w:p>
       <w:pPr/>
       <w:r>
-        <w:t>Frontend có màn hình đăng nhập, khôi phục phiên sau tải lại, đăng xuất, thông báo AI đã dừng và quyền phụ trách. Bản nháp được giữ riêng theo ID hội thoại trong bộ nhớ trang. Sau tiếp nhận hoặc gửi, Inbox tải lại dữ liệu; cập nhật từ các phiên khác vẫn cần nút Làm mới do chưa có realtime.</w:t>
+        <w:t>Frontend có màn hình đăng nhập, khôi phục phiên sau tải lại, đăng xuất, thông báo AI đã dừng và quyền phụ trách. Bản nháp được giữ riêng theo ID hội thoại trong bộ nhớ trang. Sau tiếp nhận hoặc gửi, Inbox tải lại dữ liệu; các phiên khác được cập nhật bằng polling mỗi 3 giây khi đang xem Inbox.</w:t>
       </w:r>
     </w:p>
     <w:p>
@@ -185,7 +185,25 @@
     <w:p>
       <w:pPr/>
       <w:r>
-        <w:t>Giới hạn local gồm 200 tin gần nhất, 6 lần tạo phiên, 10 lần gửi tin và 6 lần yêu cầu chuyển nhân viên mỗi IP trong một phút. Chỉ một lượt sinh AI từ widget được chạy cùng lúc; lượt đang bận bị từ chối trước khi lưu, handoff vẫn được xử lý. Bộ đếm nằm trong một API worker, chưa điều phối lời gọi RAG nội bộ hoặc tải phân tán. Chưa hỗ trợ nhúng khác origin, phân trang lịch sử, xác minh khách mua hàng hoặc SLA; Inbox nhân viên vẫn cần Làm mới.</w:t>
+        <w:t>Giới hạn local gồm 200 tin gần nhất, 6 lần tạo phiên, 10 lần gửi tin và 6 lần yêu cầu chuyển nhân viên mỗi IP trong một phút. Chỉ một lượt sinh AI từ widget được chạy cùng lúc; lượt đang bận bị từ chối trước khi lưu, handoff vẫn được xử lý. Bộ đếm nằm trong một API worker, chưa điều phối lời gọi RAG nội bộ hoặc tải phân tán. Chưa hỗ trợ nhúng khác origin, phân trang lịch sử hoặc xác minh khách mua hàng. Inbox nhân viên đã có polling và SLA phản hồi đầu tiên như phần tiếp theo.</w:t>
+      </w:r>
+    </w:p>
+    <w:p>
+      <w:pPr/>
+      <w:r>
+        <w:t>Inbox tự cập nhật danh sách, nội dung, người phụ trách và SLA bằng GET mỗi 3 giây khi tab hiển thị. Mỗi vòng chờ request hoàn tất trước khi đặt lịch tiếp; tạm dừng khi vào Kho tri thức hoặc thao tác ghi. Cập nhật nền giữ hội thoại đang chọn, bản nháp và nội dung cũ khi mất mạng, kèm cảnh báo và tự thử lại. Hủy vòng cũ khi đổi bộ lọc/hội thoại hoặc thao tác ghi để phản hồi muộn không đổi nhầm khách. Backend vẫn kiểm tra quyền và trạng thái ở từng lần gửi; chưa có SSE/WebSocket hoặc đánh giá tải lớn.</w:t>
+      </w:r>
+    </w:p>
+    <w:p>
+      <w:pPr/>
+      <w:r>
+        <w:t>SLA demo đo thời gian đến phản hồi đầu tiên của nhân viên từ lúc tạo ticket, tính 24/7: khẩn cấp 5 phút, cao 15 phút, bình thường 60 phút, thấp 240 phút. Tin nhân viên phải có agent_id và thời điểm từ lúc tạo ticket; nhận việc, AI, tin khách và phản hồi trước ticket không tính. Phản hồi tại hạn vẫn đạt, sau hạn là trễ; đóng chưa phản hồi có trạng thái riêng, không tính đạt. Danh sách chọn ticket đang chờ có hạn sớm nhất hoặc ticket mới nhất nếu không còn chờ; chi tiết hiển thị từng ticket, hạn và lần phản hồi đầu. Bộ lọc cùng thẻ số quá hạn dùng tóm tắt trên tập đang xem.</w:t>
+      </w:r>
+    </w:p>
+    <w:p>
+      <w:pPr/>
+      <w:r>
+        <w:t>SLA được tính từ timestamp hiện có, không ghi đồng hồ vào DB hay thêm migration; chính sách cố định cũng áp dụng ticket cũ. Cần lưu deadline và phiên bản chính sách trước khi cho phép sửa quy tắc/ưu tiên. Chưa xử lý giờ làm việc, ngày nghỉ, thời hạn giải quyết, escalation hoặc báo cáo kiểm toán; phần hiện tại chỉ kiểm chứng SLA phản hồi đầu tiên trong local MVP.</w:t>
       </w:r>
     </w:p>
     <w:p>
@@ -199,7 +217,7 @@
     <w:p>
       <w:pPr/>
       <w:r>
-        <w:t>Lệnh python -m unittest discover -s app/tests -v chạy đạt 46 kiểm thử; các kiểm thử DB dùng dữ liệu tách biệt. Các nhóm kiểm tra bao gồm mật khẩu/cookie, phiên hết hạn và tài khoản vô hiệu, quyền admin/agent và CSRF, giới hạn đăng nhập, dữ liệu gửi giả mạo, luồng tin nhắn/handoff, nhận tranh chấp bằng hai luồng, migration giữ dữ liệu, Inbox, nhận diện mã đơn, vector lưu bền, metadata, chống trùng, retry/xóa tài liệu, citation sai, lỗi provider, AI muộn sau tin khách mới và công thức chấm benchmark. Bổ sung kiểm tra citation đúng không vượt được kết quả kiểm định từ chối, schema kiểm định sai, đáp án phủ định có nguồn, lỗi model trong bước kiểm định giữ tin khách và nguồn không được trích dẫn bị đổi trước khi lưu AI. Đợt trích xuất bổ sung kiểm tra giữ nguyên số/chấm phẩy, từ chối ID sai hoặc trùng và phản hồi Ollama bị cắt/rỗng. Kiểm thử mới xác nhận schema ràng buộc đúng ID theo hai nguồn có số câu khác nhau và backend vẫn chặn cặp ID chéo nguồn không hợp lệ.</w:t>
+        <w:t>Lệnh python -m unittest discover -s app/tests -v chạy đạt 49 kiểm thử; các kiểm thử DB dùng dữ liệu tách biệt. Các nhóm kiểm tra bao gồm mật khẩu/cookie, phiên hết hạn và tài khoản vô hiệu, quyền admin/agent và CSRF, giới hạn đăng nhập, dữ liệu gửi giả mạo, luồng tin nhắn/handoff, nhận tranh chấp bằng hai luồng, migration giữ dữ liệu, Inbox, nhận diện mã đơn, vector lưu bền, metadata, chống trùng, retry/xóa tài liệu, citation sai, lỗi provider, AI muộn sau tin khách mới và công thức chấm benchmark. Bổ sung kiểm tra citation đúng không vượt được kết quả kiểm định từ chối, schema kiểm định sai, đáp án phủ định có nguồn, lỗi model trong bước kiểm định giữ tin khách và nguồn không được trích dẫn bị đổi trước khi lưu AI. Đợt trích xuất bổ sung kiểm tra giữ nguyên số/chấm phẩy, từ chối ID sai hoặc trùng và phản hồi Ollama bị cắt/rỗng. Kiểm thử mới xác nhận schema ràng buộc đúng ID theo hai nguồn có số câu khác nhau và backend vẫn chặn cặp ID chéo nguồn không hợp lệ.</w:t>
       </w:r>
     </w:p>
     <w:p>
@@ -311,6 +329,12 @@
       </w:r>
     </w:p>
     <w:p>
+      <w:pPr/>
+      <w:r>
+        <w:t>Đợt Inbox/SLA bổ sung ba kiểm thử, tổng 49 unittest và Vite build đạt. Kiểm chứng ranh giới hạn, ưu tiên, loại AI/tin khách/tin trước ticket, tiếp nhận không reset hạn, phản hồi đầu đúng/trễ, đóng chưa trả lời và nhiều ticket. QA trên bản build với DB/vector riêng cùng hai phiên nhân viên và phiên khách xác nhận tự cập nhật người phụ trách/tin mới, giữ lựa chọn/bản nháp, phục hồi sau mất mạng, lọc SLA, hủy phản hồi cũ khi đổi khách, tạm ngừng polling khi mô phỏng tab ẩn, đóng hội thoại và đăng xuất. Giao diện desktop/mobile 390 pixel đã kiểm tra trực quan, gồm hạn phản hồi, ticket và ô soạn; không tràn ngang. Không thay model/prompt/retrieval hoặc đo lại chất lượng RAG trong đợt này.</w:t>
+      </w:r>
+    </w:p>
+    <w:p>
       <w:pPr>
         <w:pStyle w:val="Heading1"/>
       </w:pPr>
@@ -321,7 +345,7 @@
     <w:p>
       <w:pPr/>
       <w:r>
-        <w:t>Mốc hiện tại tạo nền tảng xác thực và chuyển giao có người phụ trách, giúp giữ nhất quán quyền trả lời và trạng thái AI; widget cùng origin đã có phiên khách riêng và nhận phản hồi nhân viên qua polling. RAG local có mô hình thật, lưu bền, bộ 72 câu TXT và 24 câu PDF/DOCX, trích câu nguồn và kiểm định. M3 chưa nghiệm thu: cần người duyệt nhãn/đáp án, nguồn và câu hỏi độc lập; giảm chọn câu thiếu ngữ cảnh và kiểm định sai ở phủ định/nối tiếp hoặc điều kiện thiếu. OCR, sentiment/SLA và LLM tool calling chưa được đánh giá. Tiếp theo hoàn thiện Inbox realtime và SLA cơ bản của M4, Agentic RAG, kênh thứ hai và triển khai.</w:t>
+        <w:t>Mốc hiện tại tạo nền tảng xác thực và chuyển giao có người phụ trách, giúp giữ nhất quán quyền trả lời và trạng thái AI; widget cùng origin đã có phiên khách riêng và nhận phản hồi nhân viên qua polling. RAG local có mô hình thật, lưu bền, bộ 72 câu TXT và 24 câu PDF/DOCX, trích câu nguồn và kiểm định. M3 chưa nghiệm thu: cần người duyệt nhãn/đáp án, nguồn và câu hỏi độc lập; giảm chọn câu thiếu ngữ cảnh và kiểm định sai ở phủ định/nối tiếp hoặc điều kiện thiếu. Inbox đã tự cập nhật bằng polling và có SLA phản hồi đầu tiên. OCR, sentiment, SLA giải quyết và LLM tool calling chưa được đánh giá. Tiếp theo hoàn thiện vòng đời ticket từ Inbox và hồ sơ thiết kế M4, Agentic RAG, kênh thứ hai và triển khai; chưa nghiệm thu toàn bộ M4 hoặc khả năng chịu tải realtime.</w:t>
       </w:r>
     </w:p>
     <w:p>

</xml_diff>

<commit_message>
feat: complete tickets and reopen resolved support requests
</commit_message>
<xml_diff>
--- a/docs/report/BaoCao.docx
+++ b/docs/report/BaoCao.docx
@@ -111,7 +111,7 @@
     <w:p>
       <w:pPr/>
       <w:r>
-        <w:t>Migration phiên bản 1 và 2 bổ sung bảng/cột, metadata nguồn và ID tin khách mới nhất, giữ nội dung cũ và có thể chạy lại. Phiên bản 3 bổ sung bảng phiên widget với hash token, hội thoại duy nhất và thời điểm hết hạn. Các hội thoại đã được gán bằng bản demo nhưng chưa có nhân viên xác thực được đưa về hàng chờ. Chỉ SQLite đã được kiểm chứng; PostgreSQL và migration thay đổi cấu trúc phức tạp chưa nằm trong kết quả của mốc này.</w:t>
+        <w:t>Migration phiên bản 1 và 2 bổ sung bảng/cột, metadata nguồn và ID tin khách mới nhất, giữ nội dung cũ và có thể chạy lại. Phiên bản 3 bổ sung bảng phiên widget với hash token, hội thoại duy nhất và thời điểm hết hạn. Phiên bản 4 thêm thời điểm, người, ghi chú hoàn tất và mốc phản hồi đầu của ticket; chốt phản hồi đã quan sát cho ticket cũ đã kết thúc, không suy đoán thời điểm hoặc người hoàn tất còn thiếu. Các hội thoại đã được gán bằng bản demo nhưng chưa có nhân viên xác thực được đưa về hàng chờ. Chỉ SQLite đã được kiểm chứng; PostgreSQL và migration thay đổi cấu trúc phức tạp chưa nằm trong kết quả của mốc này.</w:t>
       </w:r>
     </w:p>
     <w:p>
@@ -203,7 +203,19 @@
     <w:p>
       <w:pPr/>
       <w:r>
-        <w:t>SLA được tính từ timestamp hiện có, không ghi đồng hồ vào DB hay thêm migration; chính sách cố định cũng áp dụng ticket cũ. Cần lưu deadline và phiên bản chính sách trước khi cho phép sửa quy tắc/ưu tiên. Chưa xử lý giờ làm việc, ngày nghỉ, thời hạn giải quyết, escalation hoặc báo cáo kiểm toán; phần hiện tại chỉ kiểm chứng SLA phản hồi đầu tiên trong local MVP.</w:t>
+        <w:t>SLA của ticket đang hoạt động được tính từ timestamp hiện có, không ghi DB theo đồng hồ mỗi lần polling. Khi ticket kết thúc, lưu mốc phản hồi đầu hoặc null nếu chưa phản hồi; tin nhân viên ở lượt sau không đổi kết quả lượt trước. Chính sách cố định cũng áp dụng ticket cũ. Cần lưu deadline và phiên bản chính sách trước khi cho phép sửa quy tắc/ưu tiên. Chưa xử lý giờ làm việc, ngày nghỉ, thời hạn giải quyết, escalation hoặc báo cáo kiểm toán; phần hiện tại chỉ kiểm chứng SLA phản hồi đầu tiên trong local MVP.</w:t>
+      </w:r>
+    </w:p>
+    <w:p>
+      <w:pPr/>
+      <w:r>
+        <w:t>Inbox cho phép người đang phụ trách giải quyết hoặc đóng hội thoại cùng các ticket đang hoạt động, với ghi chú nội bộ bắt buộc từ 1 đến 2000 ký tự không trắng. Lưu thời điểm và người hoàn tất; widget chỉ nhận thông báo chung. Sau giải quyết, tin khách mới tạo ticket và đưa hội thoại về hàng chờ, bỏ phân công cũ, giữ lịch sử và dừng AI. Nhân viên khác có thể tiếp nhận lượt mới. Sau đóng, khách chỉ xem lịch sử và phải kết thúc phiên rồi bắt đầu phiên mới để nhắn tiếp.</w:t>
+      </w:r>
+    </w:p>
+    <w:p>
+      <w:pPr/>
+      <w:r>
+        <w:t>Thao tác hoàn tất mang ID ticket và ID tin khách cuối đã xem, dùng cùng khóa ghi hội thoại với luồng gửi tin. Nếu tin mới được ghi trước, trả 409 và giữ ghi chú để nhân viên đọc lại; nếu giải quyết được ghi trước, tin mới mở lượt hỗ trợ khác. Retry cùng ticket, trạng thái, người và ghi chú không tạo thông báo trùng hoặc kết thúc lượt mới. Retry UUID tin khách cũ sau giải quyết không mở lại yêu cầu. Quyền hoàn tất áp dụng cả admin: phải là người đang phụ trách.</w:t>
       </w:r>
     </w:p>
     <w:p>
@@ -217,7 +229,7 @@
     <w:p>
       <w:pPr/>
       <w:r>
-        <w:t>Lệnh python -m unittest discover -s app/tests -v chạy đạt 49 kiểm thử; các kiểm thử DB dùng dữ liệu tách biệt. Các nhóm kiểm tra bao gồm mật khẩu/cookie, phiên hết hạn và tài khoản vô hiệu, quyền admin/agent và CSRF, giới hạn đăng nhập, dữ liệu gửi giả mạo, luồng tin nhắn/handoff, nhận tranh chấp bằng hai luồng, migration giữ dữ liệu, Inbox, nhận diện mã đơn, vector lưu bền, metadata, chống trùng, retry/xóa tài liệu, citation sai, lỗi provider, AI muộn sau tin khách mới và công thức chấm benchmark. Bổ sung kiểm tra citation đúng không vượt được kết quả kiểm định từ chối, schema kiểm định sai, đáp án phủ định có nguồn, lỗi model trong bước kiểm định giữ tin khách và nguồn không được trích dẫn bị đổi trước khi lưu AI. Đợt trích xuất bổ sung kiểm tra giữ nguyên số/chấm phẩy, từ chối ID sai hoặc trùng và phản hồi Ollama bị cắt/rỗng. Kiểm thử mới xác nhận schema ràng buộc đúng ID theo hai nguồn có số câu khác nhau và backend vẫn chặn cặp ID chéo nguồn không hợp lệ.</w:t>
+        <w:t>Lệnh python -m unittest discover -s app/tests -v chạy đạt 53 kiểm thử; các kiểm thử DB dùng dữ liệu tách biệt. Các nhóm kiểm tra bao gồm mật khẩu/cookie, phiên hết hạn và tài khoản vô hiệu, quyền admin/agent và CSRF, giới hạn đăng nhập, dữ liệu gửi giả mạo, luồng tin nhắn/handoff, nhận tranh chấp bằng hai luồng, migration giữ dữ liệu, Inbox, nhận diện mã đơn, vector lưu bền, metadata, chống trùng, retry/xóa tài liệu, citation sai, lỗi provider, AI muộn sau tin khách mới và công thức chấm benchmark. Bổ sung kiểm tra citation đúng không vượt được kết quả kiểm định từ chối, schema kiểm định sai, đáp án phủ định có nguồn, lỗi model trong bước kiểm định giữ tin khách và nguồn không được trích dẫn bị đổi trước khi lưu AI. Đợt trích xuất bổ sung kiểm tra giữ nguyên số/chấm phẩy, từ chối ID sai hoặc trùng và phản hồi Ollama bị cắt/rỗng. Kiểm thử mới xác nhận schema ràng buộc đúng ID theo hai nguồn có số câu khác nhau và backend vẫn chặn cặp ID chéo nguồn không hợp lệ.</w:t>
       </w:r>
     </w:p>
     <w:p>
@@ -335,6 +347,12 @@
       </w:r>
     </w:p>
     <w:p>
+      <w:pPr/>
+      <w:r>
+        <w:t>Đợt vòng đời ticket bổ sung bốn kiểm thử, tổng 53 unittest và Vite build đạt. Kiểm thử bao phủ quyền người phụ trách, payload không hợp lệ, retry, tranh chấp tin khách và AI đang chờ, migration chạy lại cùng SLA lịch sử. QA Edge trên bản build, DB/vector riêng và hai nhân viên xác nhận hủy xác nhận, xung đột tin mới giữ ghi chú, giải quyết và tải lại, khách nhắn tiếp rồi nhân viên khác tiếp nhận, đóng và bắt đầu phiên mới. Ghi chú nội bộ không xuất hiện trong widget; SLA ticket kết thúc chưa phản hồi giữ trạng thái riêng dù lượt sau được trả lời. Đã kiểm tra trực quan desktop/mobile 390 pixel, không tràn ngang. Model/prompt/retrieval giữ nguyên, không chạy lại benchmark RAG.</w:t>
+      </w:r>
+    </w:p>
+    <w:p>
       <w:pPr>
         <w:pStyle w:val="Heading1"/>
       </w:pPr>
@@ -345,7 +363,7 @@
     <w:p>
       <w:pPr/>
       <w:r>
-        <w:t>Mốc hiện tại tạo nền tảng xác thực và chuyển giao có người phụ trách, giúp giữ nhất quán quyền trả lời và trạng thái AI; widget cùng origin đã có phiên khách riêng và nhận phản hồi nhân viên qua polling. RAG local có mô hình thật, lưu bền, bộ 72 câu TXT và 24 câu PDF/DOCX, trích câu nguồn và kiểm định. M3 chưa nghiệm thu: cần người duyệt nhãn/đáp án, nguồn và câu hỏi độc lập; giảm chọn câu thiếu ngữ cảnh và kiểm định sai ở phủ định/nối tiếp hoặc điều kiện thiếu. Inbox đã tự cập nhật bằng polling và có SLA phản hồi đầu tiên. OCR, sentiment, SLA giải quyết và LLM tool calling chưa được đánh giá. Tiếp theo hoàn thiện vòng đời ticket từ Inbox và hồ sơ thiết kế M4, Agentic RAG, kênh thứ hai và triển khai; chưa nghiệm thu toàn bộ M4 hoặc khả năng chịu tải realtime.</w:t>
+        <w:t>Mốc hiện tại tạo nền tảng xác thực và chuyển giao có người phụ trách, giúp giữ nhất quán quyền trả lời và trạng thái AI; widget cùng origin đã có phiên khách riêng và nhận phản hồi nhân viên qua polling. RAG local có mô hình thật, lưu bền, bộ 72 câu TXT và 24 câu PDF/DOCX, trích câu nguồn và kiểm định. M3 chưa nghiệm thu: cần người duyệt nhãn/đáp án, nguồn và câu hỏi độc lập; giảm chọn câu thiếu ngữ cảnh và kiểm định sai ở phủ định/nối tiếp hoặc điều kiện thiếu. Inbox đã tự cập nhật bằng polling và có SLA phản hồi đầu tiên. OCR, sentiment, SLA giải quyết và LLM tool calling chưa được đánh giá. Vòng đời giải quyết/đóng và tiếp nhận lại từ Inbox đã kiểm chứng. Tiếp theo hoàn thiện hồ sơ thiết kế và kiểm thử toàn luồng M4, Agentic RAG, kênh thứ hai và triển khai; chưa nghiệm thu toàn bộ M4 hoặc khả năng chịu tải realtime.</w:t>
       </w:r>
     </w:p>
     <w:p>

</xml_diff>

<commit_message>
docs: add M4 design and end-to-end acceptance evidence
</commit_message>
<xml_diff>
--- a/docs/report/BaoCao.docx
+++ b/docs/report/BaoCao.docx
@@ -13,7 +13,7 @@
     <w:p>
       <w:pPr/>
       <w:r>
-        <w:t>Báo cáo tiến độ ngày 14 tháng 9 năm 2026</w:t>
+        <w:t>Báo cáo tiến độ ngày 15 tháng 9 năm 2026</w:t>
       </w:r>
     </w:p>
     <w:p>
@@ -112,6 +112,12 @@
       <w:pPr/>
       <w:r>
         <w:t>Migration phiên bản 1 và 2 bổ sung bảng/cột, metadata nguồn và ID tin khách mới nhất, giữ nội dung cũ và có thể chạy lại. Phiên bản 3 bổ sung bảng phiên widget với hash token, hội thoại duy nhất và thời điểm hết hạn. Phiên bản 4 thêm thời điểm, người, ghi chú hoàn tất và mốc phản hồi đầu của ticket; chốt phản hồi đã quan sát cho ticket cũ đã kết thúc, không suy đoán thời điểm hoặc người hoàn tất còn thiếu. Các hội thoại đã được gán bằng bản demo nhưng chưa có nhân viên xác thực được đưa về hàng chờ. Chỉ SQLite đã được kiểm chứng; PostgreSQL và migration thay đổi cấu trúc phức tạp chưa nằm trong kết quả của mốc này.</w:t>
+      </w:r>
+    </w:p>
+    <w:p>
+      <w:pPr/>
+      <w:r>
+        <w:t>Hồ sơ thiết kế đối chiếu ngày 15/09/2026 nằm trong docs/DESIGN.md, gồm BFD, luồng nghiệp vụ phân làn, Use Case, ERD, trạng thái hội thoại và hai Sequence cho RAG/chống AI muộn cùng hoàn tất/tiếp nhận lại. Sơ đồ Mermaid phản ánh mã hiện có; luồng phân làn chưa phải file BPMN 2.0. ERD phân biệt quan hệ khai báo với cưỡng chế thực tế: SQLite chưa bật kiểm tra khóa ngoại, con trỏ tin cuối không có FK, chống UUID trùng dùng khóa ghi hội thoại. docs/API.md đối chiếu 31 cặp method/path với OpenAPI, bổ sung quyền, payload, lỗi, retry và SLA chưa được schema mô tả đầy đủ. Ma trận UC và kiểm thử ở docs/M4_ACCEPTANCE.md phục vụ duyệt sau.</w:t>
       </w:r>
     </w:p>
     <w:p>
@@ -353,8 +359,15 @@
       </w:r>
     </w:p>
     <w:p>
+      <w:pPr/>
+      <w:r>
+        <w:t>Ngày 15/09/2026 bổ sung lệnh python -m app.tests.smoke_m4 gọi API qua TestClient với Ollama thật, đăng nhập bằng mật khẩu ngẫu nhiên và tải tài liệu qua API. DB/vector/tài liệu nằm trong thư mục tạm, migration/lifespan chạy thật; không sửa tài khoản hoặc dữ liệu người dùng. Lượt hoàn tất kiểm tra câu trả lời/trích dẫn sau mở lại vector, UUID, cách ly khách, handoff, phản hồi nhân viên, giải quyết, tin tiếp theo, SLA lịch sử, riêng tư ghi chú, đóng/phiên mới và logout. Một câu hỏi chính sách mất 16,217 giây; toàn luồng 28,088 giây. 53 unittest đạt trong 25,597 giây, Vite build đạt và assets giữ nguyên. Đây là smoke HTTP nội bộ, không đo proxy/trình duyệt, tải hoặc chất lượng ngữ nghĩa; QA giao diện dùng bằng chứng ngày 14/09, model/prompt/retrieval và benchmark không đổi.</w:t>
+      </w:r>
+    </w:p>
+    <w:p>
       <w:pPr>
         <w:pStyle w:val="Heading1"/>
+        <w:pageBreakBefore/>
       </w:pPr>
       <w:r>
         <w:t>Chương 7 Kết luận và đề xuất</w:t>
@@ -363,13 +376,13 @@
     <w:p>
       <w:pPr/>
       <w:r>
-        <w:t>Mốc hiện tại tạo nền tảng xác thực và chuyển giao có người phụ trách, giúp giữ nhất quán quyền trả lời và trạng thái AI; widget cùng origin đã có phiên khách riêng và nhận phản hồi nhân viên qua polling. RAG local có mô hình thật, lưu bền, bộ 72 câu TXT và 24 câu PDF/DOCX, trích câu nguồn và kiểm định. M3 chưa nghiệm thu: cần người duyệt nhãn/đáp án, nguồn và câu hỏi độc lập; giảm chọn câu thiếu ngữ cảnh và kiểm định sai ở phủ định/nối tiếp hoặc điều kiện thiếu. Inbox đã tự cập nhật bằng polling và có SLA phản hồi đầu tiên. OCR, sentiment, SLA giải quyết và LLM tool calling chưa được đánh giá. Vòng đời giải quyết/đóng và tiếp nhận lại từ Inbox đã kiểm chứng. Tiếp theo hoàn thiện hồ sơ thiết kế và kiểm thử toàn luồng M4, Agentic RAG, kênh thứ hai và triển khai; chưa nghiệm thu toàn bộ M4 hoặc khả năng chịu tải realtime.</w:t>
+        <w:t>Mốc hiện tại tạo nền tảng xác thực và chuyển giao có người phụ trách, giúp giữ nhất quán quyền trả lời và trạng thái AI; widget cùng origin đã có phiên khách riêng và nhận phản hồi nhân viên qua polling. RAG local có mô hình thật, lưu bền, bộ 72 câu TXT và 24 câu PDF/DOCX, trích câu nguồn và kiểm định. M3 chưa nghiệm thu: cần người duyệt nhãn/đáp án, nguồn và câu hỏi độc lập; giảm chọn câu thiếu ngữ cảnh và kiểm định sai ở phủ định/nối tiếp hoặc điều kiện thiếu. Inbox đã tự cập nhật bằng polling và có SLA phản hồi đầu tiên. OCR, sentiment, SLA giải quyết và LLM tool calling chưa được đánh giá. Vòng đời giải quyết/đóng và tiếp nhận lại từ Inbox đã kiểm chứng. Hồ sơ thiết kế và smoke toàn luồng M4 đã bổ sung. Tiếp theo Agentic RAG, kênh thứ hai và triển khai; chưa nghiệm thu toàn bộ M4 hoặc khả năng chịu tải realtime.</w:t>
       </w:r>
     </w:p>
     <w:p>
       <w:pPr/>
       <w:r>
-        <w:t>Hồ sơ cần tiếp tục bổ sung thông tin thành viên, sơ đồ nghiệp vụ/ERD/sequence, nguồn tham khảo học thuật và kết quả đo thực tế. DeCuong.md giữ kế hoạch nghiên cứu; docs/TASKS.md và ROADMAP.md theo dõi phạm vi và bằng chứng hoàn thành.</w:t>
+        <w:t>Hồ sơ kỹ thuật đã có sơ đồ nghiệp vụ/ERD/Sequence, Use Case, API và ma trận kiểm chứng bám mã nguồn, chờ người dùng/GVHD duyệt. Cần bổ sung thông tin thành viên, nguồn tham khảo học thuật, BPMN chuẩn nếu biểu mẫu yêu cầu và kết quả đo tải/triển khai thực tế. Người dùng cho phép tiếp tục các việc độc lập trong lúc bận; việc này không thay người duyệt nhãn/đáp án M3. DeCuong.md giữ kế hoạch nghiên cứu; docs/TASKS.md và ROADMAP.md theo dõi phạm vi và bằng chứng hoàn thành.</w:t>
       </w:r>
     </w:p>
     <w:sectPr>

</xml_diff>

<commit_message>
feat: select scoped order tools with local model
</commit_message>
<xml_diff>
--- a/docs/report/BaoCao.docx
+++ b/docs/report/BaoCao.docx
@@ -111,7 +111,7 @@
     <w:p>
       <w:pPr/>
       <w:r>
-        <w:t>Migration phiên bản 1 và 2 bổ sung bảng/cột, metadata nguồn và ID tin khách mới nhất, giữ nội dung cũ và có thể chạy lại. Phiên bản 3 bổ sung bảng phiên widget với hash token, hội thoại duy nhất và thời điểm hết hạn. Phiên bản 4 thêm thời điểm, người, ghi chú hoàn tất và mốc phản hồi đầu của ticket; chốt phản hồi đã quan sát cho ticket cũ đã kết thúc, không suy đoán thời điểm hoặc người hoàn tất còn thiếu. Các hội thoại đã được gán bằng bản demo nhưng chưa có nhân viên xác thực được đưa về hàng chờ. Chỉ SQLite đã được kiểm chứng; PostgreSQL và migration thay đổi cấu trúc phức tạp chưa nằm trong kết quả của mốc này.</w:t>
+        <w:t>Migration phiên bản 1 và 2 bổ sung bảng/cột, metadata nguồn và ID tin khách mới nhất, giữ nội dung cũ và có thể chạy lại. Phiên bản 3 bổ sung bảng phiên widget với hash token, hội thoại duy nhất và thời điểm hết hạn. Phiên bản 4 thêm thời điểm, người, ghi chú hoàn tất và mốc phản hồi đầu của ticket; chốt phản hồi đã quan sát cho ticket cũ đã kết thúc, không suy đoán thời điểm hoặc người hoàn tất còn thiếu. Phiên bản 5 thêm JSON tool_trace vào tin nhắn để lưu lựa chọn và kết quả tool nội bộ; dữ liệu cũ giữ null, chạy lại giữ trace đã có. Các hội thoại đã được gán bằng bản demo nhưng chưa có nhân viên xác thực được đưa về hàng chờ. Chỉ SQLite đã được kiểm chứng; PostgreSQL và migration thay đổi cấu trúc phức tạp chưa nằm trong kết quả của mốc này.</w:t>
       </w:r>
     </w:p>
     <w:p>
@@ -225,6 +225,18 @@
       </w:r>
     </w:p>
     <w:p>
+      <w:pPr/>
+      <w:r>
+        <w:t>Mốc con M5 thêm bộ chọn công cụ cho hội thoại đang mở có đúng một mã đơn DH/ORD. Model chọn lookup_order, handoff hoặc rag bằng JSON Schema; backend xác thực tên và tham số, không nhận danh tính hoặc URL từ model. Tin được commit trước gọi model; trước thực thi, khóa lại hội thoại và kiểm tra trạng thái/tin khách cuối. Chủ đơn lấy từ DB tại lúc tra cứu. Backend dựng câu trả lời trạng thái theo mẫu, không nhờ model viết lại dữ liệu đơn. Không thấy đơn thuộc khách hoặc yêu cầu hủy thì chuyển nhân viên, không sửa đơn. Nhiều mã yêu cầu chọn một mã; không có mã giữ RAG hiện tại. Quy tắc gặp nhân viên vẫn ưu tiên trước model.</w:t>
+      </w:r>
+    </w:p>
+    <w:p>
+      <w:pPr/>
+      <w:r>
+        <w:t>Trace nội bộ ghi pending, clarification, executed, rag, provider_error hoặc skipped và kết quả kiểm tra khi có; chỉ API staff nhận, widget không thấy. Lỗi provider giữ tin, lỗi SQL trả 503 và ghi log theo message_id, trace có thể còn pending. UUID cũ không gọi lại tool. Phiên khách ẩn danh chưa xác minh chủ đơn, tên tự nhập không cấp quyền. Chưa hỗ trợ suy đơn từ lịch sử hoặc agent nhiều bước; chi tiết tại docs/M5_TOOLS.md.</w:t>
+      </w:r>
+    </w:p>
+    <w:p>
       <w:pPr>
         <w:pStyle w:val="Heading1"/>
       </w:pPr>
@@ -235,7 +247,7 @@
     <w:p>
       <w:pPr/>
       <w:r>
-        <w:t>Lệnh python -m unittest discover -s app/tests -v chạy đạt 53 kiểm thử; các kiểm thử DB dùng dữ liệu tách biệt. Các nhóm kiểm tra bao gồm mật khẩu/cookie, phiên hết hạn và tài khoản vô hiệu, quyền admin/agent và CSRF, giới hạn đăng nhập, dữ liệu gửi giả mạo, luồng tin nhắn/handoff, nhận tranh chấp bằng hai luồng, migration giữ dữ liệu, Inbox, nhận diện mã đơn, vector lưu bền, metadata, chống trùng, retry/xóa tài liệu, citation sai, lỗi provider, AI muộn sau tin khách mới và công thức chấm benchmark. Bổ sung kiểm tra citation đúng không vượt được kết quả kiểm định từ chối, schema kiểm định sai, đáp án phủ định có nguồn, lỗi model trong bước kiểm định giữ tin khách và nguồn không được trích dẫn bị đổi trước khi lưu AI. Đợt trích xuất bổ sung kiểm tra giữ nguyên số/chấm phẩy, từ chối ID sai hoặc trùng và phản hồi Ollama bị cắt/rỗng. Kiểm thử mới xác nhận schema ràng buộc đúng ID theo hai nguồn có số câu khác nhau và backend vẫn chặn cặp ID chéo nguồn không hợp lệ.</w:t>
+        <w:t>Lệnh python -m unittest discover -s app/tests -v chạy đạt 59 kiểm thử; các kiểm thử DB dùng dữ liệu tách biệt. Các nhóm kiểm tra bao gồm mật khẩu/cookie, phiên hết hạn và tài khoản vô hiệu, quyền admin/agent và CSRF, giới hạn đăng nhập, dữ liệu gửi giả mạo, luồng tin nhắn/handoff, nhận tranh chấp bằng hai luồng, migration giữ dữ liệu, Inbox, nhận diện mã đơn, vector lưu bền, metadata, chống trùng, retry/xóa tài liệu, citation sai, lỗi provider, AI muộn sau tin khách mới và công thức chấm benchmark. Bổ sung kiểm tra citation đúng không vượt được kết quả kiểm định từ chối, schema kiểm định sai, đáp án phủ định có nguồn, lỗi model trong bước kiểm định giữ tin khách và nguồn không được trích dẫn bị đổi trước khi lưu AI. Đợt trích xuất bổ sung kiểm tra giữ nguyên số/chấm phẩy, từ chối ID sai hoặc trùng và phản hồi Ollama bị cắt/rỗng. Kiểm thử mới xác nhận schema ràng buộc đúng ID theo hai nguồn có số câu khác nhau và backend vẫn chặn cặp ID chéo nguồn không hợp lệ.</w:t>
       </w:r>
     </w:p>
     <w:p>
@@ -365,6 +377,24 @@
       </w:r>
     </w:p>
     <w:p>
+      <w:pPr/>
+      <w:r>
+        <w:t>Đợt chọn tool M5 bổ sung sáu kiểm thử, tổng 59 unittest đạt trong 25,225 giây; Vite build đạt, assets không đổi. Kiểm thử bao phủ schema và giả mạo tham số, đơn khác chủ/không có đơn, giữ tin khi provider/DB lỗi, trace riêng tư, UUID, RAG và tranh chấp tin mới/handoff/đóng/đổi chủ đơn. Pilot native tools có ba ca hết 700 token ở hủy đơn, giả mạo và chính sách; kiểm tra thô cho thấy model viết suy luận dài dù think=false. Bản chọn dùng JSON Schema qua transport sẵn có, không dùng native tool_calls và không tăng giới hạn sinh.</w:t>
+      </w:r>
+    </w:p>
+    <w:p>
+      <w:pPr/>
+      <w:r>
+        <w:t>Smoke schema với qwen3:4b đạt 7/7 ca phát triển trên DB/vector tạm: đơn hợp lệ, khác chủ, không tồn tại, hủy, giả mạo, chính sách có mã và nhiều mã. Năm ca có thực thi tool mất 5,394 đến 5,770 giây mỗi ca; chính sách qua bộ chọn rồi RAG mất 20,689 giây, nhiều mã không gọi model mất 0,020 giây. Không lỗi provider trong lượt hoàn tất; lần chạy trước khi Ollama khởi động dừng ở ingestion, không có câu hỏi hoàn tất. Đây là smoke tuần tự nhỏ, không phải benchmark độc lập, tỷ lệ đúng ngữ nghĩa hoặc đo tải. Pipeline trích câu/kiểm định/retrieval giữ nguyên, orchestration tin có mã đơn được kiểm tra riêng; chưa công bố điểm M3 đo lại trên bản M5.</w:t>
+      </w:r>
+    </w:p>
+    <w:p>
+      <w:pPr/>
+      <w:r>
+        <w:t>Smoke HTTP toàn luồng M4 cũng được chạy lại sau migration v5 và thay orchestration: đăng nhập, upload, trả lời có nguồn, handoff, giải quyết, nhắn tiếp, đóng/phiên mới và logout đạt. Câu hỏi mất 15,175 giây, toàn luồng 22,249 giây; chỉ kiểm chứng hồi quy chức năng, không suy chênh lệch một lần chạy thành tăng tốc.</w:t>
+      </w:r>
+    </w:p>
+    <w:p>
       <w:pPr>
         <w:pStyle w:val="Heading1"/>
         <w:pageBreakBefore/>
@@ -376,7 +406,7 @@
     <w:p>
       <w:pPr/>
       <w:r>
-        <w:t>Mốc hiện tại tạo nền tảng xác thực và chuyển giao có người phụ trách, giúp giữ nhất quán quyền trả lời và trạng thái AI; widget cùng origin đã có phiên khách riêng và nhận phản hồi nhân viên qua polling. RAG local có mô hình thật, lưu bền, bộ 72 câu TXT và 24 câu PDF/DOCX, trích câu nguồn và kiểm định. M3 chưa nghiệm thu: cần người duyệt nhãn/đáp án, nguồn và câu hỏi độc lập; giảm chọn câu thiếu ngữ cảnh và kiểm định sai ở phủ định/nối tiếp hoặc điều kiện thiếu. Inbox đã tự cập nhật bằng polling và có SLA phản hồi đầu tiên. OCR, sentiment, SLA giải quyết và LLM tool calling chưa được đánh giá. Vòng đời giải quyết/đóng và tiếp nhận lại từ Inbox đã kiểm chứng. Hồ sơ thiết kế và smoke toàn luồng M4 đã bổ sung. Tiếp theo Agentic RAG, kênh thứ hai và triển khai; chưa nghiệm thu toàn bộ M4 hoặc khả năng chịu tải realtime.</w:t>
+        <w:t>Mốc hiện tại tạo nền tảng xác thực và chuyển giao có người phụ trách, giúp giữ nhất quán quyền trả lời và trạng thái AI; widget cùng origin đã có phiên khách riêng và nhận phản hồi nhân viên qua polling. RAG local có mô hình thật, lưu bền, bộ 72 câu TXT và 24 câu PDF/DOCX, trích câu nguồn và kiểm định. M3 chưa nghiệm thu: cần người duyệt nhãn/đáp án, nguồn và câu hỏi độc lập; giảm chọn câu thiếu ngữ cảnh và kiểm định sai ở phủ định/nối tiếp hoặc điều kiện thiếu. Inbox đã tự cập nhật bằng polling và có SLA phản hồi đầu tiên. OCR, chất lượng sentiment/tóm tắt và SLA giải quyết chưa được đánh giá. Bộ chọn tool bằng schema đã qua smoke nhỏ; chưa nghiệm thu agent nhiều bước hoặc toàn bộ M5. Vòng đời giải quyết/đóng và tiếp nhận lại từ Inbox đã kiểm chứng. Hồ sơ thiết kế và smoke toàn luồng M4 đã bổ sung. Tiếp theo mở rộng kiểm chứng M5, xác minh khách cho tra đơn, kênh thứ hai và triển khai; chưa nghiệm thu toàn bộ M4 hoặc khả năng chịu tải realtime.</w:t>
       </w:r>
     </w:p>
     <w:p>

</xml_diff>

<commit_message>
feat: add workspace management and analytics pages
</commit_message>
<xml_diff>
--- a/docs/report/BaoCao.docx
+++ b/docs/report/BaoCao.docx
@@ -13,7 +13,7 @@
     <w:p>
       <w:pPr/>
       <w:r>
-        <w:t>Báo cáo tiến độ ngày 15 tháng 9 năm 2026</w:t>
+        <w:t>Báo cáo tiến độ ngày 18 tháng 9 năm 2026</w:t>
       </w:r>
     </w:p>
     <w:p>
@@ -117,7 +117,7 @@
     <w:p>
       <w:pPr/>
       <w:r>
-        <w:t>Hồ sơ thiết kế đối chiếu ngày 15/09/2026 nằm trong docs/DESIGN.md, gồm BFD, luồng nghiệp vụ phân làn, Use Case, ERD, trạng thái hội thoại và hai Sequence cho RAG/chống AI muộn cùng hoàn tất/tiếp nhận lại. Sơ đồ Mermaid phản ánh mã hiện có; luồng phân làn chưa phải file BPMN 2.0. ERD phân biệt quan hệ khai báo với cưỡng chế thực tế: SQLite chưa bật kiểm tra khóa ngoại, con trỏ tin cuối không có FK, chống UUID trùng dùng khóa ghi hội thoại. docs/API.md đối chiếu 31 cặp method/path với OpenAPI, bổ sung quyền, payload, lỗi, retry và SLA chưa được schema mô tả đầy đủ. Ma trận UC và kiểm thử ở docs/M4_ACCEPTANCE.md phục vụ duyệt sau.</w:t>
+        <w:t>Hồ sơ thiết kế đối chiếu ngày 18/09/2026 nằm trong docs/DESIGN.md, gồm BFD, luồng nghiệp vụ phân làn, Use Case, ERD, trạng thái hội thoại và hai Sequence cho RAG/chống AI muộn cùng hoàn tất/tiếp nhận lại. Sơ đồ Mermaid phản ánh mã hiện có; luồng phân làn chưa phải file BPMN 2.0. ERD phân biệt quan hệ khai báo với cưỡng chế thực tế: SQLite chưa bật kiểm tra khóa ngoại, con trỏ tin cuối không có FK, chống UUID trùng dùng khóa ghi hội thoại. docs/API.md đối chiếu 42 cặp method/path với OpenAPI, bổ sung quyền, payload, lỗi, retry và SLA chưa được schema mô tả đầy đủ. Ma trận UC và kiểm thử ở docs/M4_ACCEPTANCE.md phục vụ duyệt sau.</w:t>
       </w:r>
     </w:p>
     <w:p>
@@ -247,7 +247,7 @@
     <w:p>
       <w:pPr/>
       <w:r>
-        <w:t>Lệnh python -m unittest discover -s app/tests -v chạy đạt 59 kiểm thử; các kiểm thử DB dùng dữ liệu tách biệt. Các nhóm kiểm tra bao gồm mật khẩu/cookie, phiên hết hạn và tài khoản vô hiệu, quyền admin/agent và CSRF, giới hạn đăng nhập, dữ liệu gửi giả mạo, luồng tin nhắn/handoff, nhận tranh chấp bằng hai luồng, migration giữ dữ liệu, Inbox, nhận diện mã đơn, vector lưu bền, metadata, chống trùng, retry/xóa tài liệu, citation sai, lỗi provider, AI muộn sau tin khách mới và công thức chấm benchmark. Bổ sung kiểm tra citation đúng không vượt được kết quả kiểm định từ chối, schema kiểm định sai, đáp án phủ định có nguồn, lỗi model trong bước kiểm định giữ tin khách và nguồn không được trích dẫn bị đổi trước khi lưu AI. Đợt trích xuất bổ sung kiểm tra giữ nguyên số/chấm phẩy, từ chối ID sai hoặc trùng và phản hồi Ollama bị cắt/rỗng. Kiểm thử mới xác nhận schema ràng buộc đúng ID theo hai nguồn có số câu khác nhau và backend vẫn chặn cặp ID chéo nguồn không hợp lệ.</w:t>
+        <w:t>Lệnh python -m unittest discover -s app/tests -v chạy đạt 66 kiểm thử; các kiểm thử DB dùng dữ liệu tách biệt. Các nhóm kiểm tra bao gồm mật khẩu/cookie, phiên hết hạn và tài khoản vô hiệu, quyền admin/agent và CSRF, giới hạn đăng nhập, dữ liệu gửi giả mạo, luồng tin nhắn/handoff, nhận tranh chấp bằng hai luồng, migration giữ dữ liệu, Inbox, nhận diện mã đơn, vector lưu bền, metadata, chống trùng, retry/xóa tài liệu, citation sai, lỗi provider, AI muộn sau tin khách mới và công thức chấm benchmark. Bổ sung kiểm tra citation đúng không vượt được kết quả kiểm định từ chối, schema kiểm định sai, đáp án phủ định có nguồn, lỗi model trong bước kiểm định giữ tin khách và nguồn không được trích dẫn bị đổi trước khi lưu AI. Đợt trích xuất bổ sung kiểm tra giữ nguyên số/chấm phẩy, từ chối ID sai hoặc trùng và phản hồi Ollama bị cắt/rỗng. Kiểm thử mới xác nhận schema ràng buộc đúng ID theo hai nguồn có số câu khác nhau và backend vẫn chặn cặp ID chéo nguồn không hợp lệ.</w:t>
       </w:r>
     </w:p>
     <w:p>
@@ -392,6 +392,18 @@
       <w:pPr/>
       <w:r>
         <w:t>Smoke HTTP toàn luồng M4 cũng được chạy lại sau migration v5 và thay orchestration: đăng nhập, upload, trả lời có nguồn, handoff, giải quyết, nhắn tiếp, đóng/phiên mới và logout đạt. Câu hỏi mất 15,175 giây, toàn luồng 22,249 giây; chỉ kiểm chứng hồi quy chức năng, không suy chênh lệch một lần chạy thành tăng tốc.</w:t>
+      </w:r>
+    </w:p>
+    <w:p>
+      <w:pPr/>
+      <w:r>
+        <w:t>Ngày 18/09/2026 hoàn thiện năm trang Tổng quan, Khách hàng, Đơn hàng, Phân tích và Cài đặt theo mockup: sidebar xanh đậm, nền sáng, bảng và khung chi tiết. Các trang dùng dữ liệu thật qua 11 endpoint mới, tổng hợp đồng 42 cặp method/path. Khách/đơn có tìm kiếm và phân trang; admin tạo/sửa có đối chiếu giá trị cũ, không đổi chủ đơn. Nhân viên xem hồ sơ, mở lịch sử hội thoại và đơn theo khách. Cài đặt cho admin cấp tài khoản; tự đổi mật khẩu yêu cầu mật khẩu hiện tại và thu hồi mọi phiên của người đổi. Đăng nhập kiểm tra lại hash dưới khóa ghi để chặn cấp phiên bằng mật khẩu cũ sau lúc đổi. Không thay schema DB hoặc pipeline RAG.</w:t>
+      </w:r>
+    </w:p>
+    <w:p>
+      <w:pPr/>
+      <w:r>
+        <w:t>Phân tích theo 7/30/90 ngày UTC, tách tổng toàn bộ với dữ liệu tạo trong kỳ. SLA dùng ticket tạo trong kỳ, tỷ lệ đúng hạn chỉ tính ticket có phản hồi nhân viên; chưa có mẫu trả null. 66 unittest đạt trong 23,627 giây, Vite build đạt. QA trình duyệt trên DB/vector riêng xác nhận tìm kiếm/phân trang, tạo/sửa khách và đơn, mở đúng hội thoại, đổi kỳ báo cáo, tạo agent/đăng nhập/phân quyền và đổi mật khẩu rồi đăng nhập lại. Desktop/mobile 390 pixel không tràn ngang toàn trang; bảng cuộn trong khung, chi tiết nhận focus. Đơn vẫn mô phỏng, chưa tích hợp thanh toán/vận chuyển; SLA cố định, kênh thứ hai chưa kết nối, chưa có audit quản trị hoặc đo tải lớn. Các giới hạn và công thức được ghi tại docs/WORKSPACE.md.</w:t>
       </w:r>
     </w:p>
     <w:p>

</xml_diff>

<commit_message>
docs: sync project reports and support operation guides
</commit_message>
<xml_diff>
--- a/docs/report/BaoCao.docx
+++ b/docs/report/BaoCao.docx
@@ -13,7 +13,7 @@
     <w:p>
       <w:pPr/>
       <w:r>
-        <w:t>Báo cáo tiến độ ngày 18 tháng 9 năm 2026</w:t>
+        <w:t>Báo cáo tiến độ ngày 3 tháng 10 năm 2026</w:t>
       </w:r>
     </w:p>
     <w:p>
@@ -39,7 +39,7 @@
     <w:p>
       <w:pPr/>
       <w:r>
-        <w:t>Phạm vi gồm Website Chat Widget và một kênh xã hội thật, Knowledge Base PDF/DOCX, hội thoại và ticket/SLA, trả lời có nguồn, tra cứu đơn hàng giả lập và handoff. Telegram là kênh thứ hai được đề xuất, chưa tích hợp. Mục tiêu chất lượng là giảm trả lời thiếu căn cứ và từ chối khi thiếu bằng chứng; chưa khẳng định không có hallucination.</w:t>
+        <w:t>Phạm vi gồm Website Chat Widget và một kênh xã hội thật, Knowledge Base PDF/DOCX, hội thoại và ticket/SLA, trả lời có nguồn, tra cứu đơn hàng giả lập và handoff. Telegram đã có adapter polling và kiểm thử local, còn chờ kiểm chứng bằng bot thật để nghiệm thu kênh thứ hai. Mục tiêu chất lượng là giảm trả lời thiếu căn cứ và từ chối khi thiếu bằng chứng; chưa khẳng định không có hallucination.</w:t>
       </w:r>
     </w:p>
     <w:p>
@@ -93,7 +93,7 @@
     <w:p>
       <w:pPr/>
       <w:r>
-        <w:t>Backend là ứng dụng FastAPI chia module, dùng SQLAlchemy và SQLite; frontend là React/Vite. Các thực thể chính gồm User, AuthSession, WidgetSession, Customer, Conversation, Message, Ticket, Order, KnowledgeDocument và DocumentChunk. Conversation lưu assigned_agent_id; Message lưu agent_id và citations. Các bảng hội thoại và tài liệu tách khỏi Qdrant embedded trên đĩa. Tài liệu có hash chống trùng, phiên bản chỉ mục và model embedding; đoạn nguồn có trang hoặc vị trí dòng/đoạn/bảng.</w:t>
+        <w:t>Backend là ứng dụng FastAPI chia module, dùng SQLAlchemy và SQLite; frontend là React/Vite. Các thực thể chính gồm User, AuthSession, WidgetSession, CustomerAccount, CustomerSession, Customer, Conversation, Message, Ticket, Order, OrderAccess, TelegramCursor, TelegramPeer, TelegramUpdate, TelegramDelivery, KnowledgeDocument và DocumentChunk. Conversation lưu assigned_agent_id; Message lưu agent_id và citations. Các bảng hội thoại và tài liệu tách khỏi Qdrant embedded trên đĩa. Tài liệu có hash chống trùng, phiên bản chỉ mục và model embedding; đoạn nguồn có trang hoặc vị trí dòng/đoạn/bảng.</w:t>
       </w:r>
     </w:p>
     <w:p>
@@ -111,13 +111,13 @@
     <w:p>
       <w:pPr/>
       <w:r>
-        <w:t>Migration phiên bản 1 và 2 bổ sung bảng/cột, metadata nguồn và ID tin khách mới nhất, giữ nội dung cũ và có thể chạy lại. Phiên bản 3 bổ sung bảng phiên widget với hash token, hội thoại duy nhất và thời điểm hết hạn. Phiên bản 4 thêm thời điểm, người, ghi chú hoàn tất và mốc phản hồi đầu của ticket; chốt phản hồi đã quan sát cho ticket cũ đã kết thúc, không suy đoán thời điểm hoặc người hoàn tất còn thiếu. Phiên bản 5 thêm JSON tool_trace vào tin nhắn để lưu lựa chọn và kết quả tool nội bộ; dữ liệu cũ giữ null, chạy lại giữ trace đã có. Các hội thoại đã được gán bằng bản demo nhưng chưa có nhân viên xác thực được đưa về hàng chờ. Chỉ SQLite đã được kiểm chứng; PostgreSQL và migration thay đổi cấu trúc phức tạp chưa nằm trong kết quả của mốc này.</w:t>
+        <w:t>Migration phiên bản 1 và 2 bổ sung bảng/cột, metadata nguồn và ID tin khách mới nhất, giữ nội dung cũ và có thể chạy lại. Phiên bản 3 bổ sung bảng phiên widget với hash token, hội thoại duy nhất và thời điểm hết hạn. Phiên bản 4 thêm thời điểm, người, ghi chú hoàn tất và mốc phản hồi đầu của ticket; chốt phản hồi đã quan sát cho ticket cũ đã kết thúc, không suy đoán thời điểm hoặc người hoàn tất còn thiếu. Phiên bản 5 thêm JSON tool_trace vào tin nhắn để lưu lựa chọn và kết quả tool nội bộ; dữ liệu cũ giữ null, chạy lại giữ trace đã có. Phiên bản 6 thêm OrderAccess lưu quyền tra từng đơn, hash mã truy cập, chủ đơn lúc cấp, người cấp, thời hạn và hội thoại sử dụng; không sửa dữ liệu cũ. Các hội thoại đã được gán bằng bản demo nhưng chưa có nhân viên xác thực được đưa về hàng chờ. Chỉ SQLite đã được kiểm chứng; PostgreSQL và migration thay đổi cấu trúc phức tạp chưa nằm trong kết quả của mốc này.</w:t>
       </w:r>
     </w:p>
     <w:p>
       <w:pPr/>
       <w:r>
-        <w:t>Hồ sơ thiết kế đối chiếu ngày 18/09/2026 nằm trong docs/DESIGN.md, gồm BFD, luồng nghiệp vụ phân làn, Use Case, ERD, trạng thái hội thoại và hai Sequence cho RAG/chống AI muộn cùng hoàn tất/tiếp nhận lại. Sơ đồ Mermaid phản ánh mã hiện có; luồng phân làn chưa phải file BPMN 2.0. ERD phân biệt quan hệ khai báo với cưỡng chế thực tế: SQLite chưa bật kiểm tra khóa ngoại, con trỏ tin cuối không có FK, chống UUID trùng dùng khóa ghi hội thoại. docs/API.md đối chiếu 42 cặp method/path với OpenAPI, bổ sung quyền, payload, lỗi, retry và SLA chưa được schema mô tả đầy đủ. Ma trận UC và kiểm thử ở docs/M4_ACCEPTANCE.md phục vụ duyệt sau.</w:t>
+        <w:t>Hồ sơ thiết kế đối chiếu ngày 21/09/2026 nằm trong docs/DESIGN.md, gồm BFD, luồng nghiệp vụ phân làn, Use Case, ERD, trạng thái hội thoại và hai Sequence cho RAG/chống AI muộn cùng hoàn tất/tiếp nhận lại. Sơ đồ Mermaid phản ánh mã hiện có; luồng phân làn chưa phải file BPMN 2.0. ERD phân biệt quan hệ khai báo với cưỡng chế thực tế: SQLite chưa bật kiểm tra khóa ngoại, con trỏ tin cuối không có FK, chống UUID trùng dùng khóa ghi hội thoại. docs/API.md đối chiếu 47 cặp method/path với OpenAPI, bổ sung quyền, payload, lỗi, retry và SLA chưa được schema mô tả đầy đủ. Ma trận UC và kiểm thử ở docs/M4_ACCEPTANCE.md phục vụ duyệt sau.</w:t>
       </w:r>
     </w:p>
     <w:p>
@@ -233,7 +233,43 @@
     <w:p>
       <w:pPr/>
       <w:r>
-        <w:t>Trace nội bộ ghi pending, clarification, executed, rag, provider_error hoặc skipped và kết quả kiểm tra khi có; chỉ API staff nhận, widget không thấy. Lỗi provider giữ tin, lỗi SQL trả 503 và ghi log theo message_id, trace có thể còn pending. UUID cũ không gọi lại tool. Phiên khách ẩn danh chưa xác minh chủ đơn, tên tự nhập không cấp quyền. Chưa hỗ trợ suy đơn từ lịch sử hoặc agent nhiều bước; chi tiết tại docs/M5_TOOLS.md.</w:t>
+        <w:t>Trace nội bộ ghi pending, clarification, executed, rag, provider_error hoặc skipped và kết quả kiểm tra khi có; nhân viên mở Nhật ký công cụ dưới tin khách trong Inbox để xem, widget không nhận trường này. Mục thu gọn hỗ trợ bàn phím; pending chỉ có nghĩa chưa có kết quả, rag chỉ có nghĩa đã chọn luồng chính sách. Kết quả đã lưu không đại diện trạng thái đơn hiện tại và không có thao tác chạy lại tool tại nhật ký. Lỗi provider giữ tin, lỗi SQL trả 503 và ghi log theo message_id, trace có thể còn pending. UUID cũ không gọi lại tool. Phiên khách ẩn danh chưa xác minh chủ đơn, tên tự nhập không cấp quyền. Chưa hỗ trợ suy đơn từ lịch sử hoặc agent nhiều bước; chi tiết tại docs/M5_TOOLS.md.</w:t>
+      </w:r>
+    </w:p>
+    <w:p>
+      <w:pPr/>
+      <w:r>
+        <w:t>Ngày 21/09/2026 bổ sung cấp quyền tra một đơn cho phiên widget. Admin xác minh người nhận qua kênh tin cậy ngoài hệ thống rồi cấp mã 256 bit, hết hạn sau 15 phút tính từ lúc cấp; DB chỉ lưu SHA-256. Khách nhập mã trong biểu mẫu riêng, không đưa mã vào lịch sử chat hoặc model. Lần nhập thành công gắn quyền vào một phiên, retry cùng phiên được chấp nhận; phiên khác bị chặn. Cấp lại hoặc thu hồi vô hiệu quyền cũ. Kiểm tra chủ đơn và phiên khi thực thi tool, không đổi danh tính khách, không mở các đơn khác cùng chủ và không bật lại AI sau handoff. Chưa có OTP tự động hoặc đăng nhập khách; checkbox của admin không thay bằng chứng xác minh ngoài hệ thống.</w:t>
+      </w:r>
+    </w:p>
+    <w:p>
+      <w:pPr/>
+      <w:r>
+        <w:t>Telegram dùng polling một luồng trong lifespan FastAPI, mặc định tắt và chỉ nhận chat riêng. Migration v7 thêm con trỏ bot, danh tính theo bot/người dùng, update bền và nhật ký gửi. Nhận lại update không tạo tin trùng; gián đoạn sau khi lưu tin khách không tự gọi lại AI nếu kết quả chưa rõ mà chuyển nhân viên. Không giữ transaction khi gọi model hoặc Telegram. Handoff, tin mới hoặc update khách chưa xử lý chặn tin AI đang chờ; request đã gửi lên mạng không thể thu hồi bằng cơ chế này.</w:t>
+      </w:r>
+    </w:p>
+    <w:p>
+      <w:pPr/>
+      <w:r>
+        <w:t>Inbox hiển thị trạng thái gửi Telegram; lỗi hoặc kết quả không rõ chặn tin sau cùng người nhận, người phụ trách chọn gửi lại hoặc bỏ qua. Gửi lại kết quả không rõ cần xác nhận nguy cơ trùng; trạng thái sending còn lại khi khởi động chuyển uncertain. Tin nhân viên dùng UUID khi thử lại, SLA Telegram tính thời điểm API xác nhận gửi thay vì lúc lưu DB; ticket kết thúc giữ snapshot lịch sử. Không gửi trace/ghi chú nội bộ. Chưa có xác minh quyền đơn cho Telegram, mã widget không dùng chung. Một worker xử lý tuần tự nên model làm chậm polling; chưa có bot thật, webhook, đo tải hoặc nghiệm thu M6. Hướng dẫn cấu hình và kịch bản nghiệm thu tại docs/TELEGRAM.md.</w:t>
+      </w:r>
+    </w:p>
+    <w:p>
+      <w:pPr/>
+      <w:r>
+        <w:t>Công cụ vận hành python -m app.backup tạo bản sao offline gồm SQLite, Qdrant embedded và tài liệu nguồn. SQLite dùng API backup; các file có SHA-256 trong manifest và được kiểm tra trước khôi phục. Nguồn/đích phải tách biệt, không chấp nhận symlink/junction hoặc ghi đè; đích khôi phục là thư mục mới. Phiên nhân viên/widget và quyền tra đơn được thu hồi trên bản khôi phục, còn nguồn và lịch sử giữ nguyên. Không sao chép cấu hình bí mật hoặc model; dữ liệu sao lưu vẫn cần quyền truy cập và mã hóa ổ đĩa. Người vận hành phải dừng API/ingestion, giữ Telegram tắt trong lúc kiểm tra và đối chiếu lịch sử trước bật bot trên DB khôi phục. Chưa có sao lưu nóng, lịch tự động, RPO/RTO hoặc nghiệm thu cloud; hướng dẫn tại docs/OPERATIONS.md.</w:t>
+      </w:r>
+    </w:p>
+    <w:p>
+      <w:pPr/>
+      <w:r>
+        <w:t>Chế độ SERVE_FRONTEND cho phép FastAPI phục vụ bản build React/Vite cùng origin với API, mặc định tắt; chỉ mở các trang nhân viên/chat/widget và assets đã định nghĩa. Không cần tiến trình Vite trong chế độ demo này, thiếu build thì báo lỗi khởi động. Endpoint /api/v1/ready yêu cầu phiên nhân viên, kiểm tra schema v7, file nguồn, số vector theo phiên bản so chunk SQL và model Ollama đã cài. Không gọi sinh đáp án hoặc gửi Telegram; không giữ transaction khi gọi Ollama. Chỉ trả 200 khi các kiểm tra đạt, còn kho trống, model thiếu hoặc dữ liệu lệch trả 503. Đây là kiểm tra phụ thuộc tại thời điểm gọi, chưa chứng minh chất lượng RAG, đủ RAM để chạy model hoặc độ bền khi có tải; /health công khai vẫn chỉ kiểm tra API.</w:t>
+      </w:r>
+    </w:p>
+    <w:p>
+      <w:pPr/>
+      <w:r>
+        <w:t>Công cụ app.measure_load khởi động Uvicorn một worker trên loopback với DB/vector/tài liệu tạm, seed phiên riêng và ghi raw samples, trạng thái hoàn tất, phiên bản runtime cùng hash mã nguồn. CLI không nhắm tới API đang chạy, không thay dữ liệu người dùng hoặc gọi LLM/Telegram. Hai index messages(conversation_id, created_at, id) và tickets(conversation_id, created_at) giảm chi phí truy vấn lịch sử/SLA theo hội thoại; migration cài lặp lại an toàn trên DB v7, giữ tương thích bản sao cũ và không đổi dữ liệu nghiệp vụ.</w:t>
       </w:r>
     </w:p>
     <w:p>
@@ -247,7 +283,7 @@
     <w:p>
       <w:pPr/>
       <w:r>
-        <w:t>Lệnh python -m unittest discover -s app/tests -v chạy đạt 66 kiểm thử; các kiểm thử DB dùng dữ liệu tách biệt. Các nhóm kiểm tra bao gồm mật khẩu/cookie, phiên hết hạn và tài khoản vô hiệu, quyền admin/agent và CSRF, giới hạn đăng nhập, dữ liệu gửi giả mạo, luồng tin nhắn/handoff, nhận tranh chấp bằng hai luồng, migration giữ dữ liệu, Inbox, nhận diện mã đơn, vector lưu bền, metadata, chống trùng, retry/xóa tài liệu, citation sai, lỗi provider, AI muộn sau tin khách mới và công thức chấm benchmark. Bổ sung kiểm tra citation đúng không vượt được kết quả kiểm định từ chối, schema kiểm định sai, đáp án phủ định có nguồn, lỗi model trong bước kiểm định giữ tin khách và nguồn không được trích dẫn bị đổi trước khi lưu AI. Đợt trích xuất bổ sung kiểm tra giữ nguyên số/chấm phẩy, từ chối ID sai hoặc trùng và phản hồi Ollama bị cắt/rỗng. Kiểm thử mới xác nhận schema ràng buộc đúng ID theo hai nguồn có số câu khác nhau và backend vẫn chặn cặp ID chéo nguồn không hợp lệ.</w:t>
+        <w:t>Lệnh python -m unittest discover -s app/tests -v chạy đạt 120 kiểm thử; các kiểm thử DB dùng dữ liệu tách biệt. Các nhóm kiểm tra bao gồm mật khẩu/cookie, phiên hết hạn và tài khoản vô hiệu, quyền admin/agent và CSRF, giới hạn đăng nhập, dữ liệu gửi giả mạo, luồng tin nhắn/handoff, nhận tranh chấp bằng hai luồng, migration giữ dữ liệu, Inbox, nhận diện mã đơn, vector lưu bền, metadata, chống trùng, retry/xóa tài liệu, citation sai, lỗi provider, AI muộn sau tin khách mới và công thức chấm benchmark. Bổ sung kiểm tra citation đúng không vượt được kết quả kiểm định từ chối, schema kiểm định sai, đáp án phủ định có nguồn, lỗi model trong bước kiểm định giữ tin khách và nguồn không được trích dẫn bị đổi trước khi lưu AI. Đợt trích xuất bổ sung kiểm tra giữ nguyên số/chấm phẩy, từ chối ID sai hoặc trùng và phản hồi Ollama bị cắt/rỗng. Kiểm thử mới xác nhận schema ràng buộc đúng ID theo hai nguồn có số câu khác nhau và backend vẫn chặn cặp ID chéo nguồn không hợp lệ.</w:t>
       </w:r>
     </w:p>
     <w:p>
@@ -407,6 +443,119 @@
       </w:r>
     </w:p>
     <w:p>
+      <w:pPr/>
+      <w:r>
+        <w:t>Đợt quyền tra đơn ngày 21/09/2026 có 73 unittest đạt và Vite build đạt. Bảy test mới kiểm tra admin/CSRF, validation/rate limit, phạm vi một đơn, cách ly phiên, retry, cấp lại, hết hạn, đổi chủ, kết thúc phiên, handoff, hai phiên tranh chấp, thu hồi khi model đang chờ và migration v6 lặp lại. Mã/quyền chỉ lưu hiện trạng, chưa có lịch sử audit đầy đủ. Khóa ghi và giới hạn bộ nhớ mới kiểm chứng trên SQLite một worker. QA trình duyệt trên DB riêng xác nhận cấp mã, nhập mã, tra đúng vận đơn bằng Ollama thật và chuyển nhân viên sau thu hồi, không có đáp án tra đơn mới. Giao diện admin/widget được kiểm tra ở desktop và khung 390 pixel. Hướng dẫn và giới hạn tại docs/ORDER_ACCESS.md; kết quả này không thay nghiệm thu chất lượng RAG.</w:t>
+      </w:r>
+    </w:p>
+    <w:p>
+      <w:pPr/>
+      <w:r>
+        <w:t>Đợt adapter Telegram ngày 21/09/2026 bổ sung 16 kiểm thử, tổng 89 unittest đạt trong 32,999 giây; frontend build đạt. Kiểm tra danh tính, nhận trùng, con trỏ bền, phục hồi sau gián đoạn, tranh chấp /start với đóng, chặn AI khi update khách chưa xử lý, giữ thứ tự gửi, timeout, quyền gửi lại/bỏ qua, UUID, SLA, webhook đang tồn tại và lọc token khỏi lỗi. Nhóm Telegram mock transport/model; chưa phát sinh xác minh bot thật. Không đo lại chất lượng RAG hoặc dùng kết quả này để nghiệm thu đa kênh. QA trình duyệt trên DB/vector riêng xác nhận cảnh báo nguy cơ trùng, gửi lại chuyển pending, bỏ qua giữ lịch sử, phản hồi nhân viên chờ gửi khi bot tắt và Cài đặt báo chưa kết nối. Desktop và khung mobile 390 pixel đã kiểm tra trực quan, không tràn ngang; không gửi tin ra Telegram thật.</w:t>
+      </w:r>
+    </w:p>
+    <w:p>
+      <w:pPr/>
+      <w:r>
+        <w:t>Đợt sao lưu/khôi phục ngày 21/09/2026 bổ sung bảy kiểm thử trên thư mục tạm; tổng 96 unittest đạt trong 52,638 giây. Vòng sao lưu rồi khôi phục mở lại Qdrant embedded thật và truy vấn đúng payload; dữ liệu DB/tài liệu được giữ, phiên và quyền cũ bị thu hồi riêng trên bản khôi phục. Kiểm tra từ chối file hỏng/thiếu/thừa, đường dẫn lạ, nguồn thay đổi, lỗi sao chép, schema sai và đích đã có; CLI đọc cấu hình rõ ràng nhưng không sao chép token. Không gọi model/Telegram hoặc sửa dữ liệu người dùng; frontend và pipeline RAG không đổi.</w:t>
+      </w:r>
+    </w:p>
+    <w:p>
+      <w:pPr/>
+      <w:r>
+        <w:t>Đợt phục vụ bản build và kiểm tra sẵn sàng có tổng 103 unittest đạt trong 56,660 giây, bảy test liên quan được chạy lại đạt sau chỉnh trạng thái unchecked khi bận. Bổ sung bảy test cho trang tĩnh/assets, đường dẫn riêng tư, API lạ, quyền Staff, schema sai, file/vector/model thiếu và ingestion đang bận. Kiểm thử vector dùng Qdrant embedded thật; transport danh sách model được mock. Smoke HTTP chạy tiến trình Uvicorn thật với SERVE_FRONTEND=true, tài khoản ngẫu nhiên và dữ liệu tạm: trang build/assets, đăng nhập, ready 503 khi kho trống/Ollama tắt, widget handoff, đọc Inbox và logout đạt. Không thay frontend, không build lại hoặc kiểm tra lại bố cục; không gọi model/Telegram thật và không dùng kết quả này để nghiệm thu cloud/M7.</w:t>
+      </w:r>
+    </w:p>
+    <w:p>
+      <w:pPr/>
+      <w:r>
+        <w:t>Ngày 21/09/2026 đo tải HTTP local trên Windows, Python 3.13.0 và 16 CPU logic. Kịch bản seed 500 hội thoại, mỗi hội thoại có 10 tin khách/một ticket, cùng một hội thoại probe; 10 client thực hiện 20 vòng đọc Inbox, đọc chi tiết, poll widget, gửi tin và retry UUID, tổng 1.000 request tải chính. Trước index mất 72,698 giây, đạt 13,755 request/giây; sau index mất 26,712 và 26,310 giây ở hai lượt, đạt 37,437 và 38,008 request/giây. p95 danh sách Inbox từ 1371,878 xuống 640,324 và 513,581 ms; p95 gửi tin nhân viên từ 2496,090 xuống 554,166 và 501,180 ms. Hash giữa baseline và lượt sau đầu tiên chỉ khác model dữ liệu, migration và test tương ứng; mã runner/API giữ nguyên.</w:t>
+      </w:r>
+    </w:p>
+    <w:p>
+      <w:pPr>
+        <w:keepLines/>
+      </w:pPr>
+      <w:r>
+        <w:t>Cả hai lượt sau index và baseline hoàn tất, không lỗi ngoài dự kiến. Pha handoff riêng có đúng một nhân viên nhận thành công, chín HTTP 409 dự kiến, retry không trùng tin/ticket và một HTTP 429 đúng giới hạn. Throughput chỉ tính tải chính; p50/p95 dùng nearest rank theo từng operation. Client không có thời gian nghỉ, phiên được seed, không đo login/tạo phiên hoặc mô phỏng đúng polling UI 3 giây. Chưa đo trình duyệt, model, Telegram thật, mạng ngoài, tải bền hay sức chứa tối đa; tải nền/cache máy chưa được kiểm soát toàn bộ. Inbox còn trả danh sách không phân trang. Bộ test đạt 105/105 trong 57,055 giây; dữ liệu gốc và cách chạy lại ở evals/load/README.md. Đây là bằng chứng vận hành local, chưa nghiệm thu M7 hoặc chất lượng RAG.</w:t>
+      </w:r>
+    </w:p>
+    <w:p>
+      <w:pPr/>
+      <w:r>
+        <w:t>Ngày 22/09/2026 bổ sung hiển thị nhật ký công cụ trong Inbox mà không đổi API/schema hoặc pipeline RAG. Sáu test công cụ đạt trong 3,033 giây; assertion kiểm tra API nội bộ trả trace, snapshot widget không chứa trace. Vite build đạt. QA trình duyệt trên DB tạm kiểm tra sáu trạng thái, lookup thành công/không có quyền, handoff, trạng thái lạ và tin không trace; mở/đóng bằng Enter, giữ mở qua polling, desktop 1440 pixel và mobile 390 pixel không tràn ngang. Không chạy lại model/benchmark; đây là kiểm chứng giao diện, chưa nghiệm thu chất lượng M5.</w:t>
+      </w:r>
+    </w:p>
+    <w:p>
+      <w:pPr/>
+      <w:r>
+        <w:t>Đợt kiểm chứng mã đơn ngày 22/09/2026 sửa lỗi DH12345-EXTRA hoặc x-DH12345 bị cắt thành DH12345, chữ Unicode được nhận như ASCII và mã quá dài vẫn qua bộ nhận diện. Mã phải nguyên vẹn trong chuỗi chữ/số/gạch nối/gạch dưới, dùng ASCII và tối đa 64 ký tự. Ba test mới tái hiện lỗi trước sửa, xác nhận mã sai không gọi bộ chọn hoặc tra đơn sau sửa; tổng 108 unittest đạt trong 83,904 giây. Không đổi quyền/schema/UI; không có mã hợp lệ vẫn đi RAG. Chưa đo lại chất lượng bằng model thật.</w:t>
+      </w:r>
+    </w:p>
+    <w:p>
+      <w:pPr/>
+      <w:r>
+        <w:t>Ngày 22/09/2026 sửa nhận diện handoff: tệp PDF không còn khớp nhầm từ tệ; yêu cầu gặp nhân viên có xuống dòng, tab hoặc dấu Unicode tách rời vẫn được nhận. Chỉ chuẩn hóa NFC/casefold/khoảng trắng cho so khớp, giữ nguyên tin và trích đoạn ticket. Năm test mới tái hiện lỗi trước sửa và đạt sau sửa, gồm widget chuyển giao khi AI bận, retry không trùng và Telegram chống update trùng; tổng 113 unittest đạt trong 78,586 giây. Bộ từ khóa/nhãn giữ nguyên, chưa hiểu phủ định/ngữ cảnh hoặc tiếng Việt không dấu. Không gọi model/bot thật; chưa có điểm đánh giá ngữ nghĩa độc lập.</w:t>
+      </w:r>
+    </w:p>
+    <w:p>
+      <w:pPr/>
+      <w:r>
+        <w:t>Đợt kiểm chứng sao lưu ngày 22/09/2026 phát hiện quy tắc bỏ mọi file tên .lock làm mất file trong tài liệu/thư mục con mà vẫn báo thành công. Đã giới hạn ngoại lệ đúng file khóa thường ở gốc Qdrant; file cùng tên khác được đưa vào manifest SHA-256, sao chép và khôi phục nguyên vẹn. Hai test mới tái hiện lỗi trước sửa và đạt sau sửa; chín test backup đạt, gồm CLI và truy vấn lại Qdrant embedded thật. Format 1/schema v7 giữ nguyên; bản sao cũ thiếu file cần tạo lại từ nguồn còn đầy đủ, không thể tự tái tạo dữ liệu đã bỏ mất. Không sửa dữ liệu người dùng; chưa nghiệm thu phục hồi bot thật hoặc M7.</w:t>
+      </w:r>
+    </w:p>
+    <w:p>
+      <w:r>
+        <w:t>Ngày 22/09/2026 sửa mất thông báo handoff Telegram bằng transaction chung trạng thái/ticket. Ngày 01/10/2026 sửa hàng chờ đã lưu bị kẹt khi nhận tin lỗi; response sai không tăng con trỏ. HTTP bị cắt/sai giao thức khi gửi được ghi uncertain, không tự gửi lại hoặc chặn peer khác. Probe khởi động tự thử lại lỗi mạng/5xx sau 5 giây; token sai/webhook xung đột vẫn dừng. Chỉ phục hồi DB sau xác minh bot; dừng được lúc chờ. Test tái hiện trước sửa; 23 test Telegram đạt với DB tạm, transport/model giả lập. Tin failed/uncertain vẫn chặn hàng gửi cùng peer; chưa tách worker, bù thông báo thiếu cũ hoặc nghiệm thu bot thật/tải. Schema v7 giữ nguyên.</w:t>
+      </w:r>
+    </w:p>
+    <w:p>
+      <w:r>
+        <w:t>Ngày 22/09/2026 bổ sung phân trang Inbox mặc định 25, tối đa 100 hội thoại; tìm kiếm tiếng Việt và lọc SLA trước chia trang. SQL lấy đúng trang khi không tìm kiếm/lọc SLA; hai bộ lọc này quét theo lô 200 hội thoại, chưa tối ưu thời gian trên tập lớn. Giao diện giữ hội thoại/bản nháp, mở đúng hội thoại ngoài trang từ hồ sơ khách và phân biệt tổng kết quả với số trên trang. Ba test mới, tổng 120 unittest đạt trong 64,141 giây; test biên offset chạy lại đạt, Vite build và QA desktop/mobile 390px đạt. Smoke HTTP với 31 hội thoại kiểm chứng hợp đồng mới; không so throughput với baseline trả toàn danh sách. Offset không phải snapshot, lịch sử chi tiết chưa phân trang; chưa nghiệm thu tải bền hoặc cloud.</w:t>
+      </w:r>
+    </w:p>
+    <w:p>
+      <w:r>
+        <w:t>25/09/2026 (mốc con M7 độ trễ Ollama): giữ hai model 5 phút thay vì dỡ sau mỗi lời gọi; Ollama đã dùng GPU trước sửa. RTX 3060 6 GiB xác nhận cả hai model 100% GPU, tổng 4,16 GiB. Ba lượt cũ 15,207-16,066 giây; lượt mới đầu 10,704 giây, hai lượt đã nạp 3,351-3,719 giây. Smoke HTTP thật đạt, câu hỏi 3,675 giây; 15 test RAG đạt. Giữ model/prompt/context/kiểm định; một câu hỏi lặp chưa chứng minh chất lượng M3 hoặc tải bền M7. Bằng chứng tại evals/ollama.</w:t>
+      </w:r>
+    </w:p>
+    <w:p>
+      <w:pPr/>
+      <w:r>
+        <w:t>Ngày 25/09/2026 bổ sung CLI local python -m app.reset_password USERNAME --env-file .env để khôi phục tài khoản đã tồn tại. Mật khẩu nhập ẩn, phải khác mật khẩu cũ và dài 12-128 ký tự; cập nhật hash và thu hồi mọi phiên của tài khoản trong cùng transaction, giữ nguyên quyền/trạng thái hoạt động. Sáu test mới kiểm tra đăng nhập lại, tài khoản vô hiệu, đầu vào lỗi/hủy, rollback khi lỗi thu hồi phiên, đăng nhập đồng thời và cấu hình DB qua subprocess. Tổng 127 unittest đạt trong 52,458 giây; không sửa tài khoản thật hoặc schema/API. Đây là công cụ cho người có quyền máy chủ, chưa có reset qua email/OTP hoặc audit quản trị; chưa nghiệm thu toàn bộ M7.</w:t>
+      </w:r>
+    </w:p>
+    <w:p>
+      <w:pPr/>
+      <w:r>
+        <w:t>Ngày 25/09/2026 bổ sung phân trang lịch sử tin nhắn Inbox: mặc định 50, tối đa 100 tin mỗi request, dùng cặp thời gian và ID làm mốc trong đúng hội thoại. Giao diện điều hướng tin cũ, giữ bản nháp/ghi chú và polling trang đang đọc để cập nhật trace/trạng thái gửi; hoàn tất ticket yêu cầu về trang mới nhất. Ba test mới kiểm tra 123 tin trùng thời gian, tin mới xen vào, cách ly mốc, cập nhật nội dung và giới hạn/quyền; tổng 130 unittest đạt trong 95,222 giây. Build và QA desktop/mobile 390px trên DB tạm đạt, gồm ba trang 50/50/23 tin và gửi từ trang cũ. API messages chỉ còn một trang, client theo next_before để đọc đủ; ticket/SLA và lịch sử widget chưa phân trang. Không đổi schema hoặc gọi model/kênh thật; chưa nghiệm thu tải bền M7.</w:t>
+      </w:r>
+    </w:p>
+    <w:p>
+      <w:pPr/>
+      <w:r>
+        <w:t>Ngày 26/09/2026 bổ sung phân trang lịch sử widget, mặc định 50/tối đa 100 tin mỗi request, cho phép đọc ngoài giới hạn 200 tin trước đây. Mốc tin chỉ thuộc hội thoại gắn với cookie còn hiệu lực; dữ liệu trả về tiếp tục loại ticket, ghi chú, trace và ID tài liệu/chunk nội bộ. Giao diện giữ bản nháp khi đổi trang/lỗi tải, polling trang đang đọc, về tin mới nhất sau gửi thành công và xóa lịch sử khi hết phiên. Bốn test mới gồm 223 tin trùng thời gian, tin mới giữa các trang, cách ly cursor, thu hồi phiên, hội thoại đóng và lọc dữ liệu riêng tư; tổng 134 unittest đạt trong 136,589 giây. Build và QA desktop/mobile 390px trên DB tạm đạt, có thử lỗi tải/thử lại và trích dẫn tin cũ. Không đổi schema hoặc gọi model/kênh thật; chưa nghiệm thu tải bền M7.</w:t>
+      </w:r>
+    </w:p>
+    <w:p>
+      <w:pPr/>
+      <w:r>
+        <w:t>Ngày 26/09/2026 đo M5 bằng Ollama trên SQLite tạm, RAG giả lập. Sau sửa yêu cầu hỗn hợp, nối tiếp, handoff và NFC, bộ gốc tăng từ 17/24 lên 24/24; hai bộ bổ sung đạt 8/8 và 10/12. Ba lượt cuối có 25 lời gọi selector, không lỗi provider hoặc lộ marker bị cấm/sửa đơn quan sát được; 144 test runtime đạt. CLI/HTML offline hỗ trợ duyệt nhãn gắn hash, lưu nháp/xuất JSON và gộp phần duyệt, chặn xung đột để đối chiếu. Chín test CLI/HTML đạt; QA desktop/mobile và JSON đã kiểm chứng, tải trực tiếp chưa xác nhận. Chỉ nhãn được duyệt vào điểm, lỗi giữ trong mẫu số; chưa duyệt cho tỷ lệ null. Người chấm tự khai; 44 ca còn chờ duyệt, không tự giải quyết bất đồng. Hai cách nói tự do vẫn nhận nhầm; tập dùng phát triển, chưa nghiệm thu độc lập M5 hay chất lượng RAG/tóm tắt. Bằng chứng tại evals/tools.</w:t>
+      </w:r>
+    </w:p>
+    <w:p>
+      <w:pPr/>
+      <w:r>
+        <w:t>Ngày 03/10/2026 bổ sung tài khoản khách hàng bằng email và mật khẩu tự quản lý, tách khỏi tài khoản nhân viên. Schema v8 thêm CustomerAccount và CustomerSession; hỗ trợ đăng ký, đăng nhập nhiều thiết bị, lịch sử theo tài khoản và đổi mật khẩu thu hồi mọi phiên. Mật khẩu lưu PBKDF2-SHA256; cookie HttpOnly có hạn 24 giờ. Email chưa xác minh, chưa có khôi phục qua email; không tự ghép lịch sử khách vãng lai hoặc cấp quyền xem đơn theo email.</w:t>
+      </w:r>
+    </w:p>
+    <w:p>
+      <w:pPr/>
+      <w:r>
+        <w:t>Giao diện đăng nhập khách hàng và nhân viên dùng bố cục hai cột, font Inter và form thích ứng màn hình nhỏ; có hiện/ẩn mật khẩu, đăng ký và khách vãng lai. Bộ backend đạt 165 kiểm thử; frontend build thành công. Kiểm tra trình duyệt với DB tạm xác nhận đăng ký, đăng nhập hai thiết bị, lịch sử, đổi mật khẩu thu hồi phiên, tải lại giữ phiên, kiểm tra mật khẩu nhập lại và widget nhúng. Kiểm tra chiều rộng 320–1536 px không tràn ngang. Chat thử dùng lời chào xử lý tại chỗ, không phải phép đo chất lượng hoặc độ trễ Ollama/RAG. Các kết quả này không thay nghiệm thu bot Telegram thật, nhãn RAG độc lập hoặc khả năng chịu tải triển khai.</w:t>
+      </w:r>
+    </w:p>
+    <w:p>
       <w:pPr>
         <w:pStyle w:val="Heading1"/>
         <w:pageBreakBefore/>
@@ -418,13 +567,13 @@
     <w:p>
       <w:pPr/>
       <w:r>
-        <w:t>Mốc hiện tại tạo nền tảng xác thực và chuyển giao có người phụ trách, giúp giữ nhất quán quyền trả lời và trạng thái AI; widget cùng origin đã có phiên khách riêng và nhận phản hồi nhân viên qua polling. RAG local có mô hình thật, lưu bền, bộ 72 câu TXT và 24 câu PDF/DOCX, trích câu nguồn và kiểm định. M3 chưa nghiệm thu: cần người duyệt nhãn/đáp án, nguồn và câu hỏi độc lập; giảm chọn câu thiếu ngữ cảnh và kiểm định sai ở phủ định/nối tiếp hoặc điều kiện thiếu. Inbox đã tự cập nhật bằng polling và có SLA phản hồi đầu tiên. OCR, chất lượng sentiment/tóm tắt và SLA giải quyết chưa được đánh giá. Bộ chọn tool bằng schema đã qua smoke nhỏ; chưa nghiệm thu agent nhiều bước hoặc toàn bộ M5. Vòng đời giải quyết/đóng và tiếp nhận lại từ Inbox đã kiểm chứng. Hồ sơ thiết kế và smoke toàn luồng M4 đã bổ sung. Tiếp theo mở rộng kiểm chứng M5, xác minh khách cho tra đơn, kênh thứ hai và triển khai; chưa nghiệm thu toàn bộ M4 hoặc khả năng chịu tải realtime.</w:t>
+        <w:t>Mốc hiện tại tạo nền tảng xác thực và chuyển giao có người phụ trách, giúp giữ nhất quán quyền trả lời và trạng thái AI; widget cùng origin đã có phiên khách riêng và nhận phản hồi nhân viên qua polling. RAG local có mô hình thật, lưu bền, bộ 72 câu TXT và 24 câu PDF/DOCX, trích câu nguồn và kiểm định. M3 chưa nghiệm thu: cần người duyệt nhãn/đáp án, nguồn và câu hỏi độc lập; giảm chọn câu thiếu ngữ cảnh và kiểm định sai ở phủ định/nối tiếp hoặc điều kiện thiếu. Inbox đã tự cập nhật bằng polling và có SLA phản hồi đầu tiên. OCR, chất lượng sentiment/tóm tắt và SLA giải quyết chưa được đánh giá. Bộ chọn tool bằng schema đã qua smoke nhỏ; chưa nghiệm thu agent nhiều bước hoặc toàn bộ M5. Vòng đời giải quyết/đóng và tiếp nhận lại từ Inbox đã kiểm chứng. Hồ sơ thiết kế và smoke toàn luồng M4 đã bổ sung. Đã có quyền tra từng đơn sau xác minh thủ công, chưa có xác minh khách tự động. Adapter Telegram đã có kiểm thử local; tiếp theo kiểm chứng bot thật, mở rộng đánh giá M5 và triển khai; chưa nghiệm thu toàn bộ M4 hoặc khả năng chịu tải realtime.</w:t>
       </w:r>
     </w:p>
     <w:p>
       <w:pPr/>
       <w:r>
-        <w:t>Hồ sơ kỹ thuật đã có sơ đồ nghiệp vụ/ERD/Sequence, Use Case, API và ma trận kiểm chứng bám mã nguồn, chờ người dùng/GVHD duyệt. Cần bổ sung thông tin thành viên, nguồn tham khảo học thuật, BPMN chuẩn nếu biểu mẫu yêu cầu và kết quả đo tải/triển khai thực tế. Người dùng cho phép tiếp tục các việc độc lập trong lúc bận; việc này không thay người duyệt nhãn/đáp án M3. DeCuong.md giữ kế hoạch nghiên cứu; docs/TASKS.md và ROADMAP.md theo dõi phạm vi và bằng chứng hoàn thành.</w:t>
+        <w:t>Hồ sơ kỹ thuật đã có sơ đồ nghiệp vụ/ERD/Sequence, Use Case, API và ma trận kiểm chứng bám mã nguồn, chờ người dùng/GVHD duyệt. Cần bổ sung thông tin thành viên, nguồn tham khảo học thuật, BPMN chuẩn nếu biểu mẫu yêu cầu và kết quả đo tải trong môi trường triển khai thực tế; đã có phép đo HTTP local riêng. Người dùng cho phép tiếp tục các việc độc lập trong lúc bận; việc này không thay người duyệt nhãn/đáp án M3. DeCuong.md giữ kế hoạch nghiên cứu; docs/TASKS.md và ROADMAP.md theo dõi phạm vi và bằng chứng hoàn thành.</w:t>
       </w:r>
     </w:p>
     <w:sectPr>

</xml_diff>

<commit_message>
feat: verify customer email and recover passwords via SMTP
</commit_message>
<xml_diff>
--- a/docs/report/BaoCao.docx
+++ b/docs/report/BaoCao.docx
@@ -13,7 +13,7 @@
     <w:p>
       <w:pPr/>
       <w:r>
-        <w:t>Báo cáo tiến độ ngày 3 tháng 10 năm 2026</w:t>
+        <w:t>Báo cáo tiến độ ngày 7 tháng 10 năm 2026</w:t>
       </w:r>
     </w:p>
     <w:p>
@@ -93,7 +93,7 @@
     <w:p>
       <w:pPr/>
       <w:r>
-        <w:t>Backend là ứng dụng FastAPI chia module, dùng SQLAlchemy và SQLite; frontend là React/Vite. Các thực thể chính gồm User, AuthSession, WidgetSession, CustomerAccount, CustomerSession, Customer, Conversation, Message, Ticket, Order, OrderAccess, TelegramCursor, TelegramPeer, TelegramUpdate, TelegramDelivery, KnowledgeDocument và DocumentChunk. Conversation lưu assigned_agent_id; Message lưu agent_id và citations. Các bảng hội thoại và tài liệu tách khỏi Qdrant embedded trên đĩa. Tài liệu có hash chống trùng, phiên bản chỉ mục và model embedding; đoạn nguồn có trang hoặc vị trí dòng/đoạn/bảng.</w:t>
+        <w:t>Backend là ứng dụng FastAPI chia module, dùng SQLAlchemy và SQLite; frontend là React/Vite. Các thực thể chính gồm User, AuthSession, WidgetSession, CustomerAccount, CustomerSession, CustomerEmailToken, Customer, Conversation, Message, Ticket, Order, OrderAccess, TelegramCursor, TelegramPeer, TelegramUpdate, TelegramDelivery, KnowledgeDocument và DocumentChunk. Conversation lưu assigned_agent_id; Message lưu agent_id và citations. Các bảng hội thoại và tài liệu tách khỏi Qdrant embedded trên đĩa. Tài liệu có hash chống trùng, phiên bản chỉ mục và model embedding; đoạn nguồn có trang hoặc vị trí dòng/đoạn/bảng.</w:t>
       </w:r>
     </w:p>
     <w:p>
@@ -556,6 +556,18 @@
       </w:r>
     </w:p>
     <w:p>
+      <w:pPr/>
+      <w:r>
+        <w:t>Ngày 07/10/2026 triển khai xác minh email và khôi phục mật khẩu khách hàng qua SMTP dùng TLS. Schema v9 thêm cờ email_verified và bảng token email; tài khoản cũ mặc định chưa xác minh. Liên kết xác minh có hạn 60 phút, yêu cầu mật khẩu hiện tại; liên kết đặt lại mật khẩu có hạn 15 phút, chỉ cấp cho email đã xác minh. Token chỉ lưu hash, dùng một lần; đổi hoặc đặt lại mật khẩu thu hồi mọi phiên và token của tài khoản. Không tự ghép hồ sơ hoặc cấp quyền đơn hàng theo email.</w:t>
+      </w:r>
+    </w:p>
+    <w:p>
+      <w:pPr/>
+      <w:r>
+        <w:t>Bộ backend đạt 172 kiểm thử, frontend build đạt. Kiểm tra trình duyệt bằng DB và hộp thư thử cục bộ xác nhận đăng ký, xác minh từ phiên khác, từ chối mật khẩu sai, quên mật khẩu, đặt lại mật khẩu, thu hồi phiên cũ và chặn dùng lại liên kết; giao diện 390 px không tràn ngang. Kiểm thử còn bao gồm reset đồng thời, token hết hạn/sai mục đích, giới hạn gửi theo IP và tài khoản, TLS, lỗi SMTP không lộ bí mật, migration giữ dữ liệu và backup thu hồi token. Chưa cấu hình hoặc gửi thử tới hộp thư thật. Gửi email hiện dùng tác vụ nền trong tiến trình, chưa có hàng gửi bền hoặc retry tự động; cần kiểm chứng giao thư sau khi cấu hình SMTP trước nghiệm thu vận hành.</w:t>
+      </w:r>
+    </w:p>
+    <w:p>
       <w:pPr>
         <w:pStyle w:val="Heading1"/>
         <w:pageBreakBefore/>

</xml_diff>

<commit_message>
chore: prepare Windows production HTTPS deployment
</commit_message>
<xml_diff>
--- a/docs/report/BaoCao.docx
+++ b/docs/report/BaoCao.docx
@@ -568,6 +568,12 @@
       </w:r>
     </w:p>
     <w:p>
+      <w:pPr/>
+      <w:r>
+        <w:t>Ngày 07/10/2026 bổ sung bộ cấu hình triển khai Windows một máy: Caddy HTTPS, frontend/API cùng origin, Uvicorn loopback một worker, Ollama nội bộ và dữ liệu production tách riêng. Script dùng file môi trường được chọn, chặn cấu hình development/HTTP và không chạy reload. Proxy chặn tài liệu API công khai, đặt header bảo vệ, giới hạn body 12 MB và không phục vụ thư mục mã nguồn. Một kiểm thử launcher đạt; Caddy v2.11.7 qua validate sau kiểm tra SHA-512. Smoke HTTPS local dùng DB/CA riêng đã kiểm chứng chứng chỉ, frontend, cookie Secure/HttpOnly, CSRF, logout, chặn file riêng tư, giả mạo IP và chuyển HTTP sang HTTPS. Chưa đổi DNS, mở firewall, triển khai cloud hoặc cài Windows Service; chưa đo GPU/model thật, tải bền hay diễn tập RPO/RTO. Cấu hình SMTP và Telegram giữ trống/tắt cho đến khi nghiệm thu riêng.</w:t>
+      </w:r>
+    </w:p>
+    <w:p>
       <w:pPr>
         <w:pStyle w:val="Heading1"/>
         <w:pageBreakBefore/>

</xml_diff>

<commit_message>
feat: improve RAG evidence selection and refresh support inbox
</commit_message>
<xml_diff>
--- a/docs/report/BaoCao.docx
+++ b/docs/report/BaoCao.docx
@@ -13,7 +13,7 @@
     <w:p>
       <w:pPr/>
       <w:r>
-        <w:t>Báo cáo tiến độ ngày 7 tháng 10 năm 2026</w:t>
+        <w:t>Báo cáo tiến độ ngày 8 tháng 10 năm 2026</w:t>
       </w:r>
     </w:p>
     <w:p>
@@ -155,19 +155,19 @@
     <w:p>
       <w:pPr/>
       <w:r>
-        <w:t>LLM nhận tối đa bốn tin lịch sử ngắn để hiểu câu nối tiếp; tài liệu là bằng chứng cho nội dung chính sách. Model chọn tối đa ba cặp ID nguồn và ID câu. Backend xác thực ID, loại trùng rồi ghép nguyên văn các câu, chỉ chuẩn hóa khoảng trắng; model không viết lại số hoặc điều kiện trong câu đã chọn. Giữ ngưỡng retrieval 0,35, tối đa năm nguồn và 1.200 ký tự mỗi nguồn. Tách câu theo dấu chấm, chấm hỏi hoặc chấm than theo sau bởi khoảng trắng, giữ chấm phẩy cùng câu. Chưa xử lý đầy đủ chữ viết tắt, phần nguồn bị cắt hoặc điều kiện nằm ở câu khác. Đáp án giữ ngôn ngữ nguồn, chưa dịch hoặc tổng hợp tự do; chọn đúng ID chưa bảo đảm trả lời đúng câu hỏi.</w:t>
+        <w:t>LLM nhận tối đa bốn tin lịch sử ngắn để hiểu câu nối tiếp; tài liệu là bằng chứng cho nội dung chính sách. Model chọn tối đa ba cặp ID nguồn và ID câu; ID câu 1 chọn toàn bộ đoạn giới hạn, ID từ 2 chọn câu riêng khi cần loại nội dung không liên quan hoặc chỉ dẫn giả. Backend xác thực ID, loại trùng rồi ghép nguyên văn đoạn hoặc câu đã chọn, chỉ chuẩn hóa khoảng trắng; model không viết lại số hoặc điều kiện trong câu đã chọn. Giữ ngưỡng retrieval 0,35, tối đa năm nguồn và 1.200 ký tự mỗi nguồn. Tách câu theo dấu chấm, chấm hỏi hoặc chấm than theo sau bởi khoảng trắng, giữ chấm phẩy cùng câu. Bản cập nhật 08/10 giữ phần trước trong cùng đoạn với tiêu đề phạm vi Markdown hoặc câu phụ thuộc “trường hợp này/đó”, rồi loại trích dẫn lặp. Chưa xử lý đầy đủ chữ viết tắt, phần nguồn bị cắt hoặc điều kiện ngoài đoạn truy hồi. Đáp án giữ ngôn ngữ nguồn, chưa dịch hoặc tổng hợp tự do; chọn đúng ID chưa bảo đảm trả lời đúng câu hỏi.</w:t>
       </w:r>
     </w:p>
     <w:p>
       <w:pPr/>
       <w:r>
-        <w:t>Sau trích xuất, hệ thống gọi cùng qwen3:4b một lần nữa để kiểm định đáp án với giải thích ngắn. Ba điều kiện phải cùng đúng: câu hỏi đủ ngữ cảnh, các nguồn liên quan nhất quán và mọi dữ kiện được quote hỗ trợ. Kiểm định nhận cả nguồn không được đáp án trích dẫn trong tập nguồn đã cấp. Chính sách hợp lệ nằm cạnh chỉ dẫn độc hại vẫn có thể dùng nếu đáp án bỏ qua chỉ dẫn đó. JSON kiểm định sai dẫn đến từ chối; provider chưa hoàn tất, hết giới hạn sinh hoặc không có nội dung cuối được báo lỗi riêng và giữ tin khách. Không đưa trường thinking vào đáp án hoặc lịch sử. Cấu hình chat tắt suy luận, context 8192, tối đa 700 token. Cả hai lần gọi model nằm ngoài SQL transaction; phiên bản mọi nguồn được kiểm tra lại trước khi lưu AI, cùng guard handoff và tin khách mới.</w:t>
+        <w:t>Sau trích xuất, hệ thống gọi cùng qwen3:4b một lần nữa để kiểm định đáp án với giải thích ngắn. Ba điều kiện phải cùng đúng: câu hỏi được giải quyết, các nguồn liên quan nhất quán và mọi dữ kiện được quote hỗ trợ; cờ cần làm rõ phải false. Hai dạng mơ hồ tiếng Việt được hỏi lại trước khi chọn nguồn, không tự suy chủ đề từ tài liệu. Kiểm định nhận cả nguồn không được đáp án trích dẫn trong tập nguồn đã cấp. Chính sách hợp lệ nằm cạnh chỉ dẫn độc hại vẫn có thể dùng nếu đáp án bỏ qua chỉ dẫn đó. JSON kiểm định sai dẫn đến từ chối; provider chưa hoàn tất, hết giới hạn sinh hoặc không có nội dung cuối được báo lỗi riêng và giữ tin khách. Không đưa trường thinking vào đáp án hoặc lịch sử. Cấu hình chat tắt suy luận, context 8192, tối đa 700 token. Nếu kiểm định đề xuất sửa ID câu, backend chỉ thử một lần, kiểm tra ID và kiểm định lại bằng chứng mới; tối đa ba lần gọi model nằm ngoài SQL transaction; phiên bản mọi nguồn được kiểm tra lại trước khi lưu AI, cùng guard handoff và tin khách mới.</w:t>
       </w:r>
     </w:p>
     <w:p>
       <w:pPr/>
       <w:r>
-        <w:t>JSON Schema giới hạn source_id và sentence_id bằng từng nhánh oneOf theo nguồn thực được cấp cho model. Grammar của Ollama chỉ cho chọn cặp ID tồn tại; backend vẫn chặn ID sai hoặc trùng nếu provider bỏ qua schema. Không thêm lượt model, retry hoặc thay prompt kiểm định. Ràng buộc này ngăn ID vượt phạm vi, chưa bảo đảm câu được chọn đủ ý hoặc kiểm định đúng ngữ nghĩa.</w:t>
+        <w:t>JSON Schema giới hạn source_id và sentence_id bằng từng nhánh oneOf theo nguồn thực được cấp cho model. Grammar của Ollama chỉ cho chọn cặp ID tồn tại; backend vẫn chặn ID sai hoặc trùng nếu provider bỏ qua schema. Không thêm model. Bản cập nhật 08/10 điều chỉnh prompt và cho phép một lần sửa ID có kiểm định lại, không bỏ qua xung đột nguồn. Ràng buộc này ngăn ID vượt phạm vi, chưa bảo đảm câu được chọn đủ ý hoặc kiểm định đúng ngữ nghĩa.</w:t>
       </w:r>
     </w:p>
     <w:p>
@@ -574,6 +574,30 @@
       </w:r>
     </w:p>
     <w:p>
+      <w:pPr/>
+      <w:r>
+        <w:t>Ngày 08/10/2026 cập nhật Inbox theo bố cục tham khảo Chatwoot, dựng bằng React hiện có: thanh điều hướng sáng, danh sách hội thoại, vùng chat và hồ sơ khách có thể thu gọn. Bộ lọc Tất cả, Của tôi và Chưa nhận được áp dụng ở backend trước khi đếm và phân trang; người phụ trách lấy từ phiên đăng nhập. Ticket/SLA chuyển sang cột thông tin, hỗ trợ mở đơn hàng theo khách. Enter gửi tin, Shift+Enter xuống dòng; ô nhập tự tăng chiều cao tối đa 160 px. Kiểm chứng 30 test Inbox/xác thực, build frontend, kiểm thử ô nhập và trình duyệt với API thật trên DB tạm; sáu chiều rộng 320–1536 px không tràn ngang. Đã kiểm tra giữ bản nháp khi lỗi, phân quyền, tiếp nhận và hoàn tất ticket. Không gọi Ollama hoặc Telegram thật trong lượt QA giao diện này.</w:t>
+      </w:r>
+    </w:p>
+    <w:p>
+      <w:pPr/>
+      <w:r>
+        <w:t>Ngày 08/10/2026 bổ sung và chạy bộ kiểm chứng RAG BT20 gồm 60 câu đã chốt trước đo, dùng bản sao chính sách đầy đủ và hai tài liệu CX10 mâu thuẫn trong DB/Qdrant tạm. Ollama 0.40.0 chạy qwen3:4b và embeddinggemma:300m trên RTX 3060 Laptop; 60/60 ca hoàn tất không lỗi dịch vụ. Chấm tự động đạt 43/60 (71,7%); 13/46 câu có nguồn bị từ chối. Recall@5 trung bình trên 50 ca gán nguồn đạt 98%; cả 67 quote đều khớp văn bản nhưng chưa chứng minh đúng ngữ nghĩa. Trung vị 4,960 giây, p95 7,521 giây trong lượt tuần tự. Lỗi nổi bật gồm review từ chối sai, chọn câu mất điều kiện, câu mơ hồ bị tự suy chủ đề và lịch sử chứa chỉ dẫn giả ảnh hưởng bước kiểm định. Hai nhãn có hạn chế được ghi riêng; không sửa nhãn/prompt sau đo, chưa có người duyệt độc lập. Chín test evaluator đạt sau sửa metadata keep_alive lấy từ runtime. Chi tiết tại evals/bt20/KET_QUA.md và CHI_TIET_60_CAU.md; chưa nghiệm thu M3.</w:t>
+      </w:r>
+    </w:p>
+    <w:p>
+      <w:pPr/>
+      <w:r>
+        <w:t>Ngày 08/10/2026 nâng cấp chọn câu và kiểm định RAG: giữ điều kiện trong cùng đoạn, loại trích dẫn lặp, hỏi làm rõ hai dạng mơ hồ tiếng Việt trước khi chọn nguồn và cho phép sửa ID câu tối đa một lần nhưng phải kiểm định lại. Giữ qwen3:4b, embeddinggemma:300m, think=false và ngưỡng truy hồi 0,35; không bỏ kiểm định hoặc thay kho tri thức người dùng. Chạy lại BT20 đạt 52/60 (86.7%), so với 43/60 trước sửa; từ chối sai giảm từ 13/46 còn 4/46. Cả hai câu mơ hồ hỏi lại; 4/4 ca mâu thuẫn, 4/4 ca chỉ dẫn giả và 6/6 ca thiếu dữ kiện đạt rubric. Bộ mới TN8/LS2 gồm 24 câu soạn trước lượt chạy đầu tiên đạt 19/24; tổng 84 lượt không lỗi dịch vụ và 71/71 trích dẫn khớp văn bản corpus. 184 kiểm thử backend đạt. BT20 có p50 5.197 giây, p95 6.553 giây. BT20 đã dùng để chỉnh sửa nên chỉ là đo hồi quy; bộ mới do cùng trợ lý soạn, chưa có người duyệt độc lập. Còn lỗi thiếu điều kiện phụ, chọn câu và truy hồi; chưa nghiệm thu M3. Chi tiết và toàn bộ đáp án tại evals/bt20/NANG_CAP_20261008.md và evals/rag-context/KET_QUA.md.</w:t>
+      </w:r>
+    </w:p>
+    <w:p>
+      <w:pPr/>
+      <w:r>
+        <w:t>Đợt trích đoạn tiếp theo ngày 08/10/2026: BT20 từ 52/60 lên 58/60; TN8/LS2 từ 19/24 lên 22/24. Hồi quy PDF/DOCX 20/24 (trước 21/24), TXT 42/48 (trước 40/48). Tổng 156 lượt Ollama thật, 0 lỗi dịch vụ; 114/114 quote khớp đoạn truy hồi. 188 kiểm thử backend đạt. ID câu 1 chọn cả đoạn giới hạn 1.200 ký tự; ID từ 2 chọn câu riêng, giữ các điều kiện phụ mà không bắt buộc đưa chỉ dẫn giả vào đáp án. Bổ sung nhận diện lý do gửi nhầm/nhận sai và chỉ hỏi lại bằng quy tắc chờ đợi khi toàn câu là mẫu mơ hồ, tránh chặn chủ đề ngoài bán hàng. Chặn quote chứa mẫu yêu cầu bỏ qua chỉ dẫn/quy tắc ở backend; không coi bộ lọc cụm từ này là chống injection toàn diện. Giữ model, embedding, ngưỡng truy hồi và tối đa ba lượt chat; sửa bằng chứng vẫn phải kiểm định lại. Không đổi nhãn/corpus, không sửa dữ liệu người dùng. Các tập đều đã dùng để phát triển/hồi quy, chưa có người duyệt độc lập; điểm này không phải độ chính xác thực tế hoặc nghiệm thu M3. Chi tiết ca sửa được, thoái lui và giới hạn tại evals/bt20/TRICH_DOAN_20261008.md.</w:t>
+      </w:r>
+    </w:p>
+    <w:p>
       <w:pPr>
         <w:pStyle w:val="Heading1"/>
         <w:pageBreakBefore/>

</xml_diff>